<commit_message>
Finalize degree-aware RETRIEVE evidence and handoff
</commit_message>
<xml_diff>
--- a/benchmarks/retrieve_workshop/RETRIEVE_CAGRA_FILTER_AGNOSTIC_REPORT.docx
+++ b/benchmarks/retrieve_workshop/RETRIEVE_CAGRA_FILTER_AGNOSTIC_REPORT.docx
@@ -139,7 +139,7 @@
         <w:pStyle w:val="Date"/>
       </w:pPr>
       <w:r>
-        <w:t xml:space="preserve">2026-08-20</w:t>
+        <w:t xml:space="preserve">2026-08-21</w:t>
       </w:r>
     </w:p>
     <w:p>
@@ -234,13 +234,13 @@
         <w:t xml:space="preserve"> </w:t>
       </w:r>
       <w:r>
-        <w:t xml:space="preserve">changing traversal. At the highest-recall B0 point on YFCC-10M, recall rises from 0.5983 to</w:t>
-      </w:r>
-      <w:r>
-        <w:t xml:space="preserve"> </w:t>
-      </w:r>
-      <w:r>
-        <w:t xml:space="preserve">0.7179 while median QPS changes from 43,667 to 41,289.</w:t>
+        <w:t xml:space="preserve">changing traversal. At the highest-recall B0 point on YFCC-10M, recall rises from 0.5976 to</w:t>
+      </w:r>
+      <w:r>
+        <w:t xml:space="preserve"> </w:t>
+      </w:r>
+      <w:r>
+        <w:t xml:space="preserve">0.7714 while median QPS changes from 23,218 to 22,066.</w:t>
       </w:r>
     </w:p>
     <w:p>
@@ -312,7 +312,7 @@
         <w:t xml:space="preserve"> </w:t>
       </w:r>
       <w:r>
-        <w:t xml:space="preserve">below 0.9 at B0. Deeper Retain traversal reaches 0.9141 only at 2,661 QPS, showing that high</w:t>
+        <w:t xml:space="preserve">below 0.9 at B0. Deeper Retain traversal reaches 0.9123 only at 2,783 QPS, showing that high</w:t>
       </w:r>
       <w:r>
         <w:t xml:space="preserve"> </w:t>
@@ -464,7 +464,7 @@
               <w:rPr>
                 <w:rStyle w:val="VerbatimChar"/>
               </w:rPr>
-              <w:t xml:space="preserve">31c13dcf71b93d91fe89f06cfa0d088847094cb3</w:t>
+              <w:t xml:space="preserve">dfffa4f71df45c5a85ed6c9cf92e65345bd7e2d3</w:t>
             </w:r>
             <w:r>
               <w:t xml:space="preserve">; clean worktree</w:t>
@@ -521,10 +521,16 @@
               <w:jc w:val="left"/>
             </w:pPr>
             <w:r>
+              <w:t xml:space="preserve">record final</w:t>
+            </w:r>
+            <w:r>
+              <w:t xml:space="preserve"> </w:t>
+            </w:r>
+            <w:r>
               <w:rPr>
                 <w:rStyle w:val="VerbatimChar"/>
               </w:rPr>
-              <w:t xml:space="preserve">40913bb</w:t>
+              <w:t xml:space="preserve">git rev-parse HEAD</w:t>
             </w:r>
             <w:r>
               <w:t xml:space="preserve"> </w:t>
@@ -566,7 +572,7 @@
               <w:rPr>
                 <w:rStyle w:val="VerbatimChar"/>
               </w:rPr>
-              <w:t xml:space="preserve">/home/ubuntu/retrieve_workshop_runs/gpu_l4_20260820T0143Z</w:t>
+              <w:t xml:space="preserve">/home/ubuntu/retrieve_workshop_runs/gpu_l4_degreeaware_20260821_021746</w:t>
             </w:r>
           </w:p>
         </w:tc>
@@ -647,7 +653,7 @@
               <w:rPr>
                 <w:rStyle w:val="VerbatimChar"/>
               </w:rPr>
-              <w:t xml:space="preserve">/home/ubuntu/retrieve_workshop_runs/yfcc_schema7_20260820T0055Z</w:t>
+              <w:t xml:space="preserve">/home/ubuntu/retrieve_workshop_runs/yfcc_schema8_g64_20260821T0245Z</w:t>
             </w:r>
           </w:p>
         </w:tc>
@@ -746,7 +752,7 @@
               <w:rPr>
                 <w:rStyle w:val="VerbatimChar"/>
               </w:rPr>
-              <w:t xml:space="preserve">3b3fb197f1bf5f16ff88828ecebb902b70e62d280026b5fd678648ce396bd549</w:t>
+              <w:t xml:space="preserve">4c1ccdb78fc2e12ad61564538c1a54ba0f2232a2b925ea9a1b82142545580d6b</w:t>
             </w:r>
           </w:p>
         </w:tc>
@@ -809,7 +815,7 @@
               <w:rPr>
                 <w:rStyle w:val="VerbatimChar"/>
               </w:rPr>
-              <w:t xml:space="preserve">f07f6fc273fd96ef21d95a368ca2398372e589555376f8eed1b6f39ed7a8c173</w:t>
+              <w:t xml:space="preserve">5c4dd06397f7e0b8fca18589d017a0fe707592399e92ee089b5b10de9fe253f6</w:t>
             </w:r>
           </w:p>
         </w:tc>
@@ -963,6 +969,33 @@
         <w:rPr>
           <w:rStyle w:val="VerbatimChar"/>
         </w:rPr>
+        <w:t xml:space="preserve">G=64</w:t>
+      </w:r>
+      <w:r>
+        <w:t xml:space="preserve">,</w:t>
+      </w:r>
+      <w:r>
+        <w:t xml:space="preserve"> </w:t>
+      </w:r>
+      <w:r>
+        <w:rPr>
+          <w:rStyle w:val="VerbatimChar"/>
+        </w:rPr>
+        <w:t xml:space="preserve">IG=128</w:t>
+      </w:r>
+      <w:r>
+        <w:t xml:space="preserve"> </w:t>
+      </w:r>
+      <w:r>
+        <w:t xml:space="preserve">for YFCC and</w:t>
+      </w:r>
+      <w:r>
+        <w:t xml:space="preserve"> </w:t>
+      </w:r>
+      <w:r>
+        <w:rPr>
+          <w:rStyle w:val="VerbatimChar"/>
+        </w:rPr>
         <w:t xml:space="preserve">G=32</w:t>
       </w:r>
       <w:r>
@@ -978,7 +1011,16 @@
         <w:t xml:space="preserve">IG=64</w:t>
       </w:r>
       <w:r>
-        <w:t xml:space="preserve">; SINGLE_CTA; squared L2;</w:t>
+        <w:t xml:space="preserve"> </w:t>
+      </w:r>
+      <w:r>
+        <w:t xml:space="preserve">for ArXiv; SINGLE_CTA;</w:t>
+      </w:r>
+      <w:r>
+        <w:t xml:space="preserve"> </w:t>
+      </w:r>
+      <w:r>
+        <w:t xml:space="preserve">squared L2;</w:t>
       </w:r>
       <w:r>
         <w:t xml:space="preserve"> </w:t>
@@ -1141,11 +1183,11 @@
     </w:p>
     <w:p>
       <w:pPr>
-        <w:pStyle w:val="Heading1"/>
-      </w:pPr>
-      <w:bookmarkStart w:id="23" w:name="workloads"/>
-      <w:r>
-        <w:t xml:space="preserve">Workloads</w:t>
+        <w:pStyle w:val="Heading2"/>
+      </w:pPr>
+      <w:bookmarkStart w:id="23" w:name="X1bd19cb2a4f1425658ec14d80d7e55aa313a3f6"/>
+      <w:r>
+        <w:t xml:space="preserve">Graph construction parameters and provenance</w:t>
       </w:r>
       <w:bookmarkEnd w:id="23"/>
     </w:p>
@@ -1173,7 +1215,7 @@
               <w:jc w:val="left"/>
             </w:pPr>
             <w:r>
-              <w:t xml:space="preserve">Workload</w:t>
+              <w:t xml:space="preserve">Method/index</w:t>
             </w:r>
           </w:p>
         </w:tc>
@@ -1190,7 +1232,7 @@
               <w:jc w:val="left"/>
             </w:pPr>
             <w:r>
-              <w:t xml:space="preserve">Base rows</w:t>
+              <w:t xml:space="preserve">Workload</w:t>
             </w:r>
           </w:p>
         </w:tc>
@@ -1207,7 +1249,7 @@
               <w:jc w:val="left"/>
             </w:pPr>
             <w:r>
-              <w:t xml:space="preserve">Dimension</w:t>
+              <w:t xml:space="preserve">Construction parameters</w:t>
             </w:r>
           </w:p>
         </w:tc>
@@ -1224,109 +1266,7 @@
               <w:jc w:val="left"/>
             </w:pPr>
             <w:r>
-              <w:t xml:space="preserve">Type</w:t>
-            </w:r>
-          </w:p>
-        </w:tc>
-        <w:tc>
-          <w:tcPr>
-            <w:tcBorders>
-              <w:bottom w:val="single"/>
-            </w:tcBorders>
-            <w:vAlign w:val="bottom"/>
-          </w:tcPr>
-          <w:p>
-            <w:pPr>
-              <w:pStyle w:val="Compact"/>
-              <w:jc w:val="left"/>
-            </w:pPr>
-            <w:r>
-              <w:t xml:space="preserve">Predicate</w:t>
-            </w:r>
-          </w:p>
-        </w:tc>
-        <w:tc>
-          <w:tcPr>
-            <w:tcBorders>
-              <w:bottom w:val="single"/>
-            </w:tcBorders>
-            <w:vAlign w:val="bottom"/>
-          </w:tcPr>
-          <w:p>
-            <w:pPr>
-              <w:pStyle w:val="Compact"/>
-              <w:jc w:val="left"/>
-            </w:pPr>
-            <w:r>
-              <w:t xml:space="preserve">Mean selectivity</w:t>
-            </w:r>
-          </w:p>
-        </w:tc>
-        <w:tc>
-          <w:tcPr>
-            <w:tcBorders>
-              <w:bottom w:val="single"/>
-            </w:tcBorders>
-            <w:vAlign w:val="bottom"/>
-          </w:tcPr>
-          <w:p>
-            <w:pPr>
-              <w:pStyle w:val="Compact"/>
-              <w:jc w:val="left"/>
-            </w:pPr>
-            <w:r>
-              <w:t xml:space="preserve">Median</w:t>
-            </w:r>
-          </w:p>
-        </w:tc>
-        <w:tc>
-          <w:tcPr>
-            <w:tcBorders>
-              <w:bottom w:val="single"/>
-            </w:tcBorders>
-            <w:vAlign w:val="bottom"/>
-          </w:tcPr>
-          <w:p>
-            <w:pPr>
-              <w:pStyle w:val="Compact"/>
-              <w:jc w:val="left"/>
-            </w:pPr>
-            <w:r>
-              <w:t xml:space="preserve">p90</w:t>
-            </w:r>
-          </w:p>
-        </w:tc>
-        <w:tc>
-          <w:tcPr>
-            <w:tcBorders>
-              <w:bottom w:val="single"/>
-            </w:tcBorders>
-            <w:vAlign w:val="bottom"/>
-          </w:tcPr>
-          <w:p>
-            <w:pPr>
-              <w:pStyle w:val="Compact"/>
-              <w:jc w:val="left"/>
-            </w:pPr>
-            <w:r>
-              <w:t xml:space="preserve">Queries &lt;=1%</w:t>
-            </w:r>
-          </w:p>
-        </w:tc>
-        <w:tc>
-          <w:tcPr>
-            <w:tcBorders>
-              <w:bottom w:val="single"/>
-            </w:tcBorders>
-            <w:vAlign w:val="bottom"/>
-          </w:tcPr>
-          <w:p>
-            <w:pPr>
-              <w:pStyle w:val="Compact"/>
-              <w:jc w:val="left"/>
-            </w:pPr>
-            <w:r>
-              <w:t xml:space="preserve">Valid GT slots</w:t>
+              <w:t xml:space="preserve">Why/source</w:t>
             </w:r>
           </w:p>
         </w:tc>
@@ -1339,106 +1279,64 @@
               <w:jc w:val="left"/>
             </w:pPr>
             <w:r>
-              <w:t xml:space="preserve">YFCC-10M</w:t>
-            </w:r>
-          </w:p>
-        </w:tc>
-        <w:tc>
-          <w:p>
-            <w:pPr>
-              <w:pStyle w:val="Compact"/>
-              <w:jc w:val="left"/>
-            </w:pPr>
-            <w:r>
-              <w:t xml:space="preserve">10,000,000</w:t>
-            </w:r>
-          </w:p>
-        </w:tc>
-        <w:tc>
-          <w:p>
-            <w:pPr>
-              <w:pStyle w:val="Compact"/>
-              <w:jc w:val="left"/>
-            </w:pPr>
-            <w:r>
-              <w:t xml:space="preserve">192</w:t>
-            </w:r>
-          </w:p>
-        </w:tc>
-        <w:tc>
-          <w:p>
-            <w:pPr>
-              <w:pStyle w:val="Compact"/>
-              <w:jc w:val="left"/>
-            </w:pPr>
-            <w:r>
-              <w:t xml:space="preserve">uint8</w:t>
-            </w:r>
-          </w:p>
-        </w:tc>
-        <w:tc>
-          <w:p>
-            <w:pPr>
-              <w:pStyle w:val="Compact"/>
-              <w:jc w:val="left"/>
-            </w:pPr>
-            <w:r>
-              <w:t xml:space="preserve">query tags subset of candidate tags</w:t>
-            </w:r>
-          </w:p>
-        </w:tc>
-        <w:tc>
-          <w:p>
-            <w:pPr>
-              <w:pStyle w:val="Compact"/>
-              <w:jc w:val="left"/>
-            </w:pPr>
-            <w:r>
-              <w:t xml:space="preserve">1.850965%</w:t>
-            </w:r>
-          </w:p>
-        </w:tc>
-        <w:tc>
-          <w:p>
-            <w:pPr>
-              <w:pStyle w:val="Compact"/>
-              <w:jc w:val="left"/>
-            </w:pPr>
-            <w:r>
-              <w:t xml:space="preserve">0.139485%</w:t>
-            </w:r>
-          </w:p>
-        </w:tc>
-        <w:tc>
-          <w:p>
-            <w:pPr>
-              <w:pStyle w:val="Compact"/>
-              <w:jc w:val="left"/>
-            </w:pPr>
-            <w:r>
-              <w:t xml:space="preserve">7.057260%</w:t>
-            </w:r>
-          </w:p>
-        </w:tc>
-        <w:tc>
-          <w:p>
-            <w:pPr>
-              <w:pStyle w:val="Compact"/>
-              <w:jc w:val="left"/>
-            </w:pPr>
-            <w:r>
-              <w:t xml:space="preserve">71.16%</w:t>
-            </w:r>
-          </w:p>
-        </w:tc>
-        <w:tc>
-          <w:p>
-            <w:pPr>
-              <w:pStyle w:val="Compact"/>
-              <w:jc w:val="left"/>
-            </w:pPr>
-            <w:r>
-              <w:t xml:space="preserve">100,000</w:t>
+              <w:t xml:space="preserve">GPU CAGRA</w:t>
+            </w:r>
+          </w:p>
+        </w:tc>
+        <w:tc>
+          <w:p>
+            <w:pPr>
+              <w:pStyle w:val="Compact"/>
+              <w:jc w:val="left"/>
+            </w:pPr>
+            <w:r>
+              <w:t xml:space="preserve">YFCC</w:t>
+            </w:r>
+          </w:p>
+        </w:tc>
+        <w:tc>
+          <w:p>
+            <w:pPr>
+              <w:pStyle w:val="Compact"/>
+              <w:jc w:val="left"/>
+            </w:pPr>
+            <w:r>
+              <w:t xml:space="preserve">NN-descent</w:t>
+            </w:r>
+            <w:r>
+              <w:t xml:space="preserve"> </w:t>
+            </w:r>
+            <w:r>
+              <w:rPr>
+                <w:rStyle w:val="VerbatimChar"/>
+              </w:rPr>
+              <w:t xml:space="preserve">G=64</w:t>
+            </w:r>
+            <w:r>
+              <w:t xml:space="preserve">,</w:t>
+            </w:r>
+            <w:r>
+              <w:t xml:space="preserve"> </w:t>
+            </w:r>
+            <w:r>
+              <w:rPr>
+                <w:rStyle w:val="VerbatimChar"/>
+              </w:rPr>
+              <w:t xml:space="preserve">IG=128</w:t>
+            </w:r>
+            <w:r>
+              <w:t xml:space="preserve">, max iterations 20, threshold 0.0001</w:t>
+            </w:r>
+          </w:p>
+        </w:tc>
+        <w:tc>
+          <w:p>
+            <w:pPr>
+              <w:pStyle w:val="Compact"/>
+              <w:jc w:val="left"/>
+            </w:pPr>
+            <w:r>
+              <w:t xml:space="preserve">Native cuVS construction; degree 64 aligns with JAG's high-degree YFCC setting, but topology is CAGRA</w:t>
             </w:r>
           </w:p>
         </w:tc>
@@ -1451,106 +1349,61 @@
               <w:jc w:val="left"/>
             </w:pPr>
             <w:r>
-              <w:t xml:space="preserve">ArXiv-EM</w:t>
-            </w:r>
-          </w:p>
-        </w:tc>
-        <w:tc>
-          <w:p>
-            <w:pPr>
-              <w:pStyle w:val="Compact"/>
-              <w:jc w:val="left"/>
-            </w:pPr>
-            <w:r>
-              <w:t xml:space="preserve">100,000</w:t>
-            </w:r>
-          </w:p>
-        </w:tc>
-        <w:tc>
-          <w:p>
-            <w:pPr>
-              <w:pStyle w:val="Compact"/>
-              <w:jc w:val="left"/>
-            </w:pPr>
-            <w:r>
-              <w:t xml:space="preserve">4,096</w:t>
-            </w:r>
-          </w:p>
-        </w:tc>
-        <w:tc>
-          <w:p>
-            <w:pPr>
-              <w:pStyle w:val="Compact"/>
-              <w:jc w:val="left"/>
-            </w:pPr>
-            <w:r>
-              <w:t xml:space="preserve">float32</w:t>
-            </w:r>
-          </w:p>
-        </w:tc>
-        <w:tc>
-          <w:p>
-            <w:pPr>
-              <w:pStyle w:val="Compact"/>
-              <w:jc w:val="left"/>
-            </w:pPr>
-            <w:r>
-              <w:t xml:space="preserve">exact subcategory match</w:t>
-            </w:r>
-          </w:p>
-        </w:tc>
-        <w:tc>
-          <w:p>
-            <w:pPr>
-              <w:pStyle w:val="Compact"/>
-              <w:jc w:val="left"/>
-            </w:pPr>
-            <w:r>
-              <w:t xml:space="preserve">38.469640%</w:t>
-            </w:r>
-          </w:p>
-        </w:tc>
-        <w:tc>
-          <w:p>
-            <w:pPr>
-              <w:pStyle w:val="Compact"/>
-              <w:jc w:val="left"/>
-            </w:pPr>
-            <w:r>
-              <w:t xml:space="preserve">52.817000%</w:t>
-            </w:r>
-          </w:p>
-        </w:tc>
-        <w:tc>
-          <w:p>
-            <w:pPr>
-              <w:pStyle w:val="Compact"/>
-              <w:jc w:val="left"/>
-            </w:pPr>
-            <w:r>
-              <w:t xml:space="preserve">52.817000%</w:t>
-            </w:r>
-          </w:p>
-        </w:tc>
-        <w:tc>
-          <w:p>
-            <w:pPr>
-              <w:pStyle w:val="Compact"/>
-              <w:jc w:val="left"/>
-            </w:pPr>
-            <w:r>
-              <w:t xml:space="preserve">0.30%</w:t>
-            </w:r>
-          </w:p>
-        </w:tc>
-        <w:tc>
-          <w:p>
-            <w:pPr>
-              <w:pStyle w:val="Compact"/>
-              <w:jc w:val="left"/>
-            </w:pPr>
-            <w:r>
-              <w:t xml:space="preserve">99,991</w:t>
+              <w:t xml:space="preserve">GPU CAGRA</w:t>
+            </w:r>
+          </w:p>
+        </w:tc>
+        <w:tc>
+          <w:p>
+            <w:pPr>
+              <w:pStyle w:val="Compact"/>
+              <w:jc w:val="left"/>
+            </w:pPr>
+            <w:r>
+              <w:t xml:space="preserve">ArXiv medium EM/EMIS/R</w:t>
+            </w:r>
+          </w:p>
+        </w:tc>
+        <w:tc>
+          <w:p>
+            <w:pPr>
+              <w:pStyle w:val="Compact"/>
+              <w:jc w:val="left"/>
+            </w:pPr>
+            <w:r>
+              <w:t xml:space="preserve">NN-descent</w:t>
+            </w:r>
+            <w:r>
+              <w:t xml:space="preserve"> </w:t>
+            </w:r>
+            <w:r>
+              <w:rPr>
+                <w:rStyle w:val="VerbatimChar"/>
+              </w:rPr>
+              <w:t xml:space="preserve">G=32</w:t>
+            </w:r>
+            <w:r>
+              <w:t xml:space="preserve">,</w:t>
+            </w:r>
+            <w:r>
+              <w:t xml:space="preserve"> </w:t>
+            </w:r>
+            <w:r>
+              <w:rPr>
+                <w:rStyle w:val="VerbatimChar"/>
+              </w:rPr>
+              <w:t xml:space="preserve">IG=64</w:t>
+            </w:r>
+          </w:p>
+        </w:tc>
+        <w:tc>
+          <w:p>
+            <w:pPr>
+              <w:pStyle w:val="Compact"/>
+              <w:jc w:val="left"/>
+            </w:pPr>
+            <w:r>
+              <w:t xml:space="preserve">Controlled medium graph shared by Base, Retain, and NaviX</w:t>
             </w:r>
           </w:p>
         </w:tc>
@@ -1563,106 +1416,55 @@
               <w:jc w:val="left"/>
             </w:pPr>
             <w:r>
-              <w:t xml:space="preserve">ArXiv-EMIS</w:t>
-            </w:r>
-          </w:p>
-        </w:tc>
-        <w:tc>
-          <w:p>
-            <w:pPr>
-              <w:pStyle w:val="Compact"/>
-              <w:jc w:val="left"/>
-            </w:pPr>
-            <w:r>
-              <w:t xml:space="preserve">100,000</w:t>
-            </w:r>
-          </w:p>
-        </w:tc>
-        <w:tc>
-          <w:p>
-            <w:pPr>
-              <w:pStyle w:val="Compact"/>
-              <w:jc w:val="left"/>
-            </w:pPr>
-            <w:r>
-              <w:t xml:space="preserve">4,096</w:t>
-            </w:r>
-          </w:p>
-        </w:tc>
-        <w:tc>
-          <w:p>
-            <w:pPr>
-              <w:pStyle w:val="Compact"/>
-              <w:jc w:val="left"/>
-            </w:pPr>
-            <w:r>
-              <w:t xml:space="preserve">float32</w:t>
-            </w:r>
-          </w:p>
-        </w:tc>
-        <w:tc>
-          <w:p>
-            <w:pPr>
-              <w:pStyle w:val="Compact"/>
-              <w:jc w:val="left"/>
-            </w:pPr>
-            <w:r>
-              <w:t xml:space="preserve">candidate contains query category</w:t>
-            </w:r>
-          </w:p>
-        </w:tc>
-        <w:tc>
-          <w:p>
-            <w:pPr>
-              <w:pStyle w:val="Compact"/>
-              <w:jc w:val="left"/>
-            </w:pPr>
-            <w:r>
-              <w:t xml:space="preserve">15.242937%</w:t>
-            </w:r>
-          </w:p>
-        </w:tc>
-        <w:tc>
-          <w:p>
-            <w:pPr>
-              <w:pStyle w:val="Compact"/>
-              <w:jc w:val="left"/>
-            </w:pPr>
-            <w:r>
-              <w:t xml:space="preserve">13.226000%</w:t>
-            </w:r>
-          </w:p>
-        </w:tc>
-        <w:tc>
-          <w:p>
-            <w:pPr>
-              <w:pStyle w:val="Compact"/>
-              <w:jc w:val="left"/>
-            </w:pPr>
-            <w:r>
-              <w:t xml:space="preserve">27.645000%</w:t>
-            </w:r>
-          </w:p>
-        </w:tc>
-        <w:tc>
-          <w:p>
-            <w:pPr>
-              <w:pStyle w:val="Compact"/>
-              <w:jc w:val="left"/>
-            </w:pPr>
-            <w:r>
-              <w:t xml:space="preserve">1.15%</w:t>
-            </w:r>
-          </w:p>
-        </w:tc>
-        <w:tc>
-          <w:p>
-            <w:pPr>
-              <w:pStyle w:val="Compact"/>
-              <w:jc w:val="left"/>
-            </w:pPr>
-            <w:r>
-              <w:t xml:space="preserve">100,000</w:t>
+              <w:t xml:space="preserve">CPU HNSW-NaviX</w:t>
+            </w:r>
+          </w:p>
+        </w:tc>
+        <w:tc>
+          <w:p>
+            <w:pPr>
+              <w:pStyle w:val="Compact"/>
+              <w:jc w:val="left"/>
+            </w:pPr>
+            <w:r>
+              <w:t xml:space="preserve">YFCC</w:t>
+            </w:r>
+          </w:p>
+        </w:tc>
+        <w:tc>
+          <w:p>
+            <w:pPr>
+              <w:pStyle w:val="Compact"/>
+              <w:jc w:val="left"/>
+            </w:pPr>
+            <w:r>
+              <w:rPr>
+                <w:rStyle w:val="VerbatimChar"/>
+              </w:rPr>
+              <w:t xml:space="preserve">M=64</w:t>
+            </w:r>
+            <w:r>
+              <w:t xml:space="preserve">,</w:t>
+            </w:r>
+            <w:r>
+              <w:t xml:space="preserve"> </w:t>
+            </w:r>
+            <w:r>
+              <w:rPr>
+                <w:rStyle w:val="VerbatimChar"/>
+              </w:rPr>
+              <w:t xml:space="preserve">efConstruction=200</w:t>
+            </w:r>
+          </w:p>
+        </w:tc>
+        <w:tc>
+          <w:p>
+            <w:pPr>
+              <w:pStyle w:val="Compact"/>
+              <w:jc w:val="left"/>
+            </w:pPr>
+            <w:r>
+              <w:t xml:space="preserve">JAG YFCC construction recipe</w:t>
             </w:r>
           </w:p>
         </w:tc>
@@ -1675,106 +1477,404 @@
               <w:jc w:val="left"/>
             </w:pPr>
             <w:r>
-              <w:t xml:space="preserve">ArXiv-R</w:t>
-            </w:r>
-          </w:p>
-        </w:tc>
-        <w:tc>
-          <w:p>
-            <w:pPr>
-              <w:pStyle w:val="Compact"/>
-              <w:jc w:val="left"/>
-            </w:pPr>
-            <w:r>
-              <w:t xml:space="preserve">100,000</w:t>
-            </w:r>
-          </w:p>
-        </w:tc>
-        <w:tc>
-          <w:p>
-            <w:pPr>
-              <w:pStyle w:val="Compact"/>
-              <w:jc w:val="left"/>
-            </w:pPr>
-            <w:r>
-              <w:t xml:space="preserve">4,096</w:t>
-            </w:r>
-          </w:p>
-        </w:tc>
-        <w:tc>
-          <w:p>
-            <w:pPr>
-              <w:pStyle w:val="Compact"/>
-              <w:jc w:val="left"/>
-            </w:pPr>
-            <w:r>
-              <w:t xml:space="preserve">float32</w:t>
-            </w:r>
-          </w:p>
-        </w:tc>
-        <w:tc>
-          <w:p>
-            <w:pPr>
-              <w:pStyle w:val="Compact"/>
-              <w:jc w:val="left"/>
-            </w:pPr>
-            <w:r>
-              <w:t xml:space="preserve">inclusive date range</w:t>
-            </w:r>
-          </w:p>
-        </w:tc>
-        <w:tc>
-          <w:p>
-            <w:pPr>
-              <w:pStyle w:val="Compact"/>
-              <w:jc w:val="left"/>
-            </w:pPr>
-            <w:r>
-              <w:t xml:space="preserve">44.552398%</w:t>
-            </w:r>
-          </w:p>
-        </w:tc>
-        <w:tc>
-          <w:p>
-            <w:pPr>
-              <w:pStyle w:val="Compact"/>
-              <w:jc w:val="left"/>
-            </w:pPr>
-            <w:r>
-              <w:t xml:space="preserve">43.787500%</w:t>
-            </w:r>
-          </w:p>
-        </w:tc>
-        <w:tc>
-          <w:p>
-            <w:pPr>
-              <w:pStyle w:val="Compact"/>
-              <w:jc w:val="left"/>
-            </w:pPr>
-            <w:r>
-              <w:t xml:space="preserve">73.778400%</w:t>
-            </w:r>
-          </w:p>
-        </w:tc>
-        <w:tc>
-          <w:p>
-            <w:pPr>
-              <w:pStyle w:val="Compact"/>
-              <w:jc w:val="left"/>
-            </w:pPr>
-            <w:r>
-              <w:t xml:space="preserve">0.13%</w:t>
-            </w:r>
-          </w:p>
-        </w:tc>
-        <w:tc>
-          <w:p>
-            <w:pPr>
-              <w:pStyle w:val="Compact"/>
-              <w:jc w:val="left"/>
-            </w:pPr>
-            <w:r>
-              <w:t xml:space="preserve">100,000</w:t>
+              <w:t xml:space="preserve">CPU HNSW-NaviX</w:t>
+            </w:r>
+          </w:p>
+        </w:tc>
+        <w:tc>
+          <w:p>
+            <w:pPr>
+              <w:pStyle w:val="Compact"/>
+              <w:jc w:val="left"/>
+            </w:pPr>
+            <w:r>
+              <w:t xml:space="preserve">ArXiv medium</w:t>
+            </w:r>
+          </w:p>
+        </w:tc>
+        <w:tc>
+          <w:p>
+            <w:pPr>
+              <w:pStyle w:val="Compact"/>
+              <w:jc w:val="left"/>
+            </w:pPr>
+            <w:r>
+              <w:rPr>
+                <w:rStyle w:val="VerbatimChar"/>
+              </w:rPr>
+              <w:t xml:space="preserve">M=32</w:t>
+            </w:r>
+            <w:r>
+              <w:t xml:space="preserve">,</w:t>
+            </w:r>
+            <w:r>
+              <w:t xml:space="preserve"> </w:t>
+            </w:r>
+            <w:r>
+              <w:rPr>
+                <w:rStyle w:val="VerbatimChar"/>
+              </w:rPr>
+              <w:t xml:space="preserve">efConstruction=200</w:t>
+            </w:r>
+          </w:p>
+        </w:tc>
+        <w:tc>
+          <w:p>
+            <w:pPr>
+              <w:pStyle w:val="Compact"/>
+              <w:jc w:val="left"/>
+            </w:pPr>
+            <w:r>
+              <w:t xml:space="preserve">filtered-ANN benchmark medium-scale recipe</w:t>
+            </w:r>
+          </w:p>
+        </w:tc>
+      </w:tr>
+      <w:tr>
+        <w:tc>
+          <w:p>
+            <w:pPr>
+              <w:pStyle w:val="Compact"/>
+              <w:jc w:val="left"/>
+            </w:pPr>
+            <w:r>
+              <w:t xml:space="preserve">CPU ACORN-gamma</w:t>
+            </w:r>
+          </w:p>
+        </w:tc>
+        <w:tc>
+          <w:p>
+            <w:pPr>
+              <w:pStyle w:val="Compact"/>
+              <w:jc w:val="left"/>
+            </w:pPr>
+            <w:r>
+              <w:t xml:space="preserve">YFCC</w:t>
+            </w:r>
+          </w:p>
+        </w:tc>
+        <w:tc>
+          <w:p>
+            <w:pPr>
+              <w:pStyle w:val="Compact"/>
+              <w:jc w:val="left"/>
+            </w:pPr>
+            <w:r>
+              <w:rPr>
+                <w:rStyle w:val="VerbatimChar"/>
+              </w:rPr>
+              <w:t xml:space="preserve">M=64</w:t>
+            </w:r>
+            <w:r>
+              <w:t xml:space="preserve">,</w:t>
+            </w:r>
+            <w:r>
+              <w:t xml:space="preserve"> </w:t>
+            </w:r>
+            <w:r>
+              <w:rPr>
+                <w:rStyle w:val="VerbatimChar"/>
+              </w:rPr>
+              <w:t xml:space="preserve">gamma=30</w:t>
+            </w:r>
+            <w:r>
+              <w:t xml:space="preserve">,</w:t>
+            </w:r>
+            <w:r>
+              <w:t xml:space="preserve"> </w:t>
+            </w:r>
+            <w:r>
+              <w:rPr>
+                <w:rStyle w:val="VerbatimChar"/>
+              </w:rPr>
+              <w:t xml:space="preserve">M_beta=64</w:t>
+            </w:r>
+            <w:r>
+              <w:t xml:space="preserve">,</w:t>
+            </w:r>
+            <w:r>
+              <w:t xml:space="preserve"> </w:t>
+            </w:r>
+            <w:r>
+              <w:rPr>
+                <w:rStyle w:val="VerbatimChar"/>
+              </w:rPr>
+              <w:t xml:space="preserve">efConstruction=1920</w:t>
+            </w:r>
+          </w:p>
+        </w:tc>
+        <w:tc>
+          <w:p>
+            <w:pPr>
+              <w:pStyle w:val="Compact"/>
+              <w:jc w:val="left"/>
+            </w:pPr>
+            <w:r>
+              <w:t xml:space="preserve">JAG parameters; adapter uses</w:t>
+            </w:r>
+            <w:r>
+              <w:t xml:space="preserve"> </w:t>
+            </w:r>
+            <w:r>
+              <w:rPr>
+                <w:rStyle w:val="VerbatimChar"/>
+              </w:rPr>
+              <w:t xml:space="preserve">efConstruction=M*gamma</w:t>
+            </w:r>
+          </w:p>
+        </w:tc>
+      </w:tr>
+      <w:tr>
+        <w:tc>
+          <w:p>
+            <w:pPr>
+              <w:pStyle w:val="Compact"/>
+              <w:jc w:val="left"/>
+            </w:pPr>
+            <w:r>
+              <w:t xml:space="preserve">CPU ACORN-gamma</w:t>
+            </w:r>
+          </w:p>
+        </w:tc>
+        <w:tc>
+          <w:p>
+            <w:pPr>
+              <w:pStyle w:val="Compact"/>
+              <w:jc w:val="left"/>
+            </w:pPr>
+            <w:r>
+              <w:t xml:space="preserve">ArXiv EM</w:t>
+            </w:r>
+          </w:p>
+        </w:tc>
+        <w:tc>
+          <w:p>
+            <w:pPr>
+              <w:pStyle w:val="Compact"/>
+              <w:jc w:val="left"/>
+            </w:pPr>
+            <w:r>
+              <w:rPr>
+                <w:rStyle w:val="VerbatimChar"/>
+              </w:rPr>
+              <w:t xml:space="preserve">M=16</w:t>
+            </w:r>
+            <w:r>
+              <w:t xml:space="preserve">,</w:t>
+            </w:r>
+            <w:r>
+              <w:t xml:space="preserve"> </w:t>
+            </w:r>
+            <w:r>
+              <w:rPr>
+                <w:rStyle w:val="VerbatimChar"/>
+              </w:rPr>
+              <w:t xml:space="preserve">gamma=10</w:t>
+            </w:r>
+            <w:r>
+              <w:t xml:space="preserve">,</w:t>
+            </w:r>
+            <w:r>
+              <w:t xml:space="preserve"> </w:t>
+            </w:r>
+            <w:r>
+              <w:rPr>
+                <w:rStyle w:val="VerbatimChar"/>
+              </w:rPr>
+              <w:t xml:space="preserve">M_beta=24</w:t>
+            </w:r>
+            <w:r>
+              <w:t xml:space="preserve">,</w:t>
+            </w:r>
+            <w:r>
+              <w:t xml:space="preserve"> </w:t>
+            </w:r>
+            <w:r>
+              <w:rPr>
+                <w:rStyle w:val="VerbatimChar"/>
+              </w:rPr>
+              <w:t xml:space="preserve">efConstruction=160</w:t>
+            </w:r>
+          </w:p>
+        </w:tc>
+        <w:tc>
+          <w:p>
+            <w:pPr>
+              <w:pStyle w:val="Compact"/>
+              <w:jc w:val="left"/>
+            </w:pPr>
+            <w:r>
+              <w:t xml:space="preserve">filtered-ANN benchmark paper</w:t>
+            </w:r>
+          </w:p>
+        </w:tc>
+      </w:tr>
+      <w:tr>
+        <w:tc>
+          <w:p>
+            <w:pPr>
+              <w:pStyle w:val="Compact"/>
+              <w:jc w:val="left"/>
+            </w:pPr>
+            <w:r>
+              <w:t xml:space="preserve">CPU ACORN-gamma</w:t>
+            </w:r>
+          </w:p>
+        </w:tc>
+        <w:tc>
+          <w:p>
+            <w:pPr>
+              <w:pStyle w:val="Compact"/>
+              <w:jc w:val="left"/>
+            </w:pPr>
+            <w:r>
+              <w:t xml:space="preserve">ArXiv EMIS</w:t>
+            </w:r>
+          </w:p>
+        </w:tc>
+        <w:tc>
+          <w:p>
+            <w:pPr>
+              <w:pStyle w:val="Compact"/>
+              <w:jc w:val="left"/>
+            </w:pPr>
+            <w:r>
+              <w:rPr>
+                <w:rStyle w:val="VerbatimChar"/>
+              </w:rPr>
+              <w:t xml:space="preserve">M=16</w:t>
+            </w:r>
+            <w:r>
+              <w:t xml:space="preserve">,</w:t>
+            </w:r>
+            <w:r>
+              <w:t xml:space="preserve"> </w:t>
+            </w:r>
+            <w:r>
+              <w:rPr>
+                <w:rStyle w:val="VerbatimChar"/>
+              </w:rPr>
+              <w:t xml:space="preserve">gamma=15</w:t>
+            </w:r>
+            <w:r>
+              <w:t xml:space="preserve">,</w:t>
+            </w:r>
+            <w:r>
+              <w:t xml:space="preserve"> </w:t>
+            </w:r>
+            <w:r>
+              <w:rPr>
+                <w:rStyle w:val="VerbatimChar"/>
+              </w:rPr>
+              <w:t xml:space="preserve">M_beta=24</w:t>
+            </w:r>
+            <w:r>
+              <w:t xml:space="preserve">,</w:t>
+            </w:r>
+            <w:r>
+              <w:t xml:space="preserve"> </w:t>
+            </w:r>
+            <w:r>
+              <w:rPr>
+                <w:rStyle w:val="VerbatimChar"/>
+              </w:rPr>
+              <w:t xml:space="preserve">efConstruction=240</w:t>
+            </w:r>
+          </w:p>
+        </w:tc>
+        <w:tc>
+          <w:p>
+            <w:pPr>
+              <w:pStyle w:val="Compact"/>
+              <w:jc w:val="left"/>
+            </w:pPr>
+            <w:r>
+              <w:t xml:space="preserve">filtered-ANN benchmark paper</w:t>
+            </w:r>
+          </w:p>
+        </w:tc>
+      </w:tr>
+      <w:tr>
+        <w:tc>
+          <w:p>
+            <w:pPr>
+              <w:pStyle w:val="Compact"/>
+              <w:jc w:val="left"/>
+            </w:pPr>
+            <w:r>
+              <w:t xml:space="preserve">CPU ACORN-gamma</w:t>
+            </w:r>
+          </w:p>
+        </w:tc>
+        <w:tc>
+          <w:p>
+            <w:pPr>
+              <w:pStyle w:val="Compact"/>
+              <w:jc w:val="left"/>
+            </w:pPr>
+            <w:r>
+              <w:t xml:space="preserve">ArXiv R</w:t>
+            </w:r>
+          </w:p>
+        </w:tc>
+        <w:tc>
+          <w:p>
+            <w:pPr>
+              <w:pStyle w:val="Compact"/>
+              <w:jc w:val="left"/>
+            </w:pPr>
+            <w:r>
+              <w:rPr>
+                <w:rStyle w:val="VerbatimChar"/>
+              </w:rPr>
+              <w:t xml:space="preserve">M=32</w:t>
+            </w:r>
+            <w:r>
+              <w:t xml:space="preserve">,</w:t>
+            </w:r>
+            <w:r>
+              <w:t xml:space="preserve"> </w:t>
+            </w:r>
+            <w:r>
+              <w:rPr>
+                <w:rStyle w:val="VerbatimChar"/>
+              </w:rPr>
+              <w:t xml:space="preserve">gamma=12</w:t>
+            </w:r>
+            <w:r>
+              <w:t xml:space="preserve">,</w:t>
+            </w:r>
+            <w:r>
+              <w:t xml:space="preserve"> </w:t>
+            </w:r>
+            <w:r>
+              <w:rPr>
+                <w:rStyle w:val="VerbatimChar"/>
+              </w:rPr>
+              <w:t xml:space="preserve">M_beta=24</w:t>
+            </w:r>
+            <w:r>
+              <w:t xml:space="preserve">,</w:t>
+            </w:r>
+            <w:r>
+              <w:t xml:space="preserve"> </w:t>
+            </w:r>
+            <w:r>
+              <w:rPr>
+                <w:rStyle w:val="VerbatimChar"/>
+              </w:rPr>
+              <w:t xml:space="preserve">efConstruction=384</w:t>
+            </w:r>
+          </w:p>
+        </w:tc>
+        <w:tc>
+          <w:p>
+            <w:pPr>
+              <w:pStyle w:val="Compact"/>
+              <w:jc w:val="left"/>
+            </w:pPr>
+            <w:r>
+              <w:t xml:space="preserve">filtered-ANN benchmark paper</w:t>
             </w:r>
           </w:p>
         </w:tc>
@@ -1785,7 +1885,7 @@
         <w:pStyle w:val="BodyText"/>
       </w:pPr>
       <w:r>
-        <w:t xml:space="preserve">Statistics come from</w:t>
+        <w:t xml:space="preserve">The production YFCC CAGRA graph was built in 166 seconds, occupies about 2.4 GiB, and has SHA-256</w:t>
       </w:r>
       <w:r>
         <w:t xml:space="preserve"> </w:t>
@@ -1794,629 +1894,33 @@
         <w:rPr>
           <w:rStyle w:val="VerbatimChar"/>
         </w:rPr>
-        <w:t xml:space="preserve">benchmarks/retrieve_workshop/evidence/workload_selectivity_summary.json</w:t>
-      </w:r>
-      <w:r>
-        <w:t xml:space="preserve"> </w:t>
-      </w:r>
-      <w:r>
-        <w:t xml:space="preserve">and cover every one of</w:t>
-      </w:r>
-      <w:r>
-        <w:t xml:space="preserve"> </w:t>
-      </w:r>
-      <w:r>
-        <w:t xml:space="preserve">the 10,000 bitmap rows. ArXiv-EM has one intrinsically underfilled query; its fixed-width GT has</w:t>
-      </w:r>
-      <w:r>
-        <w:t xml:space="preserve"> </w:t>
-      </w:r>
-      <w:r>
-        <w:t xml:space="preserve">only one legal ID for that query.</w:t>
-      </w:r>
-    </w:p>
-    <w:p>
-      <w:pPr>
-        <w:pStyle w:val="BodyText"/>
-      </w:pPr>
-      <w:r>
-        <w:t xml:space="preserve">YFCC is difficult primarily because legal nodes are very sparse. EMIS is difficult for a</w:t>
-      </w:r>
-      <w:r>
-        <w:t xml:space="preserve"> </w:t>
-      </w:r>
-      <w:r>
-        <w:t xml:space="preserve">different reason: negative query-distance/predicate correlation. The typical query's tenth legal</w:t>
-      </w:r>
-      <w:r>
-        <w:t xml:space="preserve"> </w:t>
-      </w:r>
-      <w:r>
-        <w:t xml:space="preserve">neighbor occurs at about 4.93 times the global rank expected under an independent filter, and</w:t>
-      </w:r>
-      <w:r>
-        <w:t xml:space="preserve"> </w:t>
-      </w:r>
-      <w:r>
-        <w:t xml:space="preserve">74.6% of queries have below-independence legal density among their top 1,024 unfiltered neighbors.</w:t>
-      </w:r>
-      <w:r>
-        <w:t xml:space="preserve"> </w:t>
-      </w:r>
-      <w:r>
-        <w:t xml:space="preserve">Once entered, however, the legal region is coherent: legal-parent outgoing-edge lift is 8.37 times</w:t>
-      </w:r>
-      <w:r>
-        <w:t xml:space="preserve"> </w:t>
-      </w:r>
-      <w:r>
-        <w:t xml:space="preserve">the global legal rate and the largest legal weak component contains 99.11% of legal vertices.</w:t>
+        <w:t xml:space="preserve">89af75aa2163b92ffc10e37bc97724188472b8b0df53b7bc4e9e546a9ff6f1aa</w:t>
+      </w:r>
+      <w:r>
+        <w:t xml:space="preserve">. The current paper does</w:t>
+      </w:r>
+      <w:r>
+        <w:t xml:space="preserve"> </w:t>
+      </w:r>
+      <w:r>
+        <w:t xml:space="preserve">not use the prepared ArXiv-large G64/A100 follow-up config; its exact commands are preserved in the</w:t>
+      </w:r>
+      <w:r>
+        <w:t xml:space="preserve"> </w:t>
+      </w:r>
+      <w:r>
+        <w:t xml:space="preserve">benchmark handoff.</w:t>
       </w:r>
     </w:p>
     <w:p>
       <w:pPr>
         <w:pStyle w:val="Heading1"/>
       </w:pPr>
-      <w:bookmarkStart w:id="24" w:name="gpu-implementation"/>
-      <w:r>
-        <w:t xml:space="preserve">GPU implementation</w:t>
+      <w:bookmarkStart w:id="24" w:name="workloads"/>
+      <w:r>
+        <w:t xml:space="preserve">Workloads</w:t>
       </w:r>
       <w:bookmarkEnd w:id="24"/>
-    </w:p>
-    <w:p>
-      <w:pPr>
-        <w:pStyle w:val="Heading2"/>
-      </w:pPr>
-      <w:bookmarkStart w:id="25" w:name="cagra-base"/>
-      <w:r>
-        <w:t xml:space="preserve">CAGRA-Base</w:t>
-      </w:r>
-      <w:bookmarkEnd w:id="25"/>
-    </w:p>
-    <w:p>
-      <w:pPr>
-        <w:pStyle w:val="FirstParagraph"/>
-      </w:pPr>
-      <w:r>
-        <w:t xml:space="preserve">Base preserves native CAGRA's fused, raw-distance-ordered</w:t>
-      </w:r>
-      <w:r>
-        <w:t xml:space="preserve"> </w:t>
-      </w:r>
-      <w:r>
-        <w:rPr>
-          <w:rStyle w:val="VerbatimChar"/>
-        </w:rPr>
-        <w:t xml:space="preserve">itopk</w:t>
-      </w:r>
-      <w:r>
-        <w:t xml:space="preserve"> </w:t>
-      </w:r>
-      <w:r>
-        <w:t xml:space="preserve">state. The bitmap is checked for</w:t>
-      </w:r>
-      <w:r>
-        <w:t xml:space="preserve"> </w:t>
-      </w:r>
-      <w:r>
-        <w:t xml:space="preserve">output legality, but predicate membership does not affect candidate ordering. Native fused Base</w:t>
-      </w:r>
-      <w:r>
-        <w:t xml:space="preserve"> </w:t>
-      </w:r>
-      <w:r>
-        <w:t xml:space="preserve">may repeat a valid ID when output is underfilled; evaluation therefore gives each distinct output</w:t>
-      </w:r>
-      <w:r>
-        <w:t xml:space="preserve"> </w:t>
-      </w:r>
-      <w:r>
-        <w:t xml:space="preserve">ID at most one Recall@10 credit and reports the duplicate-query rate separately.</w:t>
-      </w:r>
-    </w:p>
-    <w:p>
-      <w:pPr>
-        <w:pStyle w:val="Heading2"/>
-      </w:pPr>
-      <w:bookmarkStart w:id="26" w:name="cagra-retain"/>
-      <w:r>
-        <w:t xml:space="preserve">CAGRA-Retain</w:t>
-      </w:r>
-      <w:bookmarkEnd w:id="26"/>
-    </w:p>
-    <w:p>
-      <w:pPr>
-        <w:pStyle w:val="FirstParagraph"/>
-      </w:pPr>
-      <w:r>
-        <w:t xml:space="preserve">Retain leaves parent selection, neighbor expansion, visited handling, distance computation, and</w:t>
-      </w:r>
-      <w:r>
-        <w:t xml:space="preserve"> </w:t>
-      </w:r>
-      <w:r>
-        <w:t xml:space="preserve">termination unchanged. In parallel it keeps a bounded raw-distance top-</w:t>
-      </w:r>
-      <w:r>
-        <w:rPr>
-          <w:rStyle w:val="VerbatimChar"/>
-        </w:rPr>
-        <w:t xml:space="preserve">k</w:t>
-      </w:r>
-      <w:r>
-        <w:t xml:space="preserve"> </w:t>
-      </w:r>
-      <w:r>
-        <w:t xml:space="preserve">accumulator containing</w:t>
-      </w:r>
-      <w:r>
-        <w:t xml:space="preserve"> </w:t>
-      </w:r>
-      <w:r>
-        <w:t xml:space="preserve">only legal nodes observed anywhere during traversal. Final neighbors/distances are read from this</w:t>
-      </w:r>
-      <w:r>
-        <w:t xml:space="preserve"> </w:t>
-      </w:r>
-      <w:r>
-        <w:t xml:space="preserve">accumulator rather than from the fused navigation buffer.</w:t>
-      </w:r>
-    </w:p>
-    <w:p>
-      <w:pPr>
-        <w:pStyle w:val="BodyText"/>
-      </w:pPr>
-      <w:r>
-        <w:t xml:space="preserve">For</w:t>
-      </w:r>
-      <w:r>
-        <w:t xml:space="preserve"> </w:t>
-      </w:r>
-      <w:r>
-        <w:rPr>
-          <w:rStyle w:val="VerbatimChar"/>
-        </w:rPr>
-        <w:t xml:space="preserve">k=10</w:t>
-      </w:r>
-      <w:r>
-        <w:t xml:space="preserve">, the accumulator has a bounded 84-byte CTA-local state footprint. It removes selection</w:t>
-      </w:r>
-      <w:r>
-        <w:t xml:space="preserve"> </w:t>
-      </w:r>
-      <w:r>
-        <w:t xml:space="preserve">loss without pretending to improve reachability: if traversal never evaluates a legal ground-truth</w:t>
-      </w:r>
-      <w:r>
-        <w:t xml:space="preserve"> </w:t>
-      </w:r>
-      <w:r>
-        <w:t xml:space="preserve">node, Retain cannot recover it.</w:t>
-      </w:r>
-    </w:p>
-    <w:p>
-      <w:pPr>
-        <w:pStyle w:val="Heading2"/>
-      </w:pPr>
-      <w:bookmarkStart w:id="27" w:name="cagra-navix"/>
-      <w:r>
-        <w:t xml:space="preserve">CAGRA-NaviX</w:t>
-      </w:r>
-      <w:bookmarkEnd w:id="27"/>
-    </w:p>
-    <w:p>
-      <w:pPr>
-        <w:pStyle w:val="FirstParagraph"/>
-      </w:pPr>
-      <w:r>
-        <w:t xml:space="preserve">NaviX begins from deterministic legal bitmap seeds and maintains a legal-only persistent frontier.</w:t>
-      </w:r>
-      <w:r>
-        <w:t xml:space="preserve"> </w:t>
-      </w:r>
-      <w:r>
-        <w:t xml:space="preserve">It applies the adaptive-local NaviX policy: use one-hop expansion when local legal yield is high;</w:t>
-      </w:r>
-      <w:r>
-        <w:t xml:space="preserve"> </w:t>
-      </w:r>
-      <w:r>
-        <w:t xml:space="preserve">otherwise inspect grandchildren through rejected one-hop bridge vertices. Bridge vertices are</w:t>
-      </w:r>
-      <w:r>
-        <w:t xml:space="preserve"> </w:t>
-      </w:r>
-      <w:r>
-        <w:t xml:space="preserve">transient and are not admitted to the persistent legal frontier.</w:t>
-      </w:r>
-    </w:p>
-    <w:p>
-      <w:pPr>
-        <w:pStyle w:val="BodyText"/>
-      </w:pPr>
-      <w:r>
-        <w:t xml:space="preserve">The GPU implementation preserves CAGRA's fused</w:t>
-      </w:r>
-      <w:r>
-        <w:t xml:space="preserve"> </w:t>
-      </w:r>
-      <w:r>
-        <w:rPr>
-          <w:rStyle w:val="VerbatimChar"/>
-        </w:rPr>
-        <w:t xml:space="preserve">itopk</w:t>
-      </w:r>
-      <w:r>
-        <w:t xml:space="preserve"> </w:t>
-      </w:r>
-      <w:r>
-        <w:t xml:space="preserve">structure and avoids allocating a</w:t>
-      </w:r>
-      <w:r>
-        <w:t xml:space="preserve"> </w:t>
-      </w:r>
-      <w:r>
-        <w:rPr>
-          <w:rStyle w:val="VerbatimChar"/>
-        </w:rPr>
-        <w:t xml:space="preserve">degree^2</w:t>
-      </w:r>
-      <w:r>
-        <w:t xml:space="preserve"> </w:t>
-      </w:r>
-      <w:r>
-        <w:t xml:space="preserve">shared-memory buffer. A fixed</w:t>
-      </w:r>
-      <w:r>
-        <w:t xml:space="preserve"> </w:t>
-      </w:r>
-      <w:r>
-        <w:rPr>
-          <w:rStyle w:val="VerbatimChar"/>
-        </w:rPr>
-        <w:t xml:space="preserve">W x degree</w:t>
-      </w:r>
-      <w:r>
-        <w:t xml:space="preserve"> </w:t>
-      </w:r>
-      <w:r>
-        <w:t xml:space="preserve">bridge buffer is consumed in tiles. Warps</w:t>
-      </w:r>
-      <w:r>
-        <w:t xml:space="preserve"> </w:t>
-      </w:r>
-      <w:r>
-        <w:t xml:space="preserve">cooperatively load adjacency, ballot legal grandchildren, run visited checks, compute distances</w:t>
-      </w:r>
-      <w:r>
-        <w:t xml:space="preserve"> </w:t>
-      </w:r>
-      <w:r>
-        <w:t xml:space="preserve">only for unique admitted nodes, and commit them in deterministic bridge order. Bitmap row</w:t>
-      </w:r>
-      <w:r>
-        <w:t xml:space="preserve"> </w:t>
-      </w:r>
-      <w:r>
-        <w:t xml:space="preserve">metadata is hoisted once per CTA; aligned identity-ID rows use a direct packed-word test, while an</w:t>
-      </w:r>
-      <w:r>
-        <w:t xml:space="preserve"> </w:t>
-      </w:r>
-      <w:r>
-        <w:t xml:space="preserve">exact fallback handles unaligned rows and source-index remapping.</w:t>
-      </w:r>
-    </w:p>
-    <w:p>
-      <w:pPr>
-        <w:pStyle w:val="Heading2"/>
-      </w:pPr>
-      <w:bookmarkStart w:id="28" w:name="X038dd51fea47bd0a89e1fc07fd0758483fe83c2"/>
-      <w:r>
-        <w:t xml:space="preserve">Bitmap seed selection and matched controls</w:t>
-      </w:r>
-      <w:bookmarkEnd w:id="28"/>
-    </w:p>
-    <w:p>
-      <w:pPr>
-        <w:pStyle w:val="FirstParagraph"/>
-      </w:pPr>
-      <w:r>
-        <w:t xml:space="preserve">A separate GPU seed-selection kernel scans each query's packed bitmap and emits the first</w:t>
-      </w:r>
-      <w:r>
-        <w:t xml:space="preserve"> </w:t>
-      </w:r>
-      <w:r>
-        <w:rPr>
-          <w:rStyle w:val="VerbatimChar"/>
-        </w:rPr>
-        <w:t xml:space="preserve">k</w:t>
-      </w:r>
-      <w:r>
-        <w:t xml:space="preserve"> </w:t>
-      </w:r>
-      <w:r>
-        <w:t xml:space="preserve">legal internal graph IDs. The NaviX search kernel initializes only those valid seeds, inserts only</w:t>
-      </w:r>
-      <w:r>
-        <w:t xml:space="preserve"> </w:t>
-      </w:r>
-      <w:r>
-        <w:t xml:space="preserve">them into the visited table, and does not mix in ordinary random CAGRA starts. Seed selection is</w:t>
-      </w:r>
-      <w:r>
-        <w:t xml:space="preserve"> </w:t>
-      </w:r>
-      <w:r>
-        <w:t xml:space="preserve">included in reported search timing.</w:t>
-      </w:r>
-    </w:p>
-    <w:p>
-      <w:pPr>
-        <w:pStyle w:val="BodyText"/>
-      </w:pPr>
-      <w:r>
-        <w:t xml:space="preserve">Matched controls give CAGRA-Base and CAGRA-Retain the same deterministic legal seeds. They isolate</w:t>
-      </w:r>
-      <w:r>
-        <w:t xml:space="preserve"> </w:t>
-      </w:r>
-      <w:r>
-        <w:t xml:space="preserve">seed availability from later traversal and retention policy; they are ablations, not primary</w:t>
-      </w:r>
-      <w:r>
-        <w:t xml:space="preserve"> </w:t>
-      </w:r>
-      <w:r>
-        <w:t xml:space="preserve">methods.</w:t>
-      </w:r>
-    </w:p>
-    <w:p>
-      <w:pPr>
-        <w:pStyle w:val="Heading2"/>
-      </w:pPr>
-      <w:bookmarkStart w:id="29" w:name="b0-and-timing"/>
-      <w:r>
-        <w:t xml:space="preserve">B0 and timing</w:t>
-      </w:r>
-      <w:bookmarkEnd w:id="29"/>
-    </w:p>
-    <w:p>
-      <w:pPr>
-        <w:pStyle w:val="FirstParagraph"/>
-      </w:pPr>
-      <w:r>
-        <w:rPr>
-          <w:rStyle w:val="VerbatimChar"/>
-        </w:rPr>
-        <w:t xml:space="preserve">max_iterations=0</w:t>
-      </w:r>
-      <w:r>
-        <w:t xml:space="preserve"> </w:t>
-      </w:r>
-      <w:r>
-        <w:t xml:space="preserve">selects CAGRA's automatic budget rather than zero work:</w:t>
-      </w:r>
-    </w:p>
-    <w:p>
-      <w:pPr>
-        <w:pStyle w:val="SourceCode"/>
-      </w:pPr>
-      <w:r>
-        <w:rPr>
-          <w:rStyle w:val="VerbatimChar"/>
-        </w:rPr>
-        <w:t xml:space="preserve">B0 = floor(L / W) + g(N,D)</w:t>
-      </w:r>
-    </w:p>
-    <w:p>
-      <w:pPr>
-        <w:pStyle w:val="FirstParagraph"/>
-      </w:pPr>
-      <w:r>
-        <w:t xml:space="preserve">The size/degree allowance</w:t>
-      </w:r>
-      <w:r>
-        <w:t xml:space="preserve"> </w:t>
-      </w:r>
-      <w:r>
-        <w:rPr>
-          <w:rStyle w:val="VerbatimChar"/>
-        </w:rPr>
-        <w:t xml:space="preserve">g</w:t>
-      </w:r>
-      <w:r>
-        <w:t xml:space="preserve"> </w:t>
-      </w:r>
-      <w:r>
-        <w:t xml:space="preserve">is 6 for YFCC and 5 for ArXiv. Thus =L=512, =W=2 corresponds to 262</w:t>
-      </w:r>
-      <w:r>
-        <w:t xml:space="preserve"> </w:t>
-      </w:r>
-      <w:r>
-        <w:t xml:space="preserve">iterations on YFCC and 261 on ArXiv. A point covers 10,000 queries. ArXiv uses one call; YFCC uses</w:t>
-      </w:r>
-      <w:r>
-        <w:t xml:space="preserve"> </w:t>
-      </w:r>
-      <w:r>
-        <w:t xml:space="preserve">four 2,048-query shards and one 1,808-query shard. YFCC QPS is exactly</w:t>
-      </w:r>
-      <w:r>
-        <w:t xml:space="preserve"> </w:t>
-      </w:r>
-      <w:r>
-        <w:rPr>
-          <w:rStyle w:val="VerbatimChar"/>
-        </w:rPr>
-        <w:t xml:space="preserve">10000 / sum(five search</w:t>
-      </w:r>
-      <w:r>
-        <w:br/>
-      </w:r>
-      <w:r>
-        <w:rPr>
-          <w:rStyle w:val="VerbatimChar"/>
-        </w:rPr>
-        <w:t xml:space="preserve">times)</w:t>
-      </w:r>
-      <w:r>
-        <w:t xml:space="preserve">, never the mean of shard QPS.</w:t>
-      </w:r>
-    </w:p>
-    <w:p>
-      <w:pPr>
-        <w:pStyle w:val="BodyText"/>
-      </w:pPr>
-      <w:r>
-        <w:t xml:space="preserve">The timed GPU graph call includes NaviX bitmap seed selection when applicable. Bitmaps are already</w:t>
-      </w:r>
-      <w:r>
-        <w:t xml:space="preserve"> </w:t>
-      </w:r>
-      <w:r>
-        <w:t xml:space="preserve">resident; predicate materialization and upload are excluded for every graph method.</w:t>
-      </w:r>
-    </w:p>
-    <w:p>
-      <w:pPr>
-        <w:pStyle w:val="Heading1"/>
-      </w:pPr>
-      <w:bookmarkStart w:id="30" w:name="correctness-and-experiment-protocol"/>
-      <w:r>
-        <w:t xml:space="preserve">Correctness and experiment protocol</w:t>
-      </w:r>
-      <w:bookmarkEnd w:id="30"/>
-    </w:p>
-    <w:p>
-      <w:pPr>
-        <w:numPr>
-          <w:ilvl w:val="0"/>
-          <w:numId w:val="1004"/>
-        </w:numPr>
-        <w:pStyle w:val="Compact"/>
-      </w:pPr>
-      <w:r>
-        <w:t xml:space="preserve">Every throughput point has three complete repetitions of 10,000 queries. Figures show medians</w:t>
-      </w:r>
-      <w:r>
-        <w:t xml:space="preserve"> </w:t>
-      </w:r>
-      <w:r>
-        <w:t xml:space="preserve">with min–max bars.</w:t>
-      </w:r>
-    </w:p>
-    <w:p>
-      <w:pPr>
-        <w:numPr>
-          <w:ilvl w:val="0"/>
-          <w:numId w:val="1004"/>
-        </w:numPr>
-        <w:pStyle w:val="Compact"/>
-      </w:pPr>
-      <w:r>
-        <w:t xml:space="preserve">A separate 1,000-query correctness gate precedes throughput.</w:t>
-      </w:r>
-    </w:p>
-    <w:p>
-      <w:pPr>
-        <w:numPr>
-          <w:ilvl w:val="0"/>
-          <w:numId w:val="1004"/>
-        </w:numPr>
-        <w:pStyle w:val="Compact"/>
-      </w:pPr>
-      <w:r>
-        <w:t xml:space="preserve">Output recall uses distinct valid IDs. Legal-ID, sentinel order/distance, and duplicate checks</w:t>
-      </w:r>
-      <w:r>
-        <w:t xml:space="preserve"> </w:t>
-      </w:r>
-      <w:r>
-        <w:t xml:space="preserve">are explicit.</w:t>
-      </w:r>
-    </w:p>
-    <w:p>
-      <w:pPr>
-        <w:numPr>
-          <w:ilvl w:val="0"/>
-          <w:numId w:val="1004"/>
-        </w:numPr>
-        <w:pStyle w:val="Compact"/>
-      </w:pPr>
-      <w:r>
-        <w:t xml:space="preserve">Final GPU analysis fully hashes resident base, query, GT, bitmap, and index inputs; no hash-skip</w:t>
-      </w:r>
-      <w:r>
-        <w:t xml:space="preserve"> </w:t>
-      </w:r>
-      <w:r>
-        <w:t xml:space="preserve">path is accepted for paper staging.</w:t>
-      </w:r>
-    </w:p>
-    <w:p>
-      <w:pPr>
-        <w:numPr>
-          <w:ilvl w:val="0"/>
-          <w:numId w:val="1004"/>
-        </w:numPr>
-        <w:pStyle w:val="Compact"/>
-      </w:pPr>
-      <w:r>
-        <w:t xml:space="preserve">Exact-search correctness requires native squared-L2 cutoff recall of one, zero cutoff errors,</w:t>
-      </w:r>
-      <w:r>
-        <w:t xml:space="preserve"> </w:t>
-      </w:r>
-      <w:r>
-        <w:t xml:space="preserve">zero strict-prefix errors, and correct invalid sentinels.</w:t>
-      </w:r>
-    </w:p>
-    <w:p>
-      <w:pPr>
-        <w:numPr>
-          <w:ilvl w:val="0"/>
-          <w:numId w:val="1004"/>
-        </w:numPr>
-        <w:pStyle w:val="Compact"/>
-      </w:pPr>
-      <w:r>
-        <w:t xml:space="preserve">CPU analysis requires the complete 5-method x 4-workload x 10-</w:t>
-      </w:r>
-      <w:r>
-        <w:rPr>
-          <w:rStyle w:val="VerbatimChar"/>
-        </w:rPr>
-        <w:t xml:space="preserve">efSearch</w:t>
-      </w:r>
-      <w:r>
-        <w:t xml:space="preserve"> </w:t>
-      </w:r>
-      <w:r>
-        <w:t xml:space="preserve">Cartesian product,</w:t>
-      </w:r>
-      <w:r>
-        <w:t xml:space="preserve"> </w:t>
-      </w:r>
-      <w:r>
-        <w:t xml:space="preserve">three repetitions, and 10,000 queries. Approximate underfilling is a search-quality diagnostic;</w:t>
-      </w:r>
-      <w:r>
-        <w:t xml:space="preserve"> </w:t>
-      </w:r>
-      <w:r>
-        <w:t xml:space="preserve">filter violations, duplicate IDs, and malformed sentinel outputs are correctness failures.</w:t>
-      </w:r>
-    </w:p>
-    <w:p>
-      <w:pPr>
-        <w:pStyle w:val="FirstParagraph"/>
-      </w:pPr>
-      <w:r>
-        <w:t xml:space="preserve">Validation snapshot:</w:t>
-      </w:r>
     </w:p>
     <w:tbl>
       <w:tblPr>
@@ -2442,7 +1946,7 @@
               <w:jc w:val="left"/>
             </w:pPr>
             <w:r>
-              <w:t xml:space="preserve">Gate</w:t>
+              <w:t xml:space="preserve">Workload</w:t>
             </w:r>
           </w:p>
         </w:tc>
@@ -2459,7 +1963,143 @@
               <w:jc w:val="left"/>
             </w:pPr>
             <w:r>
-              <w:t xml:space="preserve">Result</w:t>
+              <w:t xml:space="preserve">Base rows</w:t>
+            </w:r>
+          </w:p>
+        </w:tc>
+        <w:tc>
+          <w:tcPr>
+            <w:tcBorders>
+              <w:bottom w:val="single"/>
+            </w:tcBorders>
+            <w:vAlign w:val="bottom"/>
+          </w:tcPr>
+          <w:p>
+            <w:pPr>
+              <w:pStyle w:val="Compact"/>
+              <w:jc w:val="left"/>
+            </w:pPr>
+            <w:r>
+              <w:t xml:space="preserve">Dimension</w:t>
+            </w:r>
+          </w:p>
+        </w:tc>
+        <w:tc>
+          <w:tcPr>
+            <w:tcBorders>
+              <w:bottom w:val="single"/>
+            </w:tcBorders>
+            <w:vAlign w:val="bottom"/>
+          </w:tcPr>
+          <w:p>
+            <w:pPr>
+              <w:pStyle w:val="Compact"/>
+              <w:jc w:val="left"/>
+            </w:pPr>
+            <w:r>
+              <w:t xml:space="preserve">Type</w:t>
+            </w:r>
+          </w:p>
+        </w:tc>
+        <w:tc>
+          <w:tcPr>
+            <w:tcBorders>
+              <w:bottom w:val="single"/>
+            </w:tcBorders>
+            <w:vAlign w:val="bottom"/>
+          </w:tcPr>
+          <w:p>
+            <w:pPr>
+              <w:pStyle w:val="Compact"/>
+              <w:jc w:val="left"/>
+            </w:pPr>
+            <w:r>
+              <w:t xml:space="preserve">Predicate</w:t>
+            </w:r>
+          </w:p>
+        </w:tc>
+        <w:tc>
+          <w:tcPr>
+            <w:tcBorders>
+              <w:bottom w:val="single"/>
+            </w:tcBorders>
+            <w:vAlign w:val="bottom"/>
+          </w:tcPr>
+          <w:p>
+            <w:pPr>
+              <w:pStyle w:val="Compact"/>
+              <w:jc w:val="left"/>
+            </w:pPr>
+            <w:r>
+              <w:t xml:space="preserve">Mean selectivity</w:t>
+            </w:r>
+          </w:p>
+        </w:tc>
+        <w:tc>
+          <w:tcPr>
+            <w:tcBorders>
+              <w:bottom w:val="single"/>
+            </w:tcBorders>
+            <w:vAlign w:val="bottom"/>
+          </w:tcPr>
+          <w:p>
+            <w:pPr>
+              <w:pStyle w:val="Compact"/>
+              <w:jc w:val="left"/>
+            </w:pPr>
+            <w:r>
+              <w:t xml:space="preserve">Median</w:t>
+            </w:r>
+          </w:p>
+        </w:tc>
+        <w:tc>
+          <w:tcPr>
+            <w:tcBorders>
+              <w:bottom w:val="single"/>
+            </w:tcBorders>
+            <w:vAlign w:val="bottom"/>
+          </w:tcPr>
+          <w:p>
+            <w:pPr>
+              <w:pStyle w:val="Compact"/>
+              <w:jc w:val="left"/>
+            </w:pPr>
+            <w:r>
+              <w:t xml:space="preserve">p90</w:t>
+            </w:r>
+          </w:p>
+        </w:tc>
+        <w:tc>
+          <w:tcPr>
+            <w:tcBorders>
+              <w:bottom w:val="single"/>
+            </w:tcBorders>
+            <w:vAlign w:val="bottom"/>
+          </w:tcPr>
+          <w:p>
+            <w:pPr>
+              <w:pStyle w:val="Compact"/>
+              <w:jc w:val="left"/>
+            </w:pPr>
+            <w:r>
+              <w:t xml:space="preserve">Queries &lt;=1%</w:t>
+            </w:r>
+          </w:p>
+        </w:tc>
+        <w:tc>
+          <w:tcPr>
+            <w:tcBorders>
+              <w:bottom w:val="single"/>
+            </w:tcBorders>
+            <w:vAlign w:val="bottom"/>
+          </w:tcPr>
+          <w:p>
+            <w:pPr>
+              <w:pStyle w:val="Compact"/>
+              <w:jc w:val="left"/>
+            </w:pPr>
+            <w:r>
+              <w:t xml:space="preserve">Valid GT slots</w:t>
             </w:r>
           </w:p>
         </w:tc>
@@ -2472,18 +2112,106 @@
               <w:jc w:val="left"/>
             </w:pPr>
             <w:r>
-              <w:t xml:space="preserve">CUDA bitmap tests</w:t>
-            </w:r>
-          </w:p>
-        </w:tc>
-        <w:tc>
-          <w:p>
-            <w:pPr>
-              <w:pStyle w:val="Compact"/>
-              <w:jc w:val="left"/>
-            </w:pPr>
-            <w:r>
-              <w:t xml:space="preserve">PASS: 44 tests; 2 intentional unsupported-mode skips</w:t>
+              <w:t xml:space="preserve">YFCC-10M</w:t>
+            </w:r>
+          </w:p>
+        </w:tc>
+        <w:tc>
+          <w:p>
+            <w:pPr>
+              <w:pStyle w:val="Compact"/>
+              <w:jc w:val="left"/>
+            </w:pPr>
+            <w:r>
+              <w:t xml:space="preserve">10,000,000</w:t>
+            </w:r>
+          </w:p>
+        </w:tc>
+        <w:tc>
+          <w:p>
+            <w:pPr>
+              <w:pStyle w:val="Compact"/>
+              <w:jc w:val="left"/>
+            </w:pPr>
+            <w:r>
+              <w:t xml:space="preserve">192</w:t>
+            </w:r>
+          </w:p>
+        </w:tc>
+        <w:tc>
+          <w:p>
+            <w:pPr>
+              <w:pStyle w:val="Compact"/>
+              <w:jc w:val="left"/>
+            </w:pPr>
+            <w:r>
+              <w:t xml:space="preserve">uint8</w:t>
+            </w:r>
+          </w:p>
+        </w:tc>
+        <w:tc>
+          <w:p>
+            <w:pPr>
+              <w:pStyle w:val="Compact"/>
+              <w:jc w:val="left"/>
+            </w:pPr>
+            <w:r>
+              <w:t xml:space="preserve">query tags subset of candidate tags</w:t>
+            </w:r>
+          </w:p>
+        </w:tc>
+        <w:tc>
+          <w:p>
+            <w:pPr>
+              <w:pStyle w:val="Compact"/>
+              <w:jc w:val="left"/>
+            </w:pPr>
+            <w:r>
+              <w:t xml:space="preserve">1.850965%</w:t>
+            </w:r>
+          </w:p>
+        </w:tc>
+        <w:tc>
+          <w:p>
+            <w:pPr>
+              <w:pStyle w:val="Compact"/>
+              <w:jc w:val="left"/>
+            </w:pPr>
+            <w:r>
+              <w:t xml:space="preserve">0.139485%</w:t>
+            </w:r>
+          </w:p>
+        </w:tc>
+        <w:tc>
+          <w:p>
+            <w:pPr>
+              <w:pStyle w:val="Compact"/>
+              <w:jc w:val="left"/>
+            </w:pPr>
+            <w:r>
+              <w:t xml:space="preserve">7.057260%</w:t>
+            </w:r>
+          </w:p>
+        </w:tc>
+        <w:tc>
+          <w:p>
+            <w:pPr>
+              <w:pStyle w:val="Compact"/>
+              <w:jc w:val="left"/>
+            </w:pPr>
+            <w:r>
+              <w:t xml:space="preserve">71.16%</w:t>
+            </w:r>
+          </w:p>
+        </w:tc>
+        <w:tc>
+          <w:p>
+            <w:pPr>
+              <w:pStyle w:val="Compact"/>
+              <w:jc w:val="left"/>
+            </w:pPr>
+            <w:r>
+              <w:t xml:space="preserve">100,000</w:t>
             </w:r>
           </w:p>
         </w:tc>
@@ -2496,18 +2224,106 @@
               <w:jc w:val="left"/>
             </w:pPr>
             <w:r>
-              <w:t xml:space="preserve">GPU pipeline</w:t>
-            </w:r>
-          </w:p>
-        </w:tc>
-        <w:tc>
-          <w:p>
-            <w:pPr>
-              <w:pStyle w:val="Compact"/>
-              <w:jc w:val="left"/>
-            </w:pPr>
-            <w:r>
-              <w:t xml:space="preserve">PASS: 6/6</w:t>
+              <w:t xml:space="preserve">ArXiv-EM</w:t>
+            </w:r>
+          </w:p>
+        </w:tc>
+        <w:tc>
+          <w:p>
+            <w:pPr>
+              <w:pStyle w:val="Compact"/>
+              <w:jc w:val="left"/>
+            </w:pPr>
+            <w:r>
+              <w:t xml:space="preserve">100,000</w:t>
+            </w:r>
+          </w:p>
+        </w:tc>
+        <w:tc>
+          <w:p>
+            <w:pPr>
+              <w:pStyle w:val="Compact"/>
+              <w:jc w:val="left"/>
+            </w:pPr>
+            <w:r>
+              <w:t xml:space="preserve">4,096</w:t>
+            </w:r>
+          </w:p>
+        </w:tc>
+        <w:tc>
+          <w:p>
+            <w:pPr>
+              <w:pStyle w:val="Compact"/>
+              <w:jc w:val="left"/>
+            </w:pPr>
+            <w:r>
+              <w:t xml:space="preserve">float32</w:t>
+            </w:r>
+          </w:p>
+        </w:tc>
+        <w:tc>
+          <w:p>
+            <w:pPr>
+              <w:pStyle w:val="Compact"/>
+              <w:jc w:val="left"/>
+            </w:pPr>
+            <w:r>
+              <w:t xml:space="preserve">exact subcategory match</w:t>
+            </w:r>
+          </w:p>
+        </w:tc>
+        <w:tc>
+          <w:p>
+            <w:pPr>
+              <w:pStyle w:val="Compact"/>
+              <w:jc w:val="left"/>
+            </w:pPr>
+            <w:r>
+              <w:t xml:space="preserve">38.469640%</w:t>
+            </w:r>
+          </w:p>
+        </w:tc>
+        <w:tc>
+          <w:p>
+            <w:pPr>
+              <w:pStyle w:val="Compact"/>
+              <w:jc w:val="left"/>
+            </w:pPr>
+            <w:r>
+              <w:t xml:space="preserve">52.817000%</w:t>
+            </w:r>
+          </w:p>
+        </w:tc>
+        <w:tc>
+          <w:p>
+            <w:pPr>
+              <w:pStyle w:val="Compact"/>
+              <w:jc w:val="left"/>
+            </w:pPr>
+            <w:r>
+              <w:t xml:space="preserve">52.817000%</w:t>
+            </w:r>
+          </w:p>
+        </w:tc>
+        <w:tc>
+          <w:p>
+            <w:pPr>
+              <w:pStyle w:val="Compact"/>
+              <w:jc w:val="left"/>
+            </w:pPr>
+            <w:r>
+              <w:t xml:space="preserve">0.30%</w:t>
+            </w:r>
+          </w:p>
+        </w:tc>
+        <w:tc>
+          <w:p>
+            <w:pPr>
+              <w:pStyle w:val="Compact"/>
+              <w:jc w:val="left"/>
+            </w:pPr>
+            <w:r>
+              <w:t xml:space="preserve">99,991</w:t>
             </w:r>
           </w:p>
         </w:tc>
@@ -2520,18 +2336,106 @@
               <w:jc w:val="left"/>
             </w:pPr>
             <w:r>
-              <w:t xml:space="preserve">Exact pipeline</w:t>
-            </w:r>
-          </w:p>
-        </w:tc>
-        <w:tc>
-          <w:p>
-            <w:pPr>
-              <w:pStyle w:val="Compact"/>
-              <w:jc w:val="left"/>
-            </w:pPr>
-            <w:r>
-              <w:t xml:space="preserve">PASS: 8/8</w:t>
+              <w:t xml:space="preserve">ArXiv-EMIS</w:t>
+            </w:r>
+          </w:p>
+        </w:tc>
+        <w:tc>
+          <w:p>
+            <w:pPr>
+              <w:pStyle w:val="Compact"/>
+              <w:jc w:val="left"/>
+            </w:pPr>
+            <w:r>
+              <w:t xml:space="preserve">100,000</w:t>
+            </w:r>
+          </w:p>
+        </w:tc>
+        <w:tc>
+          <w:p>
+            <w:pPr>
+              <w:pStyle w:val="Compact"/>
+              <w:jc w:val="left"/>
+            </w:pPr>
+            <w:r>
+              <w:t xml:space="preserve">4,096</w:t>
+            </w:r>
+          </w:p>
+        </w:tc>
+        <w:tc>
+          <w:p>
+            <w:pPr>
+              <w:pStyle w:val="Compact"/>
+              <w:jc w:val="left"/>
+            </w:pPr>
+            <w:r>
+              <w:t xml:space="preserve">float32</w:t>
+            </w:r>
+          </w:p>
+        </w:tc>
+        <w:tc>
+          <w:p>
+            <w:pPr>
+              <w:pStyle w:val="Compact"/>
+              <w:jc w:val="left"/>
+            </w:pPr>
+            <w:r>
+              <w:t xml:space="preserve">candidate contains query category</w:t>
+            </w:r>
+          </w:p>
+        </w:tc>
+        <w:tc>
+          <w:p>
+            <w:pPr>
+              <w:pStyle w:val="Compact"/>
+              <w:jc w:val="left"/>
+            </w:pPr>
+            <w:r>
+              <w:t xml:space="preserve">15.242937%</w:t>
+            </w:r>
+          </w:p>
+        </w:tc>
+        <w:tc>
+          <w:p>
+            <w:pPr>
+              <w:pStyle w:val="Compact"/>
+              <w:jc w:val="left"/>
+            </w:pPr>
+            <w:r>
+              <w:t xml:space="preserve">13.226000%</w:t>
+            </w:r>
+          </w:p>
+        </w:tc>
+        <w:tc>
+          <w:p>
+            <w:pPr>
+              <w:pStyle w:val="Compact"/>
+              <w:jc w:val="left"/>
+            </w:pPr>
+            <w:r>
+              <w:t xml:space="preserve">27.645000%</w:t>
+            </w:r>
+          </w:p>
+        </w:tc>
+        <w:tc>
+          <w:p>
+            <w:pPr>
+              <w:pStyle w:val="Compact"/>
+              <w:jc w:val="left"/>
+            </w:pPr>
+            <w:r>
+              <w:t xml:space="preserve">1.15%</w:t>
+            </w:r>
+          </w:p>
+        </w:tc>
+        <w:tc>
+          <w:p>
+            <w:pPr>
+              <w:pStyle w:val="Compact"/>
+              <w:jc w:val="left"/>
+            </w:pPr>
+            <w:r>
+              <w:t xml:space="preserve">100,000</w:t>
             </w:r>
           </w:p>
         </w:tc>
@@ -2544,18 +2448,895 @@
               <w:jc w:val="left"/>
             </w:pPr>
             <w:r>
-              <w:t xml:space="preserve">Bitmap-selectivity evidence</w:t>
-            </w:r>
-          </w:p>
-        </w:tc>
-        <w:tc>
-          <w:p>
-            <w:pPr>
-              <w:pStyle w:val="Compact"/>
-              <w:jc w:val="left"/>
-            </w:pPr>
-            <w:r>
-              <w:t xml:space="preserve">PASS: 4/4</w:t>
+              <w:t xml:space="preserve">ArXiv-R</w:t>
+            </w:r>
+          </w:p>
+        </w:tc>
+        <w:tc>
+          <w:p>
+            <w:pPr>
+              <w:pStyle w:val="Compact"/>
+              <w:jc w:val="left"/>
+            </w:pPr>
+            <w:r>
+              <w:t xml:space="preserve">100,000</w:t>
+            </w:r>
+          </w:p>
+        </w:tc>
+        <w:tc>
+          <w:p>
+            <w:pPr>
+              <w:pStyle w:val="Compact"/>
+              <w:jc w:val="left"/>
+            </w:pPr>
+            <w:r>
+              <w:t xml:space="preserve">4,096</w:t>
+            </w:r>
+          </w:p>
+        </w:tc>
+        <w:tc>
+          <w:p>
+            <w:pPr>
+              <w:pStyle w:val="Compact"/>
+              <w:jc w:val="left"/>
+            </w:pPr>
+            <w:r>
+              <w:t xml:space="preserve">float32</w:t>
+            </w:r>
+          </w:p>
+        </w:tc>
+        <w:tc>
+          <w:p>
+            <w:pPr>
+              <w:pStyle w:val="Compact"/>
+              <w:jc w:val="left"/>
+            </w:pPr>
+            <w:r>
+              <w:t xml:space="preserve">inclusive date range</w:t>
+            </w:r>
+          </w:p>
+        </w:tc>
+        <w:tc>
+          <w:p>
+            <w:pPr>
+              <w:pStyle w:val="Compact"/>
+              <w:jc w:val="left"/>
+            </w:pPr>
+            <w:r>
+              <w:t xml:space="preserve">44.552398%</w:t>
+            </w:r>
+          </w:p>
+        </w:tc>
+        <w:tc>
+          <w:p>
+            <w:pPr>
+              <w:pStyle w:val="Compact"/>
+              <w:jc w:val="left"/>
+            </w:pPr>
+            <w:r>
+              <w:t xml:space="preserve">43.787500%</w:t>
+            </w:r>
+          </w:p>
+        </w:tc>
+        <w:tc>
+          <w:p>
+            <w:pPr>
+              <w:pStyle w:val="Compact"/>
+              <w:jc w:val="left"/>
+            </w:pPr>
+            <w:r>
+              <w:t xml:space="preserve">73.778400%</w:t>
+            </w:r>
+          </w:p>
+        </w:tc>
+        <w:tc>
+          <w:p>
+            <w:pPr>
+              <w:pStyle w:val="Compact"/>
+              <w:jc w:val="left"/>
+            </w:pPr>
+            <w:r>
+              <w:t xml:space="preserve">0.13%</w:t>
+            </w:r>
+          </w:p>
+        </w:tc>
+        <w:tc>
+          <w:p>
+            <w:pPr>
+              <w:pStyle w:val="Compact"/>
+              <w:jc w:val="left"/>
+            </w:pPr>
+            <w:r>
+              <w:t xml:space="preserve">100,000</w:t>
+            </w:r>
+          </w:p>
+        </w:tc>
+      </w:tr>
+    </w:tbl>
+    <w:p>
+      <w:pPr>
+        <w:pStyle w:val="BodyText"/>
+      </w:pPr>
+      <w:r>
+        <w:t xml:space="preserve">Statistics come from</w:t>
+      </w:r>
+      <w:r>
+        <w:t xml:space="preserve"> </w:t>
+      </w:r>
+      <w:r>
+        <w:rPr>
+          <w:rStyle w:val="VerbatimChar"/>
+        </w:rPr>
+        <w:t xml:space="preserve">benchmarks/retrieve_workshop/evidence/workload_selectivity_summary.json</w:t>
+      </w:r>
+      <w:r>
+        <w:t xml:space="preserve"> </w:t>
+      </w:r>
+      <w:r>
+        <w:t xml:space="preserve">and cover every one of</w:t>
+      </w:r>
+      <w:r>
+        <w:t xml:space="preserve"> </w:t>
+      </w:r>
+      <w:r>
+        <w:t xml:space="preserve">the 10,000 bitmap rows. ArXiv-EM has one intrinsically underfilled query; its fixed-width GT has</w:t>
+      </w:r>
+      <w:r>
+        <w:t xml:space="preserve"> </w:t>
+      </w:r>
+      <w:r>
+        <w:t xml:space="preserve">only one legal ID for that query.</w:t>
+      </w:r>
+    </w:p>
+    <w:p>
+      <w:pPr>
+        <w:pStyle w:val="BodyText"/>
+      </w:pPr>
+      <w:r>
+        <w:t xml:space="preserve">YFCC is difficult primarily because legal nodes are very sparse. EMIS is difficult for a</w:t>
+      </w:r>
+      <w:r>
+        <w:t xml:space="preserve"> </w:t>
+      </w:r>
+      <w:r>
+        <w:t xml:space="preserve">different reason: negative query-distance/predicate correlation. The typical query's tenth legal</w:t>
+      </w:r>
+      <w:r>
+        <w:t xml:space="preserve"> </w:t>
+      </w:r>
+      <w:r>
+        <w:t xml:space="preserve">neighbor occurs at about 4.93 times the global rank expected under an independent filter, and</w:t>
+      </w:r>
+      <w:r>
+        <w:t xml:space="preserve"> </w:t>
+      </w:r>
+      <w:r>
+        <w:t xml:space="preserve">74.6% of queries have below-independence legal density among their top 1,024 unfiltered neighbors.</w:t>
+      </w:r>
+      <w:r>
+        <w:t xml:space="preserve"> </w:t>
+      </w:r>
+      <w:r>
+        <w:t xml:space="preserve">Once entered, however, the legal region is coherent: legal-parent outgoing-edge lift is 8.37 times</w:t>
+      </w:r>
+      <w:r>
+        <w:t xml:space="preserve"> </w:t>
+      </w:r>
+      <w:r>
+        <w:t xml:space="preserve">the global legal rate and the largest legal weak component contains 99.11% of legal vertices.</w:t>
+      </w:r>
+    </w:p>
+    <w:p>
+      <w:pPr>
+        <w:pStyle w:val="Heading1"/>
+      </w:pPr>
+      <w:bookmarkStart w:id="25" w:name="gpu-implementation"/>
+      <w:r>
+        <w:t xml:space="preserve">GPU implementation</w:t>
+      </w:r>
+      <w:bookmarkEnd w:id="25"/>
+    </w:p>
+    <w:p>
+      <w:pPr>
+        <w:pStyle w:val="Heading2"/>
+      </w:pPr>
+      <w:bookmarkStart w:id="26" w:name="cagra-base"/>
+      <w:r>
+        <w:t xml:space="preserve">CAGRA-Base</w:t>
+      </w:r>
+      <w:bookmarkEnd w:id="26"/>
+    </w:p>
+    <w:p>
+      <w:pPr>
+        <w:pStyle w:val="FirstParagraph"/>
+      </w:pPr>
+      <w:r>
+        <w:t xml:space="preserve">Base preserves native CAGRA's fused, raw-distance-ordered</w:t>
+      </w:r>
+      <w:r>
+        <w:t xml:space="preserve"> </w:t>
+      </w:r>
+      <w:r>
+        <w:rPr>
+          <w:rStyle w:val="VerbatimChar"/>
+        </w:rPr>
+        <w:t xml:space="preserve">itopk</w:t>
+      </w:r>
+      <w:r>
+        <w:t xml:space="preserve"> </w:t>
+      </w:r>
+      <w:r>
+        <w:t xml:space="preserve">state. The bitmap is checked for</w:t>
+      </w:r>
+      <w:r>
+        <w:t xml:space="preserve"> </w:t>
+      </w:r>
+      <w:r>
+        <w:t xml:space="preserve">output legality, but predicate membership does not affect candidate ordering. Native fused Base</w:t>
+      </w:r>
+      <w:r>
+        <w:t xml:space="preserve"> </w:t>
+      </w:r>
+      <w:r>
+        <w:t xml:space="preserve">may repeat a valid ID when output is underfilled; evaluation therefore gives each distinct output</w:t>
+      </w:r>
+      <w:r>
+        <w:t xml:space="preserve"> </w:t>
+      </w:r>
+      <w:r>
+        <w:t xml:space="preserve">ID at most one Recall@10 credit and reports the duplicate-query rate separately.</w:t>
+      </w:r>
+    </w:p>
+    <w:p>
+      <w:pPr>
+        <w:pStyle w:val="Heading2"/>
+      </w:pPr>
+      <w:bookmarkStart w:id="27" w:name="cagra-retain"/>
+      <w:r>
+        <w:t xml:space="preserve">CAGRA-Retain</w:t>
+      </w:r>
+      <w:bookmarkEnd w:id="27"/>
+    </w:p>
+    <w:p>
+      <w:pPr>
+        <w:pStyle w:val="FirstParagraph"/>
+      </w:pPr>
+      <w:r>
+        <w:t xml:space="preserve">Retain leaves parent selection, neighbor expansion, visited handling, distance computation, and</w:t>
+      </w:r>
+      <w:r>
+        <w:t xml:space="preserve"> </w:t>
+      </w:r>
+      <w:r>
+        <w:t xml:space="preserve">termination unchanged. In parallel it keeps a bounded raw-distance top-</w:t>
+      </w:r>
+      <w:r>
+        <w:rPr>
+          <w:rStyle w:val="VerbatimChar"/>
+        </w:rPr>
+        <w:t xml:space="preserve">k</w:t>
+      </w:r>
+      <w:r>
+        <w:t xml:space="preserve"> </w:t>
+      </w:r>
+      <w:r>
+        <w:t xml:space="preserve">accumulator containing</w:t>
+      </w:r>
+      <w:r>
+        <w:t xml:space="preserve"> </w:t>
+      </w:r>
+      <w:r>
+        <w:t xml:space="preserve">only legal nodes observed anywhere during traversal. Final neighbors/distances are read from this</w:t>
+      </w:r>
+      <w:r>
+        <w:t xml:space="preserve"> </w:t>
+      </w:r>
+      <w:r>
+        <w:t xml:space="preserve">accumulator rather than from the fused navigation buffer.</w:t>
+      </w:r>
+    </w:p>
+    <w:p>
+      <w:pPr>
+        <w:pStyle w:val="BodyText"/>
+      </w:pPr>
+      <w:r>
+        <w:t xml:space="preserve">For</w:t>
+      </w:r>
+      <w:r>
+        <w:t xml:space="preserve"> </w:t>
+      </w:r>
+      <w:r>
+        <w:rPr>
+          <w:rStyle w:val="VerbatimChar"/>
+        </w:rPr>
+        <w:t xml:space="preserve">k=10</w:t>
+      </w:r>
+      <w:r>
+        <w:t xml:space="preserve">, the accumulator has a bounded 84-byte CTA-local state footprint. It removes selection</w:t>
+      </w:r>
+      <w:r>
+        <w:t xml:space="preserve"> </w:t>
+      </w:r>
+      <w:r>
+        <w:t xml:space="preserve">loss without pretending to improve reachability: if traversal never evaluates a legal ground-truth</w:t>
+      </w:r>
+      <w:r>
+        <w:t xml:space="preserve"> </w:t>
+      </w:r>
+      <w:r>
+        <w:t xml:space="preserve">node, Retain cannot recover it.</w:t>
+      </w:r>
+    </w:p>
+    <w:p>
+      <w:pPr>
+        <w:pStyle w:val="Heading2"/>
+      </w:pPr>
+      <w:bookmarkStart w:id="28" w:name="cagra-navix"/>
+      <w:r>
+        <w:t xml:space="preserve">CAGRA-NaviX</w:t>
+      </w:r>
+      <w:bookmarkEnd w:id="28"/>
+    </w:p>
+    <w:p>
+      <w:pPr>
+        <w:pStyle w:val="FirstParagraph"/>
+      </w:pPr>
+      <w:r>
+        <w:t xml:space="preserve">NaviX begins from deterministic legal bitmap seeds and maintains a legal-only persistent frontier.</w:t>
+      </w:r>
+      <w:r>
+        <w:t xml:space="preserve"> </w:t>
+      </w:r>
+      <w:r>
+        <w:t xml:space="preserve">It applies the adaptive-local NaviX policy: use one-hop expansion when local legal yield is high;</w:t>
+      </w:r>
+      <w:r>
+        <w:t xml:space="preserve"> </w:t>
+      </w:r>
+      <w:r>
+        <w:t xml:space="preserve">otherwise inspect grandchildren through rejected one-hop bridge vertices. Bridge vertices are</w:t>
+      </w:r>
+      <w:r>
+        <w:t xml:space="preserve"> </w:t>
+      </w:r>
+      <w:r>
+        <w:t xml:space="preserve">transient and are not admitted to the persistent legal frontier.</w:t>
+      </w:r>
+    </w:p>
+    <w:p>
+      <w:pPr>
+        <w:pStyle w:val="BodyText"/>
+      </w:pPr>
+      <w:r>
+        <w:t xml:space="preserve">The GPU implementation preserves CAGRA's fused</w:t>
+      </w:r>
+      <w:r>
+        <w:t xml:space="preserve"> </w:t>
+      </w:r>
+      <w:r>
+        <w:rPr>
+          <w:rStyle w:val="VerbatimChar"/>
+        </w:rPr>
+        <w:t xml:space="preserve">itopk</w:t>
+      </w:r>
+      <w:r>
+        <w:t xml:space="preserve"> </w:t>
+      </w:r>
+      <w:r>
+        <w:t xml:space="preserve">structure and avoids allocating a</w:t>
+      </w:r>
+      <w:r>
+        <w:t xml:space="preserve"> </w:t>
+      </w:r>
+      <w:r>
+        <w:rPr>
+          <w:rStyle w:val="VerbatimChar"/>
+        </w:rPr>
+        <w:t xml:space="preserve">degree^2</w:t>
+      </w:r>
+      <w:r>
+        <w:t xml:space="preserve"> </w:t>
+      </w:r>
+      <w:r>
+        <w:t xml:space="preserve">shared-memory buffer. A fixed</w:t>
+      </w:r>
+      <w:r>
+        <w:t xml:space="preserve"> </w:t>
+      </w:r>
+      <w:r>
+        <w:rPr>
+          <w:rStyle w:val="VerbatimChar"/>
+        </w:rPr>
+        <w:t xml:space="preserve">W x degree</w:t>
+      </w:r>
+      <w:r>
+        <w:t xml:space="preserve"> </w:t>
+      </w:r>
+      <w:r>
+        <w:t xml:space="preserve">bridge buffer is consumed in tiles. Warps</w:t>
+      </w:r>
+      <w:r>
+        <w:t xml:space="preserve"> </w:t>
+      </w:r>
+      <w:r>
+        <w:t xml:space="preserve">cooperatively load adjacency, ballot legal grandchildren, run visited checks, compute distances</w:t>
+      </w:r>
+      <w:r>
+        <w:t xml:space="preserve"> </w:t>
+      </w:r>
+      <w:r>
+        <w:t xml:space="preserve">only for unique admitted nodes, and commit them in deterministic bridge order. Bitmap row</w:t>
+      </w:r>
+      <w:r>
+        <w:t xml:space="preserve"> </w:t>
+      </w:r>
+      <w:r>
+        <w:t xml:space="preserve">metadata is hoisted once per CTA; aligned identity-ID rows use a direct packed-word test, while an</w:t>
+      </w:r>
+      <w:r>
+        <w:t xml:space="preserve"> </w:t>
+      </w:r>
+      <w:r>
+        <w:t xml:space="preserve">exact fallback handles unaligned rows and source-index remapping.</w:t>
+      </w:r>
+    </w:p>
+    <w:p>
+      <w:pPr>
+        <w:pStyle w:val="BodyText"/>
+      </w:pPr>
+      <w:r>
+        <w:t xml:space="preserve">One source implementation is compiled into degree-32 and degree-64 plan fragments. Degree 32</w:t>
+      </w:r>
+      <w:r>
+        <w:t xml:space="preserve"> </w:t>
+      </w:r>
+      <w:r>
+        <w:t xml:space="preserve">uses one warp tile per adjacency row; degree 64 uses two coalesced tiles. The adaptive-local</w:t>
+      </w:r>
+      <w:r>
+        <w:t xml:space="preserve"> </w:t>
+      </w:r>
+      <w:r>
+        <w:t xml:space="preserve">cutovers are</w:t>
+      </w:r>
+      <w:r>
+        <w:t xml:space="preserve"> </w:t>
+      </w:r>
+      <w:r>
+        <w:rPr>
+          <w:rStyle w:val="VerbatimChar"/>
+        </w:rPr>
+        <w:t xml:space="preserve">P&lt;=4</w:t>
+      </w:r>
+      <w:r>
+        <w:t xml:space="preserve"> </w:t>
+      </w:r>
+      <w:r>
+        <w:t xml:space="preserve">blind,</w:t>
+      </w:r>
+      <w:r>
+        <w:t xml:space="preserve"> </w:t>
+      </w:r>
+      <w:r>
+        <w:rPr>
+          <w:rStyle w:val="VerbatimChar"/>
+        </w:rPr>
+        <w:t xml:space="preserve">5..12</w:t>
+      </w:r>
+      <w:r>
+        <w:t xml:space="preserve"> </w:t>
+      </w:r>
+      <w:r>
+        <w:t xml:space="preserve">directed, and</w:t>
+      </w:r>
+      <w:r>
+        <w:t xml:space="preserve"> </w:t>
+      </w:r>
+      <w:r>
+        <w:rPr>
+          <w:rStyle w:val="VerbatimChar"/>
+        </w:rPr>
+        <w:t xml:space="preserve">P&gt;=13</w:t>
+      </w:r>
+      <w:r>
+        <w:t xml:space="preserve"> </w:t>
+      </w:r>
+      <w:r>
+        <w:t xml:space="preserve">one-hop for G32; for G64 the directed</w:t>
+      </w:r>
+      <w:r>
+        <w:t xml:space="preserve"> </w:t>
+      </w:r>
+      <w:r>
+        <w:t xml:space="preserve">range is</w:t>
+      </w:r>
+      <w:r>
+        <w:t xml:space="preserve"> </w:t>
+      </w:r>
+      <w:r>
+        <w:rPr>
+          <w:rStyle w:val="VerbatimChar"/>
+        </w:rPr>
+        <w:t xml:space="preserve">5..25</w:t>
+      </w:r>
+      <w:r>
+        <w:t xml:space="preserve"> </w:t>
+      </w:r>
+      <w:r>
+        <w:t xml:space="preserve">and one-hop begins at</w:t>
+      </w:r>
+      <w:r>
+        <w:t xml:space="preserve"> </w:t>
+      </w:r>
+      <w:r>
+        <w:rPr>
+          <w:rStyle w:val="VerbatimChar"/>
+        </w:rPr>
+        <w:t xml:space="preserve">P=26</w:t>
+      </w:r>
+      <w:r>
+        <w:t xml:space="preserve">. Degree is fixed per index and dispatched once when</w:t>
+      </w:r>
+      <w:r>
+        <w:t xml:space="preserve"> </w:t>
+      </w:r>
+      <w:r>
+        <w:t xml:space="preserve">the search plan is selected.</w:t>
+      </w:r>
+    </w:p>
+    <w:p>
+      <w:pPr>
+        <w:pStyle w:val="Heading2"/>
+      </w:pPr>
+      <w:bookmarkStart w:id="29" w:name="X038dd51fea47bd0a89e1fc07fd0758483fe83c2"/>
+      <w:r>
+        <w:t xml:space="preserve">Bitmap seed selection and matched controls</w:t>
+      </w:r>
+      <w:bookmarkEnd w:id="29"/>
+    </w:p>
+    <w:p>
+      <w:pPr>
+        <w:pStyle w:val="FirstParagraph"/>
+      </w:pPr>
+      <w:r>
+        <w:t xml:space="preserve">A separate GPU seed-selection kernel scans each query's packed bitmap and emits the first</w:t>
+      </w:r>
+      <w:r>
+        <w:t xml:space="preserve"> </w:t>
+      </w:r>
+      <w:r>
+        <w:rPr>
+          <w:rStyle w:val="VerbatimChar"/>
+        </w:rPr>
+        <w:t xml:space="preserve">k</w:t>
+      </w:r>
+      <w:r>
+        <w:t xml:space="preserve"> </w:t>
+      </w:r>
+      <w:r>
+        <w:t xml:space="preserve">legal internal graph IDs. The NaviX search kernel initializes only those valid seeds, inserts only</w:t>
+      </w:r>
+      <w:r>
+        <w:t xml:space="preserve"> </w:t>
+      </w:r>
+      <w:r>
+        <w:t xml:space="preserve">them into the visited table, and does not mix in ordinary random CAGRA starts. Seed selection is</w:t>
+      </w:r>
+      <w:r>
+        <w:t xml:space="preserve"> </w:t>
+      </w:r>
+      <w:r>
+        <w:t xml:space="preserve">included in reported search timing.</w:t>
+      </w:r>
+    </w:p>
+    <w:p>
+      <w:pPr>
+        <w:pStyle w:val="BodyText"/>
+      </w:pPr>
+      <w:r>
+        <w:t xml:space="preserve">Matched controls give CAGRA-Base and CAGRA-Retain the same deterministic legal seeds. They isolate</w:t>
+      </w:r>
+      <w:r>
+        <w:t xml:space="preserve"> </w:t>
+      </w:r>
+      <w:r>
+        <w:t xml:space="preserve">seed availability from later traversal and retention policy; they are ablations, not primary</w:t>
+      </w:r>
+      <w:r>
+        <w:t xml:space="preserve"> </w:t>
+      </w:r>
+      <w:r>
+        <w:t xml:space="preserve">methods.</w:t>
+      </w:r>
+    </w:p>
+    <w:p>
+      <w:pPr>
+        <w:pStyle w:val="Heading2"/>
+      </w:pPr>
+      <w:bookmarkStart w:id="30" w:name="b0-and-timing"/>
+      <w:r>
+        <w:t xml:space="preserve">B0 and timing</w:t>
+      </w:r>
+      <w:bookmarkEnd w:id="30"/>
+    </w:p>
+    <w:p>
+      <w:pPr>
+        <w:pStyle w:val="FirstParagraph"/>
+      </w:pPr>
+      <w:r>
+        <w:rPr>
+          <w:rStyle w:val="VerbatimChar"/>
+        </w:rPr>
+        <w:t xml:space="preserve">max_iterations=0</w:t>
+      </w:r>
+      <w:r>
+        <w:t xml:space="preserve"> </w:t>
+      </w:r>
+      <w:r>
+        <w:t xml:space="preserve">selects CAGRA's automatic budget rather than zero work:</w:t>
+      </w:r>
+    </w:p>
+    <w:p>
+      <w:pPr>
+        <w:pStyle w:val="SourceCode"/>
+      </w:pPr>
+      <w:r>
+        <w:rPr>
+          <w:rStyle w:val="VerbatimChar"/>
+        </w:rPr>
+        <w:t xml:space="preserve">B0 = floor(L / W) + g(N,D)</w:t>
+      </w:r>
+    </w:p>
+    <w:p>
+      <w:pPr>
+        <w:pStyle w:val="FirstParagraph"/>
+      </w:pPr>
+      <w:r>
+        <w:t xml:space="preserve">The size/degree allowance</w:t>
+      </w:r>
+      <w:r>
+        <w:t xml:space="preserve"> </w:t>
+      </w:r>
+      <w:r>
+        <w:rPr>
+          <w:rStyle w:val="VerbatimChar"/>
+        </w:rPr>
+        <w:t xml:space="preserve">g</w:t>
+      </w:r>
+      <w:r>
+        <w:t xml:space="preserve"> </w:t>
+      </w:r>
+      <w:r>
+        <w:t xml:space="preserve">is 5 for both graph families. Thus =L=512, =W=2 corresponds to 261</w:t>
+      </w:r>
+      <w:r>
+        <w:t xml:space="preserve"> </w:t>
+      </w:r>
+      <w:r>
+        <w:t xml:space="preserve">iterations on both YFCC and ArXiv. A point covers 10,000 queries. ArXiv uses one call; YFCC uses</w:t>
+      </w:r>
+      <w:r>
+        <w:t xml:space="preserve"> </w:t>
+      </w:r>
+      <w:r>
+        <w:t xml:space="preserve">four 2,048-query shards and one 1,808-query shard. YFCC QPS is exactly</w:t>
+      </w:r>
+      <w:r>
+        <w:t xml:space="preserve"> </w:t>
+      </w:r>
+      <w:r>
+        <w:rPr>
+          <w:rStyle w:val="VerbatimChar"/>
+        </w:rPr>
+        <w:t xml:space="preserve">10000 / sum(five search</w:t>
+      </w:r>
+      <w:r>
+        <w:br/>
+      </w:r>
+      <w:r>
+        <w:rPr>
+          <w:rStyle w:val="VerbatimChar"/>
+        </w:rPr>
+        <w:t xml:space="preserve">times)</w:t>
+      </w:r>
+      <w:r>
+        <w:t xml:space="preserve">, never the mean of shard QPS.</w:t>
+      </w:r>
+    </w:p>
+    <w:p>
+      <w:pPr>
+        <w:pStyle w:val="BodyText"/>
+      </w:pPr>
+      <w:r>
+        <w:t xml:space="preserve">The timed GPU graph call includes NaviX bitmap seed selection when applicable. Bitmaps are already</w:t>
+      </w:r>
+      <w:r>
+        <w:t xml:space="preserve"> </w:t>
+      </w:r>
+      <w:r>
+        <w:t xml:space="preserve">resident; predicate materialization and upload are excluded for every graph method.</w:t>
+      </w:r>
+    </w:p>
+    <w:p>
+      <w:pPr>
+        <w:pStyle w:val="Heading1"/>
+      </w:pPr>
+      <w:bookmarkStart w:id="31" w:name="correctness-and-experiment-protocol"/>
+      <w:r>
+        <w:t xml:space="preserve">Correctness and experiment protocol</w:t>
+      </w:r>
+      <w:bookmarkEnd w:id="31"/>
+    </w:p>
+    <w:p>
+      <w:pPr>
+        <w:numPr>
+          <w:ilvl w:val="0"/>
+          <w:numId w:val="1004"/>
+        </w:numPr>
+        <w:pStyle w:val="Compact"/>
+      </w:pPr>
+      <w:r>
+        <w:t xml:space="preserve">Every throughput point has three complete repetitions of 10,000 queries. Figures show medians</w:t>
+      </w:r>
+      <w:r>
+        <w:t xml:space="preserve"> </w:t>
+      </w:r>
+      <w:r>
+        <w:t xml:space="preserve">with min–max bars.</w:t>
+      </w:r>
+    </w:p>
+    <w:p>
+      <w:pPr>
+        <w:numPr>
+          <w:ilvl w:val="0"/>
+          <w:numId w:val="1004"/>
+        </w:numPr>
+        <w:pStyle w:val="Compact"/>
+      </w:pPr>
+      <w:r>
+        <w:t xml:space="preserve">A separate 1,000-query correctness gate precedes throughput.</w:t>
+      </w:r>
+    </w:p>
+    <w:p>
+      <w:pPr>
+        <w:numPr>
+          <w:ilvl w:val="0"/>
+          <w:numId w:val="1004"/>
+        </w:numPr>
+        <w:pStyle w:val="Compact"/>
+      </w:pPr>
+      <w:r>
+        <w:t xml:space="preserve">Output recall uses distinct valid IDs. Legal-ID, sentinel order/distance, and duplicate checks</w:t>
+      </w:r>
+      <w:r>
+        <w:t xml:space="preserve"> </w:t>
+      </w:r>
+      <w:r>
+        <w:t xml:space="preserve">are explicit.</w:t>
+      </w:r>
+    </w:p>
+    <w:p>
+      <w:pPr>
+        <w:numPr>
+          <w:ilvl w:val="0"/>
+          <w:numId w:val="1004"/>
+        </w:numPr>
+        <w:pStyle w:val="Compact"/>
+      </w:pPr>
+      <w:r>
+        <w:t xml:space="preserve">Final GPU analysis fully hashes resident base, query, GT, bitmap, and index inputs; no hash-skip</w:t>
+      </w:r>
+      <w:r>
+        <w:t xml:space="preserve"> </w:t>
+      </w:r>
+      <w:r>
+        <w:t xml:space="preserve">path is accepted for paper staging.</w:t>
+      </w:r>
+    </w:p>
+    <w:p>
+      <w:pPr>
+        <w:numPr>
+          <w:ilvl w:val="0"/>
+          <w:numId w:val="1004"/>
+        </w:numPr>
+        <w:pStyle w:val="Compact"/>
+      </w:pPr>
+      <w:r>
+        <w:t xml:space="preserve">Exact-search correctness requires native squared-L2 cutoff recall of one, zero cutoff errors,</w:t>
+      </w:r>
+      <w:r>
+        <w:t xml:space="preserve"> </w:t>
+      </w:r>
+      <w:r>
+        <w:t xml:space="preserve">zero strict-prefix errors, and correct invalid sentinels.</w:t>
+      </w:r>
+    </w:p>
+    <w:p>
+      <w:pPr>
+        <w:numPr>
+          <w:ilvl w:val="0"/>
+          <w:numId w:val="1004"/>
+        </w:numPr>
+        <w:pStyle w:val="Compact"/>
+      </w:pPr>
+      <w:r>
+        <w:t xml:space="preserve">CPU analysis requires the complete 5-method x 4-workload x 10-</w:t>
+      </w:r>
+      <w:r>
+        <w:rPr>
+          <w:rStyle w:val="VerbatimChar"/>
+        </w:rPr>
+        <w:t xml:space="preserve">efSearch</w:t>
+      </w:r>
+      <w:r>
+        <w:t xml:space="preserve"> </w:t>
+      </w:r>
+      <w:r>
+        <w:t xml:space="preserve">Cartesian product,</w:t>
+      </w:r>
+      <w:r>
+        <w:t xml:space="preserve"> </w:t>
+      </w:r>
+      <w:r>
+        <w:t xml:space="preserve">three repetitions, and 10,000 queries. Approximate underfilling is a search-quality diagnostic;</w:t>
+      </w:r>
+      <w:r>
+        <w:t xml:space="preserve"> </w:t>
+      </w:r>
+      <w:r>
+        <w:t xml:space="preserve">filter violations, duplicate IDs, and malformed sentinel outputs are correctness failures.</w:t>
+      </w:r>
+    </w:p>
+    <w:p>
+      <w:pPr>
+        <w:pStyle w:val="FirstParagraph"/>
+      </w:pPr>
+      <w:r>
+        <w:t xml:space="preserve">Validation snapshot:</w:t>
+      </w:r>
+    </w:p>
+    <w:tbl>
+      <w:tblPr>
+        <w:tblStyle w:val="Table"/>
+        <w:tblW w:type="pct" w:w="0.0"/>
+        <w:tblLook w:firstRow="1"/>
+      </w:tblPr>
+      <w:tblGrid/>
+      <w:tr>
+        <w:trPr>
+          <w:cnfStyle w:firstRow="1"/>
+        </w:trPr>
+        <w:tc>
+          <w:tcPr>
+            <w:tcBorders>
+              <w:bottom w:val="single"/>
+            </w:tcBorders>
+            <w:vAlign w:val="bottom"/>
+          </w:tcPr>
+          <w:p>
+            <w:pPr>
+              <w:pStyle w:val="Compact"/>
+              <w:jc w:val="left"/>
+            </w:pPr>
+            <w:r>
+              <w:t xml:space="preserve">Gate</w:t>
+            </w:r>
+          </w:p>
+        </w:tc>
+        <w:tc>
+          <w:tcPr>
+            <w:tcBorders>
+              <w:bottom w:val="single"/>
+            </w:tcBorders>
+            <w:vAlign w:val="bottom"/>
+          </w:tcPr>
+          <w:p>
+            <w:pPr>
+              <w:pStyle w:val="Compact"/>
+              <w:jc w:val="left"/>
+            </w:pPr>
+            <w:r>
+              <w:t xml:space="preserve">Result</w:t>
             </w:r>
           </w:p>
         </w:tc>
@@ -2568,18 +3349,18 @@
               <w:jc w:val="left"/>
             </w:pPr>
             <w:r>
-              <w:t xml:space="preserve">CPU pipeline</w:t>
-            </w:r>
-          </w:p>
-        </w:tc>
-        <w:tc>
-          <w:p>
-            <w:pPr>
-              <w:pStyle w:val="Compact"/>
-              <w:jc w:val="left"/>
-            </w:pPr>
-            <w:r>
-              <w:t xml:space="preserve">PASS</w:t>
+              <w:t xml:space="preserve">CUDA bitmap tests</w:t>
+            </w:r>
+          </w:p>
+        </w:tc>
+        <w:tc>
+          <w:p>
+            <w:pPr>
+              <w:pStyle w:val="Compact"/>
+              <w:jc w:val="left"/>
+            </w:pPr>
+            <w:r>
+              <w:t xml:space="preserve">PASS: 44 tests; 2 intentional unsupported-mode skips</w:t>
             </w:r>
           </w:p>
         </w:tc>
@@ -2592,18 +3373,18 @@
               <w:jc w:val="left"/>
             </w:pPr>
             <w:r>
-              <w:t xml:space="preserve">CPU artifact preflight</w:t>
-            </w:r>
-          </w:p>
-        </w:tc>
-        <w:tc>
-          <w:p>
-            <w:pPr>
-              <w:pStyle w:val="Compact"/>
-              <w:jc w:val="left"/>
-            </w:pPr>
-            <w:r>
-              <w:t xml:space="preserve">PASS: 8 graphs, 5 methods, 4 workloads, 10,000 queries/workload</w:t>
+              <w:t xml:space="preserve">GPU pipeline</w:t>
+            </w:r>
+          </w:p>
+        </w:tc>
+        <w:tc>
+          <w:p>
+            <w:pPr>
+              <w:pStyle w:val="Compact"/>
+              <w:jc w:val="left"/>
+            </w:pPr>
+            <w:r>
+              <w:t xml:space="preserve">PASS: 6/6</w:t>
             </w:r>
           </w:p>
         </w:tc>
@@ -2616,18 +3397,18 @@
               <w:jc w:val="left"/>
             </w:pPr>
             <w:r>
-              <w:t xml:space="preserve">GPU production</w:t>
-            </w:r>
-          </w:p>
-        </w:tc>
-        <w:tc>
-          <w:p>
-            <w:pPr>
-              <w:pStyle w:val="Compact"/>
-              <w:jc w:val="left"/>
-            </w:pPr>
-            <w:r>
-              <w:t xml:space="preserve">PASS: 128 staged rows</w:t>
+              <w:t xml:space="preserve">Exact pipeline</w:t>
+            </w:r>
+          </w:p>
+        </w:tc>
+        <w:tc>
+          <w:p>
+            <w:pPr>
+              <w:pStyle w:val="Compact"/>
+              <w:jc w:val="left"/>
+            </w:pPr>
+            <w:r>
+              <w:t xml:space="preserve">PASS: 8/8</w:t>
             </w:r>
           </w:p>
         </w:tc>
@@ -2640,18 +3421,18 @@
               <w:jc w:val="left"/>
             </w:pPr>
             <w:r>
-              <w:t xml:space="preserve">Exact production</w:t>
-            </w:r>
-          </w:p>
-        </w:tc>
-        <w:tc>
-          <w:p>
-            <w:pPr>
-              <w:pStyle w:val="Compact"/>
-              <w:jc w:val="left"/>
-            </w:pPr>
-            <w:r>
-              <w:t xml:space="preserve">PASS: 4 staged rows</w:t>
+              <w:t xml:space="preserve">Bitmap-selectivity evidence</w:t>
+            </w:r>
+          </w:p>
+        </w:tc>
+        <w:tc>
+          <w:p>
+            <w:pPr>
+              <w:pStyle w:val="Compact"/>
+              <w:jc w:val="left"/>
+            </w:pPr>
+            <w:r>
+              <w:t xml:space="preserve">PASS: 4/4</w:t>
             </w:r>
           </w:p>
         </w:tc>
@@ -2664,18 +3445,18 @@
               <w:jc w:val="left"/>
             </w:pPr>
             <w:r>
-              <w:t xml:space="preserve">CPU production</w:t>
-            </w:r>
-          </w:p>
-        </w:tc>
-        <w:tc>
-          <w:p>
-            <w:pPr>
-              <w:pStyle w:val="Compact"/>
-              <w:jc w:val="left"/>
-            </w:pPr>
-            <w:r>
-              <w:t xml:space="preserve">PASS: 120/120 native commands and 200 aggregate rows</w:t>
+              <w:t xml:space="preserve">CPU pipeline</w:t>
+            </w:r>
+          </w:p>
+        </w:tc>
+        <w:tc>
+          <w:p>
+            <w:pPr>
+              <w:pStyle w:val="Compact"/>
+              <w:jc w:val="left"/>
+            </w:pPr>
+            <w:r>
+              <w:t xml:space="preserve">PASS</w:t>
             </w:r>
           </w:p>
         </w:tc>
@@ -2688,6 +3469,102 @@
               <w:jc w:val="left"/>
             </w:pPr>
             <w:r>
+              <w:t xml:space="preserve">CPU artifact preflight</w:t>
+            </w:r>
+          </w:p>
+        </w:tc>
+        <w:tc>
+          <w:p>
+            <w:pPr>
+              <w:pStyle w:val="Compact"/>
+              <w:jc w:val="left"/>
+            </w:pPr>
+            <w:r>
+              <w:t xml:space="preserve">PASS: 8 graphs, 5 methods, 4 workloads, 10,000 queries/workload</w:t>
+            </w:r>
+          </w:p>
+        </w:tc>
+      </w:tr>
+      <w:tr>
+        <w:tc>
+          <w:p>
+            <w:pPr>
+              <w:pStyle w:val="Compact"/>
+              <w:jc w:val="left"/>
+            </w:pPr>
+            <w:r>
+              <w:t xml:space="preserve">GPU production</w:t>
+            </w:r>
+          </w:p>
+        </w:tc>
+        <w:tc>
+          <w:p>
+            <w:pPr>
+              <w:pStyle w:val="Compact"/>
+              <w:jc w:val="left"/>
+            </w:pPr>
+            <w:r>
+              <w:t xml:space="preserve">PASS: 126 staged throughput rows</w:t>
+            </w:r>
+          </w:p>
+        </w:tc>
+      </w:tr>
+      <w:tr>
+        <w:tc>
+          <w:p>
+            <w:pPr>
+              <w:pStyle w:val="Compact"/>
+              <w:jc w:val="left"/>
+            </w:pPr>
+            <w:r>
+              <w:t xml:space="preserve">Exact production</w:t>
+            </w:r>
+          </w:p>
+        </w:tc>
+        <w:tc>
+          <w:p>
+            <w:pPr>
+              <w:pStyle w:val="Compact"/>
+              <w:jc w:val="left"/>
+            </w:pPr>
+            <w:r>
+              <w:t xml:space="preserve">PASS: 4 staged rows</w:t>
+            </w:r>
+          </w:p>
+        </w:tc>
+      </w:tr>
+      <w:tr>
+        <w:tc>
+          <w:p>
+            <w:pPr>
+              <w:pStyle w:val="Compact"/>
+              <w:jc w:val="left"/>
+            </w:pPr>
+            <w:r>
+              <w:t xml:space="preserve">CPU production</w:t>
+            </w:r>
+          </w:p>
+        </w:tc>
+        <w:tc>
+          <w:p>
+            <w:pPr>
+              <w:pStyle w:val="Compact"/>
+              <w:jc w:val="left"/>
+            </w:pPr>
+            <w:r>
+              <w:t xml:space="preserve">PASS: 120/120 native commands and 200 aggregate rows</w:t>
+            </w:r>
+          </w:p>
+        </w:tc>
+      </w:tr>
+      <w:tr>
+        <w:tc>
+          <w:p>
+            <w:pPr>
+              <w:pStyle w:val="Compact"/>
+              <w:jc w:val="left"/>
+            </w:pPr>
+            <w:r>
               <w:t xml:space="preserve">Paper staging/build</w:t>
             </w:r>
           </w:p>
@@ -2709,21 +3586,21 @@
       <w:pPr>
         <w:pStyle w:val="Heading1"/>
       </w:pPr>
-      <w:bookmarkStart w:id="31" w:name="results"/>
+      <w:bookmarkStart w:id="32" w:name="results"/>
       <w:r>
         <w:t xml:space="preserve">Results</w:t>
       </w:r>
-      <w:bookmarkEnd w:id="31"/>
+      <w:bookmarkEnd w:id="32"/>
     </w:p>
     <w:p>
       <w:pPr>
         <w:pStyle w:val="Heading2"/>
       </w:pPr>
-      <w:bookmarkStart w:id="32" w:name="primary-gpu-pareto-frontiers"/>
+      <w:bookmarkStart w:id="33" w:name="primary-gpu-pareto-frontiers"/>
       <w:r>
         <w:t xml:space="preserve">Primary GPU Pareto frontiers</w:t>
       </w:r>
-      <w:bookmarkEnd w:id="32"/>
+      <w:bookmarkEnd w:id="33"/>
     </w:p>
     <w:p>
       <w:pPr>
@@ -2745,7 +3622,7 @@
                     </pic:cNvPicPr>
                   </pic:nvPicPr>
                   <pic:blipFill>
-                    <a:blip r:embed="rId33"/>
+                    <a:blip r:embed="rId34"/>
                     <a:stretch>
                       <a:fillRect/>
                     </a:stretch>
@@ -2952,18 +3829,18 @@
               <w:jc w:val="left"/>
             </w:pPr>
             <w:r>
-              <w:t xml:space="preserve">0.5983</w:t>
-            </w:r>
-          </w:p>
-        </w:tc>
-        <w:tc>
-          <w:p>
-            <w:pPr>
-              <w:pStyle w:val="Compact"/>
-              <w:jc w:val="left"/>
-            </w:pPr>
-            <w:r>
-              <w:t xml:space="preserve">43,667</w:t>
+              <w:t xml:space="preserve">0.5976</w:t>
+            </w:r>
+          </w:p>
+        </w:tc>
+        <w:tc>
+          <w:p>
+            <w:pPr>
+              <w:pStyle w:val="Compact"/>
+              <w:jc w:val="left"/>
+            </w:pPr>
+            <w:r>
+              <w:t xml:space="preserve">23,218</w:t>
             </w:r>
           </w:p>
         </w:tc>
@@ -3020,18 +3897,18 @@
               <w:jc w:val="left"/>
             </w:pPr>
             <w:r>
-              <w:t xml:space="preserve">0.7179</w:t>
-            </w:r>
-          </w:p>
-        </w:tc>
-        <w:tc>
-          <w:p>
-            <w:pPr>
-              <w:pStyle w:val="Compact"/>
-              <w:jc w:val="left"/>
-            </w:pPr>
-            <w:r>
-              <w:t xml:space="preserve">41,289</w:t>
+              <w:t xml:space="preserve">0.7714</w:t>
+            </w:r>
+          </w:p>
+        </w:tc>
+        <w:tc>
+          <w:p>
+            <w:pPr>
+              <w:pStyle w:val="Compact"/>
+              <w:jc w:val="left"/>
+            </w:pPr>
+            <w:r>
+              <w:t xml:space="preserve">22,066</w:t>
             </w:r>
           </w:p>
         </w:tc>
@@ -3088,18 +3965,18 @@
               <w:jc w:val="left"/>
             </w:pPr>
             <w:r>
-              <w:t xml:space="preserve">0.7019</w:t>
-            </w:r>
-          </w:p>
-        </w:tc>
-        <w:tc>
-          <w:p>
-            <w:pPr>
-              <w:pStyle w:val="Compact"/>
-              <w:jc w:val="left"/>
-            </w:pPr>
-            <w:r>
-              <w:t xml:space="preserve">8,897</w:t>
+              <w:t xml:space="preserve">0.8168</w:t>
+            </w:r>
+          </w:p>
+        </w:tc>
+        <w:tc>
+          <w:p>
+            <w:pPr>
+              <w:pStyle w:val="Compact"/>
+              <w:jc w:val="left"/>
+            </w:pPr>
+            <w:r>
+              <w:t xml:space="preserve">2,371</w:t>
             </w:r>
           </w:p>
         </w:tc>
@@ -3167,7 +4044,7 @@
               <w:jc w:val="left"/>
             </w:pPr>
             <w:r>
-              <w:t xml:space="preserve">3,790</w:t>
+              <w:t xml:space="preserve">3,803</w:t>
             </w:r>
           </w:p>
         </w:tc>
@@ -3235,7 +4112,7 @@
               <w:jc w:val="left"/>
             </w:pPr>
             <w:r>
-              <w:t xml:space="preserve">3,793</w:t>
+              <w:t xml:space="preserve">3,805</w:t>
             </w:r>
           </w:p>
         </w:tc>
@@ -3303,7 +4180,7 @@
               <w:jc w:val="left"/>
             </w:pPr>
             <w:r>
-              <w:t xml:space="preserve">1,507</w:t>
+              <w:t xml:space="preserve">1,509</w:t>
             </w:r>
           </w:p>
         </w:tc>
@@ -3371,7 +4248,7 @@
               <w:jc w:val="left"/>
             </w:pPr>
             <w:r>
-              <w:t xml:space="preserve">3,797</w:t>
+              <w:t xml:space="preserve">3,805</w:t>
             </w:r>
           </w:p>
         </w:tc>
@@ -3439,7 +4316,7 @@
               <w:jc w:val="left"/>
             </w:pPr>
             <w:r>
-              <w:t xml:space="preserve">3,780</w:t>
+              <w:t xml:space="preserve">3,794</w:t>
             </w:r>
           </w:p>
         </w:tc>
@@ -3507,7 +4384,7 @@
               <w:jc w:val="left"/>
             </w:pPr>
             <w:r>
-              <w:t xml:space="preserve">2,143</w:t>
+              <w:t xml:space="preserve">2,147</w:t>
             </w:r>
           </w:p>
         </w:tc>
@@ -3575,7 +4452,7 @@
               <w:jc w:val="left"/>
             </w:pPr>
             <w:r>
-              <w:t xml:space="preserve">3,794</w:t>
+              <w:t xml:space="preserve">3,806</w:t>
             </w:r>
           </w:p>
         </w:tc>
@@ -3643,7 +4520,7 @@
               <w:jc w:val="left"/>
             </w:pPr>
             <w:r>
-              <w:t xml:space="preserve">3,791</w:t>
+              <w:t xml:space="preserve">3,800</w:t>
             </w:r>
           </w:p>
         </w:tc>
@@ -3711,7 +4588,7 @@
               <w:jc w:val="left"/>
             </w:pPr>
             <w:r>
-              <w:t xml:space="preserve">1,922</w:t>
+              <w:t xml:space="preserve">1,926</w:t>
             </w:r>
           </w:p>
         </w:tc>
@@ -3728,7 +4605,7 @@
         <w:t xml:space="preserve"> </w:t>
       </w:r>
       <w:r>
-        <w:t xml:space="preserve">recovers 11.96 recall points at the maximum B0 cell with only a 5.4% QPS decrease. It also raises</w:t>
+        <w:t xml:space="preserve">recovers 17.38 recall points at the maximum B0 cell with only a 5.0% QPS decrease. It also raises</w:t>
       </w:r>
       <w:r>
         <w:t xml:space="preserve"> </w:t>
@@ -3760,37 +4637,49 @@
         <w:t xml:space="preserve"> </w:t>
       </w:r>
       <w:r>
-        <w:t xml:space="preserve">accurate: on sparse YFCC its two-hop work cannot sustain a sufficiently connected legal frontier,</w:t>
-      </w:r>
-      <w:r>
-        <w:t xml:space="preserve"> </w:t>
-      </w:r>
-      <w:r>
-        <w:t xml:space="preserve">and its Pareto curve lies below Retain's.</w:t>
+        <w:t xml:space="preserve">accurate: on sparse YFCC, G64 raises NaviX's maximum-B0 recall above Retain's, but its two-hop work</w:t>
+      </w:r>
+      <w:r>
+        <w:t xml:space="preserve"> </w:t>
+      </w:r>
+      <w:r>
+        <w:t xml:space="preserve">is expensive. Selected explicit-depth Retain points dominate NaviX's measured G64 frontier at</w:t>
+      </w:r>
+      <w:r>
+        <w:t xml:space="preserve"> </w:t>
+      </w:r>
+      <w:r>
+        <w:t xml:space="preserve">comparable recall, and neither method reaches 0.9 under B0.</w:t>
       </w:r>
     </w:p>
     <w:p>
       <w:pPr>
         <w:pStyle w:val="Heading2"/>
       </w:pPr>
-      <w:bookmarkStart w:id="34" w:name="Xb4960ff45d3cfabb7ab747d0ecaa5a3c77ef423"/>
+      <w:bookmarkStart w:id="35" w:name="Xb4960ff45d3cfabb7ab747d0ecaa5a3c77ef423"/>
       <w:r>
         <w:t xml:space="preserve">Retention diagnostic and deeper YFCC search</w:t>
       </w:r>
-      <w:bookmarkEnd w:id="34"/>
+      <w:bookmarkEnd w:id="35"/>
     </w:p>
     <w:p>
       <w:pPr>
         <w:pStyle w:val="FirstParagraph"/>
       </w:pPr>
       <w:r>
-        <w:t xml:space="preserve">On the frozen 1,000-query YFCC diagnostic at =L=512, =W=2, B0, Base evaluates 66.47% of exact</w:t>
-      </w:r>
-      <w:r>
-        <w:t xml:space="preserve"> </w:t>
-      </w:r>
-      <w:r>
-        <w:t xml:space="preserve">neighbors but returns only 54.14%. Retain returns the full 66.47% seen set. This directly</w:t>
+        <w:t xml:space="preserve">On the same-G64 frozen 1,000-query YFCC diagnostic at =L=512, =W=2, B0, Base evaluates 71.86% of</w:t>
+      </w:r>
+      <w:r>
+        <w:t xml:space="preserve"> </w:t>
+      </w:r>
+      <w:r>
+        <w:t xml:space="preserve">exact neighbors but returns only 54.16%. Retain returns the full 71.86% seen set with identical</w:t>
+      </w:r>
+      <w:r>
+        <w:t xml:space="preserve"> </w:t>
+      </w:r>
+      <w:r>
+        <w:t xml:space="preserve">mean graph work (15,241.607 distance evaluations/query). This directly</w:t>
       </w:r>
       <w:r>
         <w:t xml:space="preserve"> </w:t>
@@ -3940,29 +4829,29 @@
               <w:jc w:val="left"/>
             </w:pPr>
             <w:r>
-              <w:t xml:space="preserve">1,044</w:t>
-            </w:r>
-          </w:p>
-        </w:tc>
-        <w:tc>
-          <w:p>
-            <w:pPr>
-              <w:pStyle w:val="Compact"/>
-              <w:jc w:val="left"/>
-            </w:pPr>
-            <w:r>
-              <w:t xml:space="preserve">0.8307</w:t>
-            </w:r>
-          </w:p>
-        </w:tc>
-        <w:tc>
-          <w:p>
-            <w:pPr>
-              <w:pStyle w:val="Compact"/>
-              <w:jc w:val="left"/>
-            </w:pPr>
-            <w:r>
-              <w:t xml:space="preserve">10,478</w:t>
+              <w:t xml:space="preserve">522</w:t>
+            </w:r>
+          </w:p>
+        </w:tc>
+        <w:tc>
+          <w:p>
+            <w:pPr>
+              <w:pStyle w:val="Compact"/>
+              <w:jc w:val="left"/>
+            </w:pPr>
+            <w:r>
+              <w:t xml:space="preserve">0.8258</w:t>
+            </w:r>
+          </w:p>
+        </w:tc>
+        <w:tc>
+          <w:p>
+            <w:pPr>
+              <w:pStyle w:val="Compact"/>
+              <w:jc w:val="left"/>
+            </w:pPr>
+            <w:r>
+              <w:t xml:space="preserve">11,347</w:t>
             </w:r>
           </w:p>
         </w:tc>
@@ -3997,29 +4886,29 @@
               <w:jc w:val="left"/>
             </w:pPr>
             <w:r>
-              <w:t xml:space="preserve">2,088</w:t>
-            </w:r>
-          </w:p>
-        </w:tc>
-        <w:tc>
-          <w:p>
-            <w:pPr>
-              <w:pStyle w:val="Compact"/>
-              <w:jc w:val="left"/>
-            </w:pPr>
-            <w:r>
-              <w:t xml:space="preserve">0.8767</w:t>
-            </w:r>
-          </w:p>
-        </w:tc>
-        <w:tc>
-          <w:p>
-            <w:pPr>
-              <w:pStyle w:val="Compact"/>
-              <w:jc w:val="left"/>
-            </w:pPr>
-            <w:r>
-              <w:t xml:space="preserve">5,236</w:t>
+              <w:t xml:space="preserve">1,044</w:t>
+            </w:r>
+          </w:p>
+        </w:tc>
+        <w:tc>
+          <w:p>
+            <w:pPr>
+              <w:pStyle w:val="Compact"/>
+              <w:jc w:val="left"/>
+            </w:pPr>
+            <w:r>
+              <w:t xml:space="preserve">0.8742</w:t>
+            </w:r>
+          </w:p>
+        </w:tc>
+        <w:tc>
+          <w:p>
+            <w:pPr>
+              <w:pStyle w:val="Compact"/>
+              <w:jc w:val="left"/>
+            </w:pPr>
+            <w:r>
+              <w:t xml:space="preserve">5,551</w:t>
             </w:r>
           </w:p>
         </w:tc>
@@ -4054,29 +4943,29 @@
               <w:jc w:val="left"/>
             </w:pPr>
             <w:r>
-              <w:t xml:space="preserve">4,176</w:t>
-            </w:r>
-          </w:p>
-        </w:tc>
-        <w:tc>
-          <w:p>
-            <w:pPr>
-              <w:pStyle w:val="Compact"/>
-              <w:jc w:val="left"/>
-            </w:pPr>
-            <w:r>
-              <w:t xml:space="preserve">0.9141</w:t>
-            </w:r>
-          </w:p>
-        </w:tc>
-        <w:tc>
-          <w:p>
-            <w:pPr>
-              <w:pStyle w:val="Compact"/>
-              <w:jc w:val="left"/>
-            </w:pPr>
-            <w:r>
-              <w:t xml:space="preserve">2,661</w:t>
+              <w:t xml:space="preserve">2,088</w:t>
+            </w:r>
+          </w:p>
+        </w:tc>
+        <w:tc>
+          <w:p>
+            <w:pPr>
+              <w:pStyle w:val="Compact"/>
+              <w:jc w:val="left"/>
+            </w:pPr>
+            <w:r>
+              <w:t xml:space="preserve">0.9123</w:t>
+            </w:r>
+          </w:p>
+        </w:tc>
+        <w:tc>
+          <w:p>
+            <w:pPr>
+              <w:pStyle w:val="Compact"/>
+              <w:jc w:val="left"/>
+            </w:pPr>
+            <w:r>
+              <w:t xml:space="preserve">2,783</w:t>
             </w:r>
           </w:p>
         </w:tc>
@@ -4087,30 +4976,30 @@
         <w:pStyle w:val="BodyText"/>
       </w:pPr>
       <w:r>
-        <w:t xml:space="preserve">The first measured =L=512, =W=2 point above 0.9 is 4,176 iterations. This is evidence that high</w:t>
-      </w:r>
-      <w:r>
-        <w:t xml:space="preserve"> </w:t>
-      </w:r>
-      <w:r>
-        <w:t xml:space="preserve">recall is achievable on the graph, but it costs roughly sixteen times the B0 iteration allowance</w:t>
-      </w:r>
-      <w:r>
-        <w:t xml:space="preserve"> </w:t>
-      </w:r>
-      <w:r>
-        <w:t xml:space="preserve">and about 94% of the B0 maximum-point throughput.</w:t>
+        <w:t xml:space="preserve">The first measured =L=512, =W=2 point above 0.9 is 2,088 iterations. This is evidence that high</w:t>
+      </w:r>
+      <w:r>
+        <w:t xml:space="preserve"> </w:t>
+      </w:r>
+      <w:r>
+        <w:t xml:space="preserve">recall is achievable on the graph, but it costs eight times the 261-iteration B0 allowance and</w:t>
+      </w:r>
+      <w:r>
+        <w:t xml:space="preserve"> </w:t>
+      </w:r>
+      <w:r>
+        <w:t xml:space="preserve">reduces QPS by 87.4% relative to the Retain B0 maximum point.</w:t>
       </w:r>
     </w:p>
     <w:p>
       <w:pPr>
         <w:pStyle w:val="Heading2"/>
       </w:pPr>
-      <w:bookmarkStart w:id="35" w:name="matched-seed-ablation"/>
+      <w:bookmarkStart w:id="36" w:name="matched-seed-ablation"/>
       <w:r>
         <w:t xml:space="preserve">Matched-seed ablation</w:t>
       </w:r>
-      <w:bookmarkEnd w:id="35"/>
+      <w:bookmarkEnd w:id="36"/>
     </w:p>
     <w:p>
       <w:pPr>
@@ -4132,7 +5021,7 @@
                     </pic:cNvPicPr>
                   </pic:nvPicPr>
                   <pic:blipFill>
-                    <a:blip r:embed="rId36"/>
+                    <a:blip r:embed="rId37"/>
                     <a:stretch>
                       <a:fillRect/>
                     </a:stretch>
@@ -4164,7 +5053,7 @@
         <w:pStyle w:val="BodyText"/>
       </w:pPr>
       <w:r>
-        <w:t xml:space="preserve">At =L=512, =W=2, matched seeds change YFCC Retain recall from 0.7179 to 0.7257, only +0.0078, while</w:t>
+        <w:t xml:space="preserve">At =L=512, =W=2, matched seeds change YFCC Retain recall from 0.7714 to 0.7795, only +0.0082, while</w:t>
       </w:r>
       <w:r>
         <w:t xml:space="preserve"> </w:t>
@@ -4189,11 +5078,11 @@
       <w:pPr>
         <w:pStyle w:val="Heading2"/>
       </w:pPr>
-      <w:bookmarkStart w:id="37" w:name="exact-resident-bitmap-control"/>
+      <w:bookmarkStart w:id="38" w:name="exact-resident-bitmap-control"/>
       <w:r>
         <w:t xml:space="preserve">Exact resident-bitmap control</w:t>
       </w:r>
-      <w:bookmarkEnd w:id="37"/>
+      <w:bookmarkEnd w:id="38"/>
     </w:p>
     <w:tbl>
       <w:tblPr>
@@ -4624,11 +5513,11 @@
       <w:pPr>
         <w:pStyle w:val="Heading2"/>
       </w:pPr>
-      <w:bookmarkStart w:id="38" w:name="native-cpu-context"/>
+      <w:bookmarkStart w:id="39" w:name="native-cpu-context"/>
       <w:r>
         <w:t xml:space="preserve">Native CPU context</w:t>
       </w:r>
-      <w:bookmarkEnd w:id="38"/>
+      <w:bookmarkEnd w:id="39"/>
     </w:p>
     <w:p>
       <w:pPr>
@@ -4650,7 +5539,7 @@
                     </pic:cNvPicPr>
                   </pic:nvPicPr>
                   <pic:blipFill>
-                    <a:blip r:embed="rId39"/>
+                    <a:blip r:embed="rId40"/>
                     <a:stretch>
                       <a:fillRect/>
                     </a:stretch>
@@ -4974,21 +5863,21 @@
       <w:pPr>
         <w:pStyle w:val="Heading1"/>
       </w:pPr>
-      <w:bookmarkStart w:id="40" w:name="interpretation"/>
+      <w:bookmarkStart w:id="41" w:name="interpretation"/>
       <w:r>
         <w:t xml:space="preserve">Interpretation</w:t>
       </w:r>
-      <w:bookmarkEnd w:id="40"/>
+      <w:bookmarkEnd w:id="41"/>
     </w:p>
     <w:p>
       <w:pPr>
         <w:pStyle w:val="Heading2"/>
       </w:pPr>
-      <w:bookmarkStart w:id="41" w:name="why-the-accumulator-helps"/>
+      <w:bookmarkStart w:id="42" w:name="why-the-accumulator-helps"/>
       <w:r>
         <w:t xml:space="preserve">Why the accumulator helps</w:t>
       </w:r>
-      <w:bookmarkEnd w:id="41"/>
+      <w:bookmarkEnd w:id="42"/>
     </w:p>
     <w:p>
       <w:pPr>
@@ -5035,11 +5924,11 @@
       <w:pPr>
         <w:pStyle w:val="Heading2"/>
       </w:pPr>
-      <w:bookmarkStart w:id="42" w:name="why-emis-is-hard-and-navix-succeeds"/>
+      <w:bookmarkStart w:id="43" w:name="why-emis-is-hard-and-navix-succeeds"/>
       <w:r>
         <w:t xml:space="preserve">Why EMIS is hard and NaviX succeeds</w:t>
       </w:r>
-      <w:bookmarkEnd w:id="42"/>
+      <w:bookmarkEnd w:id="43"/>
     </w:p>
     <w:p>
       <w:pPr>
@@ -5071,11 +5960,11 @@
       <w:pPr>
         <w:pStyle w:val="Heading2"/>
       </w:pPr>
-      <w:bookmarkStart w:id="43" w:name="why-yfcc-remains-hard"/>
+      <w:bookmarkStart w:id="44" w:name="why-yfcc-remains-hard"/>
       <w:r>
         <w:t xml:space="preserve">Why YFCC remains hard</w:t>
       </w:r>
-      <w:bookmarkEnd w:id="43"/>
+      <w:bookmarkEnd w:id="44"/>
     </w:p>
     <w:p>
       <w:pPr>
@@ -5125,11 +6014,11 @@
       <w:pPr>
         <w:pStyle w:val="Heading1"/>
       </w:pPr>
-      <w:bookmarkStart w:id="44" w:name="limitations"/>
+      <w:bookmarkStart w:id="45" w:name="limitations"/>
       <w:r>
         <w:t xml:space="preserve">Limitations</w:t>
       </w:r>
-      <w:bookmarkEnd w:id="44"/>
+      <w:bookmarkEnd w:id="45"/>
     </w:p>
     <w:p>
       <w:pPr>
@@ -5140,7 +6029,7 @@
         <w:pStyle w:val="Compact"/>
       </w:pPr>
       <w:r>
-        <w:t xml:space="preserve">One L4 GPU, one</w:t>
+        <w:t xml:space="preserve">One L4 GPU, YFCC</w:t>
       </w:r>
       <w:r>
         <w:t xml:space="preserve"> </w:t>
@@ -5149,7 +6038,16 @@
         <w:rPr>
           <w:rStyle w:val="VerbatimChar"/>
         </w:rPr>
-        <w:t xml:space="preserve">G=32/=IG=64 CAGRA graph family, SINGLE_CTA, squared L2, and =k=10</w:t>
+        <w:t xml:space="preserve">G=64/=IG=128 and ArXiv =G=32/=IG=64 CAGRA graphs, SINGLE_CTA,</w:t>
+      </w:r>
+      <w:r>
+        <w:br/>
+      </w:r>
+      <w:r>
+        <w:rPr>
+          <w:rStyle w:val="VerbatimChar"/>
+        </w:rPr>
+        <w:t xml:space="preserve"> squared L2, and =k=10</w:t>
       </w:r>
       <w:r>
         <w:t xml:space="preserve">.</w:t>
@@ -5237,11 +6135,11 @@
       <w:pPr>
         <w:pStyle w:val="Heading1"/>
       </w:pPr>
-      <w:bookmarkStart w:id="45" w:name="reproduction"/>
+      <w:bookmarkStart w:id="46" w:name="reproduction"/>
       <w:r>
         <w:t xml:space="preserve">Reproduction</w:t>
       </w:r>
-      <w:bookmarkEnd w:id="45"/>
+      <w:bookmarkEnd w:id="46"/>
     </w:p>
     <w:p>
       <w:pPr>
@@ -5273,11 +6171,11 @@
       <w:pPr>
         <w:pStyle w:val="Heading2"/>
       </w:pPr>
-      <w:bookmarkStart w:id="46" w:name="static-gates"/>
+      <w:bookmarkStart w:id="47" w:name="static-gates"/>
       <w:r>
         <w:t xml:space="preserve">Static gates</w:t>
       </w:r>
-      <w:bookmarkEnd w:id="46"/>
+      <w:bookmarkEnd w:id="47"/>
     </w:p>
     <w:p>
       <w:pPr>
@@ -5408,11 +6306,11 @@
       <w:pPr>
         <w:pStyle w:val="Heading2"/>
       </w:pPr>
-      <w:bookmarkStart w:id="47" w:name="gpu-graph-run"/>
+      <w:bookmarkStart w:id="48" w:name="gpu-graph-run"/>
       <w:r>
         <w:t xml:space="preserve">GPU graph run</w:t>
       </w:r>
-      <w:bookmarkEnd w:id="47"/>
+      <w:bookmarkEnd w:id="48"/>
     </w:p>
     <w:p>
       <w:pPr>
@@ -5593,11 +6491,11 @@
       <w:pPr>
         <w:pStyle w:val="Heading2"/>
       </w:pPr>
-      <w:bookmarkStart w:id="48" w:name="exact-control"/>
+      <w:bookmarkStart w:id="49" w:name="exact-control"/>
       <w:r>
         <w:t xml:space="preserve">Exact control</w:t>
       </w:r>
-      <w:bookmarkEnd w:id="48"/>
+      <w:bookmarkEnd w:id="49"/>
     </w:p>
     <w:p>
       <w:pPr>
@@ -5687,24 +6585,30 @@
         <w:pStyle w:val="FirstParagraph"/>
       </w:pPr>
       <w:r>
-        <w:t xml:space="preserve">The runner performs a live per-shard memory preflight. The largest YFCC production shard required</w:t>
-      </w:r>
-      <w:r>
-        <w:t xml:space="preserve"> </w:t>
-      </w:r>
-      <w:r>
-        <w:t xml:space="preserve">21,755,556,850 bytes free and passed with 1,904,512,014 bytes headroom on the L4.</w:t>
+        <w:t xml:space="preserve">The runner performs a live per-shard memory preflight before launching any timed method. This is</w:t>
+      </w:r>
+      <w:r>
+        <w:t xml:space="preserve"> </w:t>
+      </w:r>
+      <w:r>
+        <w:t xml:space="preserve">especially important for YFCC because the resident G64 graph and packed bitmap shard share the</w:t>
+      </w:r>
+      <w:r>
+        <w:t xml:space="preserve"> </w:t>
+      </w:r>
+      <w:r>
+        <w:t xml:space="preserve">23-GiB L4 with cuVS scratch allocations.</w:t>
       </w:r>
     </w:p>
     <w:p>
       <w:pPr>
         <w:pStyle w:val="Heading2"/>
       </w:pPr>
-      <w:bookmarkStart w:id="49" w:name="native-cpu-context-1"/>
+      <w:bookmarkStart w:id="50" w:name="native-cpu-context-1"/>
       <w:r>
         <w:t xml:space="preserve">Native CPU context</w:t>
       </w:r>
-      <w:bookmarkEnd w:id="49"/>
+      <w:bookmarkEnd w:id="50"/>
     </w:p>
     <w:p>
       <w:pPr>
@@ -5981,11 +6885,11 @@
       <w:pPr>
         <w:pStyle w:val="Heading2"/>
       </w:pPr>
-      <w:bookmarkStart w:id="50" w:name="paper-staging-and-build"/>
+      <w:bookmarkStart w:id="51" w:name="paper-staging-and-build"/>
       <w:r>
         <w:t xml:space="preserve">Paper staging and build</w:t>
       </w:r>
-      <w:bookmarkEnd w:id="50"/>
+      <w:bookmarkEnd w:id="51"/>
     </w:p>
     <w:p>
       <w:pPr>
@@ -6028,7 +6932,7 @@
         <w:rPr>
           <w:rStyle w:val="NormalTok"/>
         </w:rPr>
-        <w:t xml:space="preserve">/home/ubuntu/retrieve_workshop_runs/gpu_l4_20260820T0143Z/analysis/summary_points.csv</w:t>
+        <w:t xml:space="preserve">/home/ubuntu/retrieve_workshop_runs/gpu_l4_degreeaware_20260821_021746/analysis/summary_points.csv</w:t>
       </w:r>
       <w:r>
         <w:br/>
@@ -6161,11 +7065,11 @@
       <w:pPr>
         <w:pStyle w:val="Heading1"/>
       </w:pPr>
-      <w:bookmarkStart w:id="51" w:name="final-artifact-index"/>
+      <w:bookmarkStart w:id="52" w:name="final-artifact-index"/>
       <w:r>
         <w:t xml:space="preserve">Final artifact index</w:t>
       </w:r>
-      <w:bookmarkEnd w:id="51"/>
+      <w:bookmarkEnd w:id="52"/>
     </w:p>
     <w:tbl>
       <w:tblPr>
@@ -6328,7 +7232,7 @@
               <w:rPr>
                 <w:rStyle w:val="VerbatimChar"/>
               </w:rPr>
-              <w:t xml:space="preserve">/home/ubuntu/retrieve_workshop_runs/gpu_l4_20260820T0143Z/analysis/summary_points.csv</w:t>
+              <w:t xml:space="preserve">/home/ubuntu/retrieve_workshop_runs/gpu_l4_degreeaware_20260821_021746/analysis/summary_points.csv</w:t>
             </w:r>
           </w:p>
         </w:tc>
@@ -6366,7 +7270,7 @@
               <w:rPr>
                 <w:rStyle w:val="VerbatimChar"/>
               </w:rPr>
-              <w:t xml:space="preserve">/home/ubuntu/retrieve_workshop_runs/gpu_l4_20260820T0143Z/analysis/</w:t>
+              <w:t xml:space="preserve">/home/ubuntu/retrieve_workshop_runs/gpu_l4_degreeaware_20260821_021746/analysis/</w:t>
             </w:r>
           </w:p>
         </w:tc>
@@ -6559,10 +7463,7 @@
               <w:t xml:space="preserve">/home/ubuntu/retrieve-cagra-paper</w:t>
             </w:r>
             <w:r>
-              <w:t xml:space="preserve"> </w:t>
-            </w:r>
-            <w:r>
-              <w:t xml:space="preserve">at</w:t>
+              <w:t xml:space="preserve">; record</w:t>
             </w:r>
             <w:r>
               <w:t xml:space="preserve"> </w:t>
@@ -6571,18 +7472,24 @@
               <w:rPr>
                 <w:rStyle w:val="VerbatimChar"/>
               </w:rPr>
-              <w:t xml:space="preserve">40913bb</w:t>
-            </w:r>
-          </w:p>
-        </w:tc>
-        <w:tc>
-          <w:p>
-            <w:pPr>
-              <w:pStyle w:val="Compact"/>
-              <w:jc w:val="left"/>
-            </w:pPr>
-            <w:r>
-              <w:t xml:space="preserve">Final local commit</w:t>
+              <w:t xml:space="preserve">git rev-parse HEAD</w:t>
+            </w:r>
+            <w:r>
+              <w:t xml:space="preserve"> </w:t>
+            </w:r>
+            <w:r>
+              <w:t xml:space="preserve">after final commit</w:t>
+            </w:r>
+          </w:p>
+        </w:tc>
+        <w:tc>
+          <w:p>
+            <w:pPr>
+              <w:pStyle w:val="Compact"/>
+              <w:jc w:val="left"/>
+            </w:pPr>
+            <w:r>
+              <w:t xml:space="preserve">Final local tree</w:t>
             </w:r>
           </w:p>
         </w:tc>
@@ -6668,11 +7575,11 @@
       <w:pPr>
         <w:pStyle w:val="Heading1"/>
       </w:pPr>
-      <w:bookmarkStart w:id="52" w:name="final-checklist"/>
+      <w:bookmarkStart w:id="53" w:name="final-checklist"/>
       <w:r>
         <w:t xml:space="preserve">Final checklist</w:t>
       </w:r>
-      <w:bookmarkEnd w:id="52"/>
+      <w:bookmarkEnd w:id="53"/>
     </w:p>
     <w:p>
       <w:pPr>

</xml_diff>

<commit_message>
Refresh report with single-row plots
</commit_message>
<xml_diff>
--- a/benchmarks/retrieve_workshop/RETRIEVE_CAGRA_FILTER_AGNOSTIC_REPORT.docx
+++ b/benchmarks/retrieve_workshop/RETRIEVE_CAGRA_FILTER_AGNOSTIC_REPORT.docx
@@ -3609,7 +3609,7 @@
       <w:r>
         <w:drawing>
           <wp:inline>
-            <wp:extent cx="5334000" cy="3418032"/>
+            <wp:extent cx="5334000" cy="1678974"/>
             <wp:effectExtent b="0" l="0" r="0" t="0"/>
             <wp:docPr descr="" title="" id="1" name="Picture"/>
             <a:graphic>
@@ -3630,7 +3630,7 @@
                   <pic:spPr bwMode="auto">
                     <a:xfrm>
                       <a:off x="0" y="0"/>
-                      <a:ext cx="5334000" cy="3418032"/>
+                      <a:ext cx="5334000" cy="1678974"/>
                     </a:xfrm>
                     <a:prstGeom prst="rect">
                       <a:avLst/>
@@ -5008,7 +5008,7 @@
       <w:r>
         <w:drawing>
           <wp:inline>
-            <wp:extent cx="5334000" cy="3418032"/>
+            <wp:extent cx="5334000" cy="1678974"/>
             <wp:effectExtent b="0" l="0" r="0" t="0"/>
             <wp:docPr descr="" title="" id="1" name="Picture"/>
             <a:graphic>
@@ -5029,7 +5029,7 @@
                   <pic:spPr bwMode="auto">
                     <a:xfrm>
                       <a:off x="0" y="0"/>
-                      <a:ext cx="5334000" cy="3418032"/>
+                      <a:ext cx="5334000" cy="1678974"/>
                     </a:xfrm>
                     <a:prstGeom prst="rect">
                       <a:avLst/>
@@ -5526,7 +5526,7 @@
       <w:r>
         <w:drawing>
           <wp:inline>
-            <wp:extent cx="5334000" cy="3414694"/>
+            <wp:extent cx="5334000" cy="1675637"/>
             <wp:effectExtent b="0" l="0" r="0" t="0"/>
             <wp:docPr descr="" title="" id="1" name="Picture"/>
             <a:graphic>
@@ -5547,7 +5547,7 @@
                   <pic:spPr bwMode="auto">
                     <a:xfrm>
                       <a:off x="0" y="0"/>
-                      <a:ext cx="5334000" cy="3414694"/>
+                      <a:ext cx="5334000" cy="1675637"/>
                     </a:xfrm>
                     <a:prstGeom prst="rect">
                       <a:avLst/>

</xml_diff>

<commit_message>
Add GPU resource and dynamic-work evidence
</commit_message>
<xml_diff>
--- a/benchmarks/retrieve_workshop/RETRIEVE_CAGRA_FILTER_AGNOSTIC_REPORT.docx
+++ b/benchmarks/retrieve_workshop/RETRIEVE_CAGRA_FILTER_AGNOSTIC_REPORT.docx
@@ -666,6 +666,33 @@
               <w:jc w:val="left"/>
             </w:pPr>
             <w:r>
+              <w:t xml:space="preserve">GPU resource-work diagnostic</w:t>
+            </w:r>
+          </w:p>
+        </w:tc>
+        <w:tc>
+          <w:p>
+            <w:pPr>
+              <w:pStyle w:val="Compact"/>
+              <w:jc w:val="left"/>
+            </w:pPr>
+            <w:r>
+              <w:rPr>
+                <w:rStyle w:val="VerbatimChar"/>
+              </w:rPr>
+              <w:t xml:space="preserve">/home/ubuntu/retrieve_workshop_runs/gpu_resource_work_schema9_20260821T0510Z</w:t>
+            </w:r>
+          </w:p>
+        </w:tc>
+      </w:tr>
+      <w:tr>
+        <w:tc>
+          <w:p>
+            <w:pPr>
+              <w:pStyle w:val="Compact"/>
+              <w:jc w:val="left"/>
+            </w:pPr>
+            <w:r>
               <w:t xml:space="preserve">GPU</w:t>
             </w:r>
           </w:p>
@@ -3609,7 +3636,7 @@
       <w:r>
         <w:drawing>
           <wp:inline>
-            <wp:extent cx="5334000" cy="1678974"/>
+            <wp:extent cx="5334000" cy="1439383"/>
             <wp:effectExtent b="0" l="0" r="0" t="0"/>
             <wp:docPr descr="" title="" id="1" name="Picture"/>
             <a:graphic>
@@ -3630,7 +3657,7 @@
                   <pic:spPr bwMode="auto">
                     <a:xfrm>
                       <a:off x="0" y="0"/>
-                      <a:ext cx="5334000" cy="1678974"/>
+                      <a:ext cx="5334000" cy="1439383"/>
                     </a:xfrm>
                     <a:prstGeom prst="rect">
                       <a:avLst/>
@@ -4656,9 +4683,9 @@
       <w:pPr>
         <w:pStyle w:val="Heading2"/>
       </w:pPr>
-      <w:bookmarkStart w:id="35" w:name="Xb4960ff45d3cfabb7ab747d0ecaa5a3c77ef423"/>
-      <w:r>
-        <w:t xml:space="preserve">Retention diagnostic and deeper YFCC search</w:t>
+      <w:bookmarkStart w:id="35" w:name="gpu-dynamic-work-and-resource-footprint"/>
+      <w:r>
+        <w:t xml:space="preserve">GPU dynamic work and resource footprint</w:t>
       </w:r>
       <w:bookmarkEnd w:id="35"/>
     </w:p>
@@ -4667,39 +4694,94 @@
         <w:pStyle w:val="FirstParagraph"/>
       </w:pPr>
       <w:r>
-        <w:t xml:space="preserve">On the same-G64 frozen 1,000-query YFCC diagnostic at =L=512, =W=2, B0, Base evaluates 71.86% of</w:t>
-      </w:r>
-      <w:r>
-        <w:t xml:space="preserve"> </w:t>
-      </w:r>
-      <w:r>
-        <w:t xml:space="preserve">exact neighbors but returns only 54.16%. Retain returns the full 71.86% seen set with identical</w:t>
-      </w:r>
-      <w:r>
-        <w:t xml:space="preserve"> </w:t>
-      </w:r>
-      <w:r>
-        <w:t xml:space="preserve">mean graph work (15,241.607 distance evaluations/query). This directly</w:t>
-      </w:r>
-      <w:r>
-        <w:t xml:space="preserve"> </w:t>
-      </w:r>
-      <w:r>
-        <w:t xml:space="preserve">identifies bounded fused-frontier selection as a real loss mechanism.</w:t>
-      </w:r>
-    </w:p>
-    <w:p>
-      <w:pPr>
-        <w:pStyle w:val="BodyText"/>
-      </w:pPr>
-      <w:r>
-        <w:t xml:space="preserve">Deeper continuous Retain search shows the remaining gap is exploration work rather than an</w:t>
-      </w:r>
-      <w:r>
-        <w:t xml:space="preserve"> </w:t>
-      </w:r>
-      <w:r>
-        <w:t xml:space="preserve">incorrect accumulator:</w:t>
+        <w:t xml:space="preserve">The following table fixes the same representative point,</w:t>
+      </w:r>
+      <w:r>
+        <w:t xml:space="preserve"> </w:t>
+      </w:r>
+      <w:r>
+        <w:rPr>
+          <w:rStyle w:val="VerbatimChar"/>
+        </w:rPr>
+        <w:t xml:space="preserve">L=64</w:t>
+      </w:r>
+      <w:r>
+        <w:t xml:space="preserve">,</w:t>
+      </w:r>
+      <w:r>
+        <w:t xml:space="preserve"> </w:t>
+      </w:r>
+      <w:r>
+        <w:rPr>
+          <w:rStyle w:val="VerbatimChar"/>
+        </w:rPr>
+        <w:t xml:space="preserve">W=1</w:t>
+      </w:r>
+      <w:r>
+        <w:t xml:space="preserve">, B0, for every method on</w:t>
+      </w:r>
+      <w:r>
+        <w:t xml:space="preserve"> </w:t>
+      </w:r>
+      <w:r>
+        <w:t xml:space="preserve">the first 1,000 YFCC and EMIS queries. Dynamic counters come from untimed schema-9 diagnostic</w:t>
+      </w:r>
+      <w:r>
+        <w:t xml:space="preserve"> </w:t>
+      </w:r>
+      <w:r>
+        <w:t xml:space="preserve">kernels. Static resources come from the corresponding production, non-diagnostic JIT kernel.</w:t>
+      </w:r>
+      <w:r>
+        <w:t xml:space="preserve"> </w:t>
+      </w:r>
+      <w:r>
+        <w:rPr>
+          <w:rStyle w:val="VerbatimChar"/>
+        </w:rPr>
+        <w:t xml:space="preserve">Seed words</w:t>
+      </w:r>
+      <w:r>
+        <w:t xml:space="preserve"> </w:t>
+      </w:r>
+      <w:r>
+        <w:t xml:space="preserve">counts packed 32-bit words loaded by NaviX's strict bitmap prepass and is separate from</w:t>
+      </w:r>
+      <w:r>
+        <w:t xml:space="preserve"> </w:t>
+      </w:r>
+      <w:r>
+        <w:t xml:space="preserve">logical traversal predicate probes.</w:t>
+      </w:r>
+      <w:r>
+        <w:t xml:space="preserve"> </w:t>
+      </w:r>
+      <w:r>
+        <w:rPr>
+          <w:rStyle w:val="VerbatimChar"/>
+        </w:rPr>
+        <w:t xml:space="preserve">Legal admissions</w:t>
+      </w:r>
+      <w:r>
+        <w:t xml:space="preserve"> </w:t>
+      </w:r>
+      <w:r>
+        <w:t xml:space="preserve">excludes the ten initial seeds.</w:t>
+      </w:r>
+      <w:r>
+        <w:t xml:space="preserve"> </w:t>
+      </w:r>
+      <w:r>
+        <w:rPr>
+          <w:rStyle w:val="VerbatimChar"/>
+        </w:rPr>
+        <w:t xml:space="preserve">CTAs/SM</w:t>
+      </w:r>
+      <w:r>
+        <w:t xml:space="preserve"> </w:t>
+      </w:r>
+      <w:r>
+        <w:t xml:space="preserve">is the CUDA occupancy API's resource ceiling, not a measured achieved-occupancy percentage.</w:t>
       </w:r>
     </w:p>
     <w:tbl>
@@ -4726,7 +4808,7 @@
               <w:jc w:val="left"/>
             </w:pPr>
             <w:r>
-              <w:t xml:space="preserve">L</w:t>
+              <w:t xml:space="preserve">Workload</w:t>
             </w:r>
           </w:p>
         </w:tc>
@@ -4743,7 +4825,7 @@
               <w:jc w:val="left"/>
             </w:pPr>
             <w:r>
-              <w:t xml:space="preserve">W</w:t>
+              <w:t xml:space="preserve">Method</w:t>
             </w:r>
           </w:p>
         </w:tc>
@@ -4760,7 +4842,7 @@
               <w:jc w:val="left"/>
             </w:pPr>
             <w:r>
-              <w:t xml:space="preserve">Explicit max iterations</w:t>
+              <w:t xml:space="preserve">Graph rows/query</w:t>
             </w:r>
           </w:p>
         </w:tc>
@@ -4777,7 +4859,7 @@
               <w:jc w:val="left"/>
             </w:pPr>
             <w:r>
-              <w:t xml:space="preserve">Recall@10</w:t>
+              <w:t xml:space="preserve">Seed words/query</w:t>
             </w:r>
           </w:p>
         </w:tc>
@@ -4794,7 +4876,109 @@
               <w:jc w:val="left"/>
             </w:pPr>
             <w:r>
-              <w:t xml:space="preserve">Median QPS</w:t>
+              <w:t xml:space="preserve">Predicate probes/query</w:t>
+            </w:r>
+          </w:p>
+        </w:tc>
+        <w:tc>
+          <w:tcPr>
+            <w:tcBorders>
+              <w:bottom w:val="single"/>
+            </w:tcBorders>
+            <w:vAlign w:val="bottom"/>
+          </w:tcPr>
+          <w:p>
+            <w:pPr>
+              <w:pStyle w:val="Compact"/>
+              <w:jc w:val="left"/>
+            </w:pPr>
+            <w:r>
+              <w:t xml:space="preserve">Distance evaluations/query</w:t>
+            </w:r>
+          </w:p>
+        </w:tc>
+        <w:tc>
+          <w:tcPr>
+            <w:tcBorders>
+              <w:bottom w:val="single"/>
+            </w:tcBorders>
+            <w:vAlign w:val="bottom"/>
+          </w:tcPr>
+          <w:p>
+            <w:pPr>
+              <w:pStyle w:val="Compact"/>
+              <w:jc w:val="left"/>
+            </w:pPr>
+            <w:r>
+              <w:t xml:space="preserve">Legal admissions/query</w:t>
+            </w:r>
+          </w:p>
+        </w:tc>
+        <w:tc>
+          <w:tcPr>
+            <w:tcBorders>
+              <w:bottom w:val="single"/>
+            </w:tcBorders>
+            <w:vAlign w:val="bottom"/>
+          </w:tcPr>
+          <w:p>
+            <w:pPr>
+              <w:pStyle w:val="Compact"/>
+              <w:jc w:val="left"/>
+            </w:pPr>
+            <w:r>
+              <w:t xml:space="preserve">Threads/CTA</w:t>
+            </w:r>
+          </w:p>
+        </w:tc>
+        <w:tc>
+          <w:tcPr>
+            <w:tcBorders>
+              <w:bottom w:val="single"/>
+            </w:tcBorders>
+            <w:vAlign w:val="bottom"/>
+          </w:tcPr>
+          <w:p>
+            <w:pPr>
+              <w:pStyle w:val="Compact"/>
+              <w:jc w:val="left"/>
+            </w:pPr>
+            <w:r>
+              <w:t xml:space="preserve">Registers/thread</w:t>
+            </w:r>
+          </w:p>
+        </w:tc>
+        <w:tc>
+          <w:tcPr>
+            <w:tcBorders>
+              <w:bottom w:val="single"/>
+            </w:tcBorders>
+            <w:vAlign w:val="bottom"/>
+          </w:tcPr>
+          <w:p>
+            <w:pPr>
+              <w:pStyle w:val="Compact"/>
+              <w:jc w:val="left"/>
+            </w:pPr>
+            <w:r>
+              <w:t xml:space="preserve">Dynamic SMEM bytes (delta from Base)</w:t>
+            </w:r>
+          </w:p>
+        </w:tc>
+        <w:tc>
+          <w:tcPr>
+            <w:tcBorders>
+              <w:bottom w:val="single"/>
+            </w:tcBorders>
+            <w:vAlign w:val="bottom"/>
+          </w:tcPr>
+          <w:p>
+            <w:pPr>
+              <w:pStyle w:val="Compact"/>
+              <w:jc w:val="left"/>
+            </w:pPr>
+            <w:r>
+              <w:t xml:space="preserve">Active CTAs/SM</w:t>
             </w:r>
           </w:p>
         </w:tc>
@@ -4807,51 +4991,117 @@
               <w:jc w:val="left"/>
             </w:pPr>
             <w:r>
-              <w:t xml:space="preserve">512</w:t>
-            </w:r>
-          </w:p>
-        </w:tc>
-        <w:tc>
-          <w:p>
-            <w:pPr>
-              <w:pStyle w:val="Compact"/>
-              <w:jc w:val="left"/>
-            </w:pPr>
-            <w:r>
-              <w:t xml:space="preserve">2</w:t>
-            </w:r>
-          </w:p>
-        </w:tc>
-        <w:tc>
-          <w:p>
-            <w:pPr>
-              <w:pStyle w:val="Compact"/>
-              <w:jc w:val="left"/>
-            </w:pPr>
-            <w:r>
-              <w:t xml:space="preserve">522</w:t>
-            </w:r>
-          </w:p>
-        </w:tc>
-        <w:tc>
-          <w:p>
-            <w:pPr>
-              <w:pStyle w:val="Compact"/>
-              <w:jc w:val="left"/>
-            </w:pPr>
-            <w:r>
-              <w:t xml:space="preserve">0.8258</w:t>
-            </w:r>
-          </w:p>
-        </w:tc>
-        <w:tc>
-          <w:p>
-            <w:pPr>
-              <w:pStyle w:val="Compact"/>
-              <w:jc w:val="left"/>
-            </w:pPr>
-            <w:r>
-              <w:t xml:space="preserve">11,347</w:t>
+              <w:t xml:space="preserve">YFCC</w:t>
+            </w:r>
+          </w:p>
+        </w:tc>
+        <w:tc>
+          <w:p>
+            <w:pPr>
+              <w:pStyle w:val="Compact"/>
+              <w:jc w:val="left"/>
+            </w:pPr>
+            <w:r>
+              <w:t xml:space="preserve">CAGRA-Base</w:t>
+            </w:r>
+          </w:p>
+        </w:tc>
+        <w:tc>
+          <w:p>
+            <w:pPr>
+              <w:pStyle w:val="Compact"/>
+              <w:jc w:val="left"/>
+            </w:pPr>
+            <w:r>
+              <w:t xml:space="preserve">68.0</w:t>
+            </w:r>
+          </w:p>
+        </w:tc>
+        <w:tc>
+          <w:p>
+            <w:pPr>
+              <w:pStyle w:val="Compact"/>
+              <w:jc w:val="left"/>
+            </w:pPr>
+            <w:r>
+              <w:t xml:space="preserve">0.0</w:t>
+            </w:r>
+          </w:p>
+        </w:tc>
+        <w:tc>
+          <w:p>
+            <w:pPr>
+              <w:pStyle w:val="Compact"/>
+              <w:jc w:val="left"/>
+            </w:pPr>
+            <w:r>
+              <w:t xml:space="preserve">168.2</w:t>
+            </w:r>
+          </w:p>
+        </w:tc>
+        <w:tc>
+          <w:p>
+            <w:pPr>
+              <w:pStyle w:val="Compact"/>
+              <w:jc w:val="left"/>
+            </w:pPr>
+            <w:r>
+              <w:t xml:space="preserve">3,088.8</w:t>
+            </w:r>
+          </w:p>
+        </w:tc>
+        <w:tc>
+          <w:p>
+            <w:pPr>
+              <w:pStyle w:val="Compact"/>
+              <w:jc w:val="left"/>
+            </w:pPr>
+            <w:r>
+              <w:t xml:space="preserve">92.9</w:t>
+            </w:r>
+          </w:p>
+        </w:tc>
+        <w:tc>
+          <w:p>
+            <w:pPr>
+              <w:pStyle w:val="Compact"/>
+              <w:jc w:val="left"/>
+            </w:pPr>
+            <w:r>
+              <w:t xml:space="preserve">64</w:t>
+            </w:r>
+          </w:p>
+        </w:tc>
+        <w:tc>
+          <w:p>
+            <w:pPr>
+              <w:pStyle w:val="Compact"/>
+              <w:jc w:val="left"/>
+            </w:pPr>
+            <w:r>
+              <w:t xml:space="preserve">64</w:t>
+            </w:r>
+          </w:p>
+        </w:tc>
+        <w:tc>
+          <w:p>
+            <w:pPr>
+              <w:pStyle w:val="Compact"/>
+              <w:jc w:val="left"/>
+            </w:pPr>
+            <w:r>
+              <w:t xml:space="preserve">2,121</w:t>
+            </w:r>
+          </w:p>
+        </w:tc>
+        <w:tc>
+          <w:p>
+            <w:pPr>
+              <w:pStyle w:val="Compact"/>
+              <w:jc w:val="left"/>
+            </w:pPr>
+            <w:r>
+              <w:t xml:space="preserve">16</w:t>
             </w:r>
           </w:p>
         </w:tc>
@@ -4864,51 +5114,117 @@
               <w:jc w:val="left"/>
             </w:pPr>
             <w:r>
-              <w:t xml:space="preserve">512</w:t>
-            </w:r>
-          </w:p>
-        </w:tc>
-        <w:tc>
-          <w:p>
-            <w:pPr>
-              <w:pStyle w:val="Compact"/>
-              <w:jc w:val="left"/>
-            </w:pPr>
-            <w:r>
-              <w:t xml:space="preserve">2</w:t>
-            </w:r>
-          </w:p>
-        </w:tc>
-        <w:tc>
-          <w:p>
-            <w:pPr>
-              <w:pStyle w:val="Compact"/>
-              <w:jc w:val="left"/>
-            </w:pPr>
-            <w:r>
-              <w:t xml:space="preserve">1,044</w:t>
-            </w:r>
-          </w:p>
-        </w:tc>
-        <w:tc>
-          <w:p>
-            <w:pPr>
-              <w:pStyle w:val="Compact"/>
-              <w:jc w:val="left"/>
-            </w:pPr>
-            <w:r>
-              <w:t xml:space="preserve">0.8742</w:t>
-            </w:r>
-          </w:p>
-        </w:tc>
-        <w:tc>
-          <w:p>
-            <w:pPr>
-              <w:pStyle w:val="Compact"/>
-              <w:jc w:val="left"/>
-            </w:pPr>
-            <w:r>
-              <w:t xml:space="preserve">5,551</w:t>
+              <w:t xml:space="preserve">YFCC</w:t>
+            </w:r>
+          </w:p>
+        </w:tc>
+        <w:tc>
+          <w:p>
+            <w:pPr>
+              <w:pStyle w:val="Compact"/>
+              <w:jc w:val="left"/>
+            </w:pPr>
+            <w:r>
+              <w:t xml:space="preserve">CAGRA-Retain</w:t>
+            </w:r>
+          </w:p>
+        </w:tc>
+        <w:tc>
+          <w:p>
+            <w:pPr>
+              <w:pStyle w:val="Compact"/>
+              <w:jc w:val="left"/>
+            </w:pPr>
+            <w:r>
+              <w:t xml:space="preserve">68.0</w:t>
+            </w:r>
+          </w:p>
+        </w:tc>
+        <w:tc>
+          <w:p>
+            <w:pPr>
+              <w:pStyle w:val="Compact"/>
+              <w:jc w:val="left"/>
+            </w:pPr>
+            <w:r>
+              <w:t xml:space="preserve">0.0</w:t>
+            </w:r>
+          </w:p>
+        </w:tc>
+        <w:tc>
+          <w:p>
+            <w:pPr>
+              <w:pStyle w:val="Compact"/>
+              <w:jc w:val="left"/>
+            </w:pPr>
+            <w:r>
+              <w:t xml:space="preserve">2,206.7</w:t>
+            </w:r>
+          </w:p>
+        </w:tc>
+        <w:tc>
+          <w:p>
+            <w:pPr>
+              <w:pStyle w:val="Compact"/>
+              <w:jc w:val="left"/>
+            </w:pPr>
+            <w:r>
+              <w:t xml:space="preserve">3,088.8</w:t>
+            </w:r>
+          </w:p>
+        </w:tc>
+        <w:tc>
+          <w:p>
+            <w:pPr>
+              <w:pStyle w:val="Compact"/>
+              <w:jc w:val="left"/>
+            </w:pPr>
+            <w:r>
+              <w:t xml:space="preserve">92.9</w:t>
+            </w:r>
+          </w:p>
+        </w:tc>
+        <w:tc>
+          <w:p>
+            <w:pPr>
+              <w:pStyle w:val="Compact"/>
+              <w:jc w:val="left"/>
+            </w:pPr>
+            <w:r>
+              <w:t xml:space="preserve">64</w:t>
+            </w:r>
+          </w:p>
+        </w:tc>
+        <w:tc>
+          <w:p>
+            <w:pPr>
+              <w:pStyle w:val="Compact"/>
+              <w:jc w:val="left"/>
+            </w:pPr>
+            <w:r>
+              <w:t xml:space="preserve">64</w:t>
+            </w:r>
+          </w:p>
+        </w:tc>
+        <w:tc>
+          <w:p>
+            <w:pPr>
+              <w:pStyle w:val="Compact"/>
+              <w:jc w:val="left"/>
+            </w:pPr>
+            <w:r>
+              <w:t xml:space="preserve">2,205 (+84)</w:t>
+            </w:r>
+          </w:p>
+        </w:tc>
+        <w:tc>
+          <w:p>
+            <w:pPr>
+              <w:pStyle w:val="Compact"/>
+              <w:jc w:val="left"/>
+            </w:pPr>
+            <w:r>
+              <w:t xml:space="preserve">16</w:t>
             </w:r>
           </w:p>
         </w:tc>
@@ -4921,51 +5237,486 @@
               <w:jc w:val="left"/>
             </w:pPr>
             <w:r>
-              <w:t xml:space="preserve">512</w:t>
-            </w:r>
-          </w:p>
-        </w:tc>
-        <w:tc>
-          <w:p>
-            <w:pPr>
-              <w:pStyle w:val="Compact"/>
-              <w:jc w:val="left"/>
-            </w:pPr>
-            <w:r>
-              <w:t xml:space="preserve">2</w:t>
-            </w:r>
-          </w:p>
-        </w:tc>
-        <w:tc>
-          <w:p>
-            <w:pPr>
-              <w:pStyle w:val="Compact"/>
-              <w:jc w:val="left"/>
-            </w:pPr>
-            <w:r>
-              <w:t xml:space="preserve">2,088</w:t>
-            </w:r>
-          </w:p>
-        </w:tc>
-        <w:tc>
-          <w:p>
-            <w:pPr>
-              <w:pStyle w:val="Compact"/>
-              <w:jc w:val="left"/>
-            </w:pPr>
-            <w:r>
-              <w:t xml:space="preserve">0.9123</w:t>
-            </w:r>
-          </w:p>
-        </w:tc>
-        <w:tc>
-          <w:p>
-            <w:pPr>
-              <w:pStyle w:val="Compact"/>
-              <w:jc w:val="left"/>
-            </w:pPr>
-            <w:r>
-              <w:t xml:space="preserve">2,783</w:t>
+              <w:t xml:space="preserve">YFCC</w:t>
+            </w:r>
+          </w:p>
+        </w:tc>
+        <w:tc>
+          <w:p>
+            <w:pPr>
+              <w:pStyle w:val="Compact"/>
+              <w:jc w:val="left"/>
+            </w:pPr>
+            <w:r>
+              <w:t xml:space="preserve">CAGRA-NaviX</w:t>
+            </w:r>
+          </w:p>
+        </w:tc>
+        <w:tc>
+          <w:p>
+            <w:pPr>
+              <w:pStyle w:val="Compact"/>
+              <w:jc w:val="left"/>
+            </w:pPr>
+            <w:r>
+              <w:t xml:space="preserve">3,228.1</w:t>
+            </w:r>
+          </w:p>
+        </w:tc>
+        <w:tc>
+          <w:p>
+            <w:pPr>
+              <w:pStyle w:val="Compact"/>
+              <w:jc w:val="left"/>
+            </w:pPr>
+            <w:r>
+              <w:t xml:space="preserve">6,570.6</w:t>
+            </w:r>
+          </w:p>
+        </w:tc>
+        <w:tc>
+          <w:p>
+            <w:pPr>
+              <w:pStyle w:val="Compact"/>
+              <w:jc w:val="left"/>
+            </w:pPr>
+            <w:r>
+              <w:t xml:space="preserve">206,596.7</w:t>
+            </w:r>
+          </w:p>
+        </w:tc>
+        <w:tc>
+          <w:p>
+            <w:pPr>
+              <w:pStyle w:val="Compact"/>
+              <w:jc w:val="left"/>
+            </w:pPr>
+            <w:r>
+              <w:t xml:space="preserve">2,224.3</w:t>
+            </w:r>
+          </w:p>
+        </w:tc>
+        <w:tc>
+          <w:p>
+            <w:pPr>
+              <w:pStyle w:val="Compact"/>
+              <w:jc w:val="left"/>
+            </w:pPr>
+            <w:r>
+              <w:t xml:space="preserve">1,093.3</w:t>
+            </w:r>
+          </w:p>
+        </w:tc>
+        <w:tc>
+          <w:p>
+            <w:pPr>
+              <w:pStyle w:val="Compact"/>
+              <w:jc w:val="left"/>
+            </w:pPr>
+            <w:r>
+              <w:t xml:space="preserve">64</w:t>
+            </w:r>
+          </w:p>
+        </w:tc>
+        <w:tc>
+          <w:p>
+            <w:pPr>
+              <w:pStyle w:val="Compact"/>
+              <w:jc w:val="left"/>
+            </w:pPr>
+            <w:r>
+              <w:t xml:space="preserve">63</w:t>
+            </w:r>
+          </w:p>
+        </w:tc>
+        <w:tc>
+          <w:p>
+            <w:pPr>
+              <w:pStyle w:val="Compact"/>
+              <w:jc w:val="left"/>
+            </w:pPr>
+            <w:r>
+              <w:t xml:space="preserve">2,388 (+267)</w:t>
+            </w:r>
+          </w:p>
+        </w:tc>
+        <w:tc>
+          <w:p>
+            <w:pPr>
+              <w:pStyle w:val="Compact"/>
+              <w:jc w:val="left"/>
+            </w:pPr>
+            <w:r>
+              <w:t xml:space="preserve">16</w:t>
+            </w:r>
+          </w:p>
+        </w:tc>
+      </w:tr>
+      <w:tr>
+        <w:tc>
+          <w:p>
+            <w:pPr>
+              <w:pStyle w:val="Compact"/>
+              <w:jc w:val="left"/>
+            </w:pPr>
+            <w:r>
+              <w:t xml:space="preserve">EMIS</w:t>
+            </w:r>
+          </w:p>
+        </w:tc>
+        <w:tc>
+          <w:p>
+            <w:pPr>
+              <w:pStyle w:val="Compact"/>
+              <w:jc w:val="left"/>
+            </w:pPr>
+            <w:r>
+              <w:t xml:space="preserve">CAGRA-Base</w:t>
+            </w:r>
+          </w:p>
+        </w:tc>
+        <w:tc>
+          <w:p>
+            <w:pPr>
+              <w:pStyle w:val="Compact"/>
+              <w:jc w:val="left"/>
+            </w:pPr>
+            <w:r>
+              <w:t xml:space="preserve">67.9</w:t>
+            </w:r>
+          </w:p>
+        </w:tc>
+        <w:tc>
+          <w:p>
+            <w:pPr>
+              <w:pStyle w:val="Compact"/>
+              <w:jc w:val="left"/>
+            </w:pPr>
+            <w:r>
+              <w:t xml:space="preserve">0.0</w:t>
+            </w:r>
+          </w:p>
+        </w:tc>
+        <w:tc>
+          <w:p>
+            <w:pPr>
+              <w:pStyle w:val="Compact"/>
+              <w:jc w:val="left"/>
+            </w:pPr>
+            <w:r>
+              <w:t xml:space="preserve">145.1</w:t>
+            </w:r>
+          </w:p>
+        </w:tc>
+        <w:tc>
+          <w:p>
+            <w:pPr>
+              <w:pStyle w:val="Compact"/>
+              <w:jc w:val="left"/>
+            </w:pPr>
+            <w:r>
+              <w:t xml:space="preserve">1,223.7</w:t>
+            </w:r>
+          </w:p>
+        </w:tc>
+        <w:tc>
+          <w:p>
+            <w:pPr>
+              <w:pStyle w:val="Compact"/>
+              <w:jc w:val="left"/>
+            </w:pPr>
+            <w:r>
+              <w:t xml:space="preserve">215.8</w:t>
+            </w:r>
+          </w:p>
+        </w:tc>
+        <w:tc>
+          <w:p>
+            <w:pPr>
+              <w:pStyle w:val="Compact"/>
+              <w:jc w:val="left"/>
+            </w:pPr>
+            <w:r>
+              <w:t xml:space="preserve">256</w:t>
+            </w:r>
+          </w:p>
+        </w:tc>
+        <w:tc>
+          <w:p>
+            <w:pPr>
+              <w:pStyle w:val="Compact"/>
+              <w:jc w:val="left"/>
+            </w:pPr>
+            <w:r>
+              <w:t xml:space="preserve">64</w:t>
+            </w:r>
+          </w:p>
+        </w:tc>
+        <w:tc>
+          <w:p>
+            <w:pPr>
+              <w:pStyle w:val="Compact"/>
+              <w:jc w:val="left"/>
+            </w:pPr>
+            <w:r>
+              <w:t xml:space="preserve">17,225</w:t>
+            </w:r>
+          </w:p>
+        </w:tc>
+        <w:tc>
+          <w:p>
+            <w:pPr>
+              <w:pStyle w:val="Compact"/>
+              <w:jc w:val="left"/>
+            </w:pPr>
+            <w:r>
+              <w:t xml:space="preserve">4</w:t>
+            </w:r>
+          </w:p>
+        </w:tc>
+      </w:tr>
+      <w:tr>
+        <w:tc>
+          <w:p>
+            <w:pPr>
+              <w:pStyle w:val="Compact"/>
+              <w:jc w:val="left"/>
+            </w:pPr>
+            <w:r>
+              <w:t xml:space="preserve">EMIS</w:t>
+            </w:r>
+          </w:p>
+        </w:tc>
+        <w:tc>
+          <w:p>
+            <w:pPr>
+              <w:pStyle w:val="Compact"/>
+              <w:jc w:val="left"/>
+            </w:pPr>
+            <w:r>
+              <w:t xml:space="preserve">CAGRA-Retain</w:t>
+            </w:r>
+          </w:p>
+        </w:tc>
+        <w:tc>
+          <w:p>
+            <w:pPr>
+              <w:pStyle w:val="Compact"/>
+              <w:jc w:val="left"/>
+            </w:pPr>
+            <w:r>
+              <w:t xml:space="preserve">67.9</w:t>
+            </w:r>
+          </w:p>
+        </w:tc>
+        <w:tc>
+          <w:p>
+            <w:pPr>
+              <w:pStyle w:val="Compact"/>
+              <w:jc w:val="left"/>
+            </w:pPr>
+            <w:r>
+              <w:t xml:space="preserve">0.0</w:t>
+            </w:r>
+          </w:p>
+        </w:tc>
+        <w:tc>
+          <w:p>
+            <w:pPr>
+              <w:pStyle w:val="Compact"/>
+              <w:jc w:val="left"/>
+            </w:pPr>
+            <w:r>
+              <w:t xml:space="preserve">866.3</w:t>
+            </w:r>
+          </w:p>
+        </w:tc>
+        <w:tc>
+          <w:p>
+            <w:pPr>
+              <w:pStyle w:val="Compact"/>
+              <w:jc w:val="left"/>
+            </w:pPr>
+            <w:r>
+              <w:t xml:space="preserve">1,223.7</w:t>
+            </w:r>
+          </w:p>
+        </w:tc>
+        <w:tc>
+          <w:p>
+            <w:pPr>
+              <w:pStyle w:val="Compact"/>
+              <w:jc w:val="left"/>
+            </w:pPr>
+            <w:r>
+              <w:t xml:space="preserve">215.8</w:t>
+            </w:r>
+          </w:p>
+        </w:tc>
+        <w:tc>
+          <w:p>
+            <w:pPr>
+              <w:pStyle w:val="Compact"/>
+              <w:jc w:val="left"/>
+            </w:pPr>
+            <w:r>
+              <w:t xml:space="preserve">256</w:t>
+            </w:r>
+          </w:p>
+        </w:tc>
+        <w:tc>
+          <w:p>
+            <w:pPr>
+              <w:pStyle w:val="Compact"/>
+              <w:jc w:val="left"/>
+            </w:pPr>
+            <w:r>
+              <w:t xml:space="preserve">64</w:t>
+            </w:r>
+          </w:p>
+        </w:tc>
+        <w:tc>
+          <w:p>
+            <w:pPr>
+              <w:pStyle w:val="Compact"/>
+              <w:jc w:val="left"/>
+            </w:pPr>
+            <w:r>
+              <w:t xml:space="preserve">17,309 (+84)</w:t>
+            </w:r>
+          </w:p>
+        </w:tc>
+        <w:tc>
+          <w:p>
+            <w:pPr>
+              <w:pStyle w:val="Compact"/>
+              <w:jc w:val="left"/>
+            </w:pPr>
+            <w:r>
+              <w:t xml:space="preserve">4</w:t>
+            </w:r>
+          </w:p>
+        </w:tc>
+      </w:tr>
+      <w:tr>
+        <w:tc>
+          <w:p>
+            <w:pPr>
+              <w:pStyle w:val="Compact"/>
+              <w:jc w:val="left"/>
+            </w:pPr>
+            <w:r>
+              <w:t xml:space="preserve">EMIS</w:t>
+            </w:r>
+          </w:p>
+        </w:tc>
+        <w:tc>
+          <w:p>
+            <w:pPr>
+              <w:pStyle w:val="Compact"/>
+              <w:jc w:val="left"/>
+            </w:pPr>
+            <w:r>
+              <w:t xml:space="preserve">CAGRA-NaviX</w:t>
+            </w:r>
+          </w:p>
+        </w:tc>
+        <w:tc>
+          <w:p>
+            <w:pPr>
+              <w:pStyle w:val="Compact"/>
+              <w:jc w:val="left"/>
+            </w:pPr>
+            <w:r>
+              <w:t xml:space="preserve">662.5</w:t>
+            </w:r>
+          </w:p>
+        </w:tc>
+        <w:tc>
+          <w:p>
+            <w:pPr>
+              <w:pStyle w:val="Compact"/>
+              <w:jc w:val="left"/>
+            </w:pPr>
+            <w:r>
+              <w:t xml:space="preserve">33.2</w:t>
+            </w:r>
+          </w:p>
+        </w:tc>
+        <w:tc>
+          <w:p>
+            <w:pPr>
+              <w:pStyle w:val="Compact"/>
+              <w:jc w:val="left"/>
+            </w:pPr>
+            <w:r>
+              <w:t xml:space="preserve">21,198.8</w:t>
+            </w:r>
+          </w:p>
+        </w:tc>
+        <w:tc>
+          <w:p>
+            <w:pPr>
+              <w:pStyle w:val="Compact"/>
+              <w:jc w:val="left"/>
+            </w:pPr>
+            <w:r>
+              <w:t xml:space="preserve">1,556.5</w:t>
+            </w:r>
+          </w:p>
+        </w:tc>
+        <w:tc>
+          <w:p>
+            <w:pPr>
+              <w:pStyle w:val="Compact"/>
+              <w:jc w:val="left"/>
+            </w:pPr>
+            <w:r>
+              <w:t xml:space="preserve">1,033.0</w:t>
+            </w:r>
+          </w:p>
+        </w:tc>
+        <w:tc>
+          <w:p>
+            <w:pPr>
+              <w:pStyle w:val="Compact"/>
+              <w:jc w:val="left"/>
+            </w:pPr>
+            <w:r>
+              <w:t xml:space="preserve">256</w:t>
+            </w:r>
+          </w:p>
+        </w:tc>
+        <w:tc>
+          <w:p>
+            <w:pPr>
+              <w:pStyle w:val="Compact"/>
+              <w:jc w:val="left"/>
+            </w:pPr>
+            <w:r>
+              <w:t xml:space="preserve">64</w:t>
+            </w:r>
+          </w:p>
+        </w:tc>
+        <w:tc>
+          <w:p>
+            <w:pPr>
+              <w:pStyle w:val="Compact"/>
+              <w:jc w:val="left"/>
+            </w:pPr>
+            <w:r>
+              <w:t xml:space="preserve">17,364 (+139)</w:t>
+            </w:r>
+          </w:p>
+        </w:tc>
+        <w:tc>
+          <w:p>
+            <w:pPr>
+              <w:pStyle w:val="Compact"/>
+              <w:jc w:val="left"/>
+            </w:pPr>
+            <w:r>
+              <w:t xml:space="preserve">4</w:t>
             </w:r>
           </w:p>
         </w:tc>
@@ -4976,6 +5727,419 @@
         <w:pStyle w:val="BodyText"/>
       </w:pPr>
       <w:r>
+        <w:t xml:space="preserve">The table validates the implementation story directly. Base and Retain read identical graph rows,</w:t>
+      </w:r>
+      <w:r>
+        <w:t xml:space="preserve"> </w:t>
+      </w:r>
+      <w:r>
+        <w:t xml:space="preserve">compute identical distance vectors, admit identical legal candidates, use the same register count,</w:t>
+      </w:r>
+      <w:r>
+        <w:t xml:space="preserve"> </w:t>
+      </w:r>
+      <w:r>
+        <w:t xml:space="preserve">and retain the same active-CTA ceiling. Retain's only shared-memory increment is its 84-byte</w:t>
+      </w:r>
+      <w:r>
+        <w:t xml:space="preserve"> </w:t>
+      </w:r>
+      <w:r>
+        <w:t xml:space="preserve">bounded top-</w:t>
+      </w:r>
+      <w:r>
+        <w:rPr>
+          <w:rStyle w:val="VerbatimChar"/>
+        </w:rPr>
+        <w:t xml:space="preserve">k</w:t>
+      </w:r>
+      <w:r>
+        <w:t xml:space="preserve"> </w:t>
+      </w:r>
+      <w:r>
+        <w:t xml:space="preserve">result state; its additional predicate and accumulator instructions do not modify</w:t>
+      </w:r>
+      <w:r>
+        <w:t xml:space="preserve"> </w:t>
+      </w:r>
+      <w:r>
+        <w:t xml:space="preserve">navigation. NaviX likewise does not lose the resource-limited active-CTA ceiling.</w:t>
+      </w:r>
+    </w:p>
+    <w:p>
+      <w:pPr>
+        <w:pStyle w:val="BodyText"/>
+      </w:pPr>
+      <w:r>
+        <w:t xml:space="preserve">NaviX's cost is instead highly workload-dependent dynamic work. On YFCC it reads 4.87 times as</w:t>
+      </w:r>
+      <w:r>
+        <w:t xml:space="preserve"> </w:t>
+      </w:r>
+      <w:r>
+        <w:t xml:space="preserve">many graph rows and performs 9.75 times as many traversal predicate probes as on EMIS, but admits</w:t>
+      </w:r>
+      <w:r>
+        <w:t xml:space="preserve"> </w:t>
+      </w:r>
+      <w:r>
+        <w:t xml:space="preserve">only 1.06 times as many legal children. Its legal-admission yield is 0.529% per probe on YFCC</w:t>
+      </w:r>
+      <w:r>
+        <w:t xml:space="preserve"> </w:t>
+      </w:r>
+      <w:r>
+        <w:t xml:space="preserve">versus 4.873% on EMIS, a 9.2-times difference. It even performs fewer vector-distance evaluations</w:t>
+      </w:r>
+      <w:r>
+        <w:t xml:space="preserve"> </w:t>
+      </w:r>
+      <w:r>
+        <w:t xml:space="preserve">than Base on YFCC. Sparse two-hop graph-ID inspection and bitmap testing—not distance arithmetic,</w:t>
+      </w:r>
+      <w:r>
+        <w:t xml:space="preserve"> </w:t>
+      </w:r>
+      <w:r>
+        <w:t xml:space="preserve">register pressure, shared-memory occupancy, or an idle traversal—therefore explain the YFCC cost.</w:t>
+      </w:r>
+      <w:r>
+        <w:t xml:space="preserve"> </w:t>
+      </w:r>
+      <w:r>
+        <w:t xml:space="preserve">At this representative point, recalls are 0.3331/0.5266/0.7257 for Base/Retain/NaviX on YFCC and</w:t>
+      </w:r>
+      <w:r>
+        <w:t xml:space="preserve"> </w:t>
+      </w:r>
+      <w:r>
+        <w:t xml:space="preserve">0.3727/0.5393/0.9672 on EMIS.</w:t>
+      </w:r>
+    </w:p>
+    <w:p>
+      <w:pPr>
+        <w:pStyle w:val="Heading2"/>
+      </w:pPr>
+      <w:bookmarkStart w:id="36" w:name="Xb4960ff45d3cfabb7ab747d0ecaa5a3c77ef423"/>
+      <w:r>
+        <w:t xml:space="preserve">Retention diagnostic and deeper YFCC search</w:t>
+      </w:r>
+      <w:bookmarkEnd w:id="36"/>
+    </w:p>
+    <w:p>
+      <w:pPr>
+        <w:pStyle w:val="FirstParagraph"/>
+      </w:pPr>
+      <w:r>
+        <w:t xml:space="preserve">On the same-G64 frozen 1,000-query YFCC diagnostic at =L=512, =W=2, B0, Base evaluates 71.86% of</w:t>
+      </w:r>
+      <w:r>
+        <w:t xml:space="preserve"> </w:t>
+      </w:r>
+      <w:r>
+        <w:t xml:space="preserve">exact neighbors but returns only 54.16%. Retain returns the full 71.86% seen set with identical</w:t>
+      </w:r>
+      <w:r>
+        <w:t xml:space="preserve"> </w:t>
+      </w:r>
+      <w:r>
+        <w:t xml:space="preserve">mean graph work (15,241.607 distance evaluations/query). This directly</w:t>
+      </w:r>
+      <w:r>
+        <w:t xml:space="preserve"> </w:t>
+      </w:r>
+      <w:r>
+        <w:t xml:space="preserve">identifies bounded fused-frontier selection as a real loss mechanism.</w:t>
+      </w:r>
+    </w:p>
+    <w:p>
+      <w:pPr>
+        <w:pStyle w:val="BodyText"/>
+      </w:pPr>
+      <w:r>
+        <w:t xml:space="preserve">Deeper continuous Retain search shows the remaining gap is exploration work rather than an</w:t>
+      </w:r>
+      <w:r>
+        <w:t xml:space="preserve"> </w:t>
+      </w:r>
+      <w:r>
+        <w:t xml:space="preserve">incorrect accumulator:</w:t>
+      </w:r>
+    </w:p>
+    <w:tbl>
+      <w:tblPr>
+        <w:tblStyle w:val="Table"/>
+        <w:tblW w:type="pct" w:w="0.0"/>
+        <w:tblLook w:firstRow="1"/>
+      </w:tblPr>
+      <w:tblGrid/>
+      <w:tr>
+        <w:trPr>
+          <w:cnfStyle w:firstRow="1"/>
+        </w:trPr>
+        <w:tc>
+          <w:tcPr>
+            <w:tcBorders>
+              <w:bottom w:val="single"/>
+            </w:tcBorders>
+            <w:vAlign w:val="bottom"/>
+          </w:tcPr>
+          <w:p>
+            <w:pPr>
+              <w:pStyle w:val="Compact"/>
+              <w:jc w:val="left"/>
+            </w:pPr>
+            <w:r>
+              <w:t xml:space="preserve">L</w:t>
+            </w:r>
+          </w:p>
+        </w:tc>
+        <w:tc>
+          <w:tcPr>
+            <w:tcBorders>
+              <w:bottom w:val="single"/>
+            </w:tcBorders>
+            <w:vAlign w:val="bottom"/>
+          </w:tcPr>
+          <w:p>
+            <w:pPr>
+              <w:pStyle w:val="Compact"/>
+              <w:jc w:val="left"/>
+            </w:pPr>
+            <w:r>
+              <w:t xml:space="preserve">W</w:t>
+            </w:r>
+          </w:p>
+        </w:tc>
+        <w:tc>
+          <w:tcPr>
+            <w:tcBorders>
+              <w:bottom w:val="single"/>
+            </w:tcBorders>
+            <w:vAlign w:val="bottom"/>
+          </w:tcPr>
+          <w:p>
+            <w:pPr>
+              <w:pStyle w:val="Compact"/>
+              <w:jc w:val="left"/>
+            </w:pPr>
+            <w:r>
+              <w:t xml:space="preserve">Explicit max iterations</w:t>
+            </w:r>
+          </w:p>
+        </w:tc>
+        <w:tc>
+          <w:tcPr>
+            <w:tcBorders>
+              <w:bottom w:val="single"/>
+            </w:tcBorders>
+            <w:vAlign w:val="bottom"/>
+          </w:tcPr>
+          <w:p>
+            <w:pPr>
+              <w:pStyle w:val="Compact"/>
+              <w:jc w:val="left"/>
+            </w:pPr>
+            <w:r>
+              <w:t xml:space="preserve">Recall@10</w:t>
+            </w:r>
+          </w:p>
+        </w:tc>
+        <w:tc>
+          <w:tcPr>
+            <w:tcBorders>
+              <w:bottom w:val="single"/>
+            </w:tcBorders>
+            <w:vAlign w:val="bottom"/>
+          </w:tcPr>
+          <w:p>
+            <w:pPr>
+              <w:pStyle w:val="Compact"/>
+              <w:jc w:val="left"/>
+            </w:pPr>
+            <w:r>
+              <w:t xml:space="preserve">Median QPS</w:t>
+            </w:r>
+          </w:p>
+        </w:tc>
+      </w:tr>
+      <w:tr>
+        <w:tc>
+          <w:p>
+            <w:pPr>
+              <w:pStyle w:val="Compact"/>
+              <w:jc w:val="left"/>
+            </w:pPr>
+            <w:r>
+              <w:t xml:space="preserve">512</w:t>
+            </w:r>
+          </w:p>
+        </w:tc>
+        <w:tc>
+          <w:p>
+            <w:pPr>
+              <w:pStyle w:val="Compact"/>
+              <w:jc w:val="left"/>
+            </w:pPr>
+            <w:r>
+              <w:t xml:space="preserve">2</w:t>
+            </w:r>
+          </w:p>
+        </w:tc>
+        <w:tc>
+          <w:p>
+            <w:pPr>
+              <w:pStyle w:val="Compact"/>
+              <w:jc w:val="left"/>
+            </w:pPr>
+            <w:r>
+              <w:t xml:space="preserve">522</w:t>
+            </w:r>
+          </w:p>
+        </w:tc>
+        <w:tc>
+          <w:p>
+            <w:pPr>
+              <w:pStyle w:val="Compact"/>
+              <w:jc w:val="left"/>
+            </w:pPr>
+            <w:r>
+              <w:t xml:space="preserve">0.8258</w:t>
+            </w:r>
+          </w:p>
+        </w:tc>
+        <w:tc>
+          <w:p>
+            <w:pPr>
+              <w:pStyle w:val="Compact"/>
+              <w:jc w:val="left"/>
+            </w:pPr>
+            <w:r>
+              <w:t xml:space="preserve">11,347</w:t>
+            </w:r>
+          </w:p>
+        </w:tc>
+      </w:tr>
+      <w:tr>
+        <w:tc>
+          <w:p>
+            <w:pPr>
+              <w:pStyle w:val="Compact"/>
+              <w:jc w:val="left"/>
+            </w:pPr>
+            <w:r>
+              <w:t xml:space="preserve">512</w:t>
+            </w:r>
+          </w:p>
+        </w:tc>
+        <w:tc>
+          <w:p>
+            <w:pPr>
+              <w:pStyle w:val="Compact"/>
+              <w:jc w:val="left"/>
+            </w:pPr>
+            <w:r>
+              <w:t xml:space="preserve">2</w:t>
+            </w:r>
+          </w:p>
+        </w:tc>
+        <w:tc>
+          <w:p>
+            <w:pPr>
+              <w:pStyle w:val="Compact"/>
+              <w:jc w:val="left"/>
+            </w:pPr>
+            <w:r>
+              <w:t xml:space="preserve">1,044</w:t>
+            </w:r>
+          </w:p>
+        </w:tc>
+        <w:tc>
+          <w:p>
+            <w:pPr>
+              <w:pStyle w:val="Compact"/>
+              <w:jc w:val="left"/>
+            </w:pPr>
+            <w:r>
+              <w:t xml:space="preserve">0.8742</w:t>
+            </w:r>
+          </w:p>
+        </w:tc>
+        <w:tc>
+          <w:p>
+            <w:pPr>
+              <w:pStyle w:val="Compact"/>
+              <w:jc w:val="left"/>
+            </w:pPr>
+            <w:r>
+              <w:t xml:space="preserve">5,551</w:t>
+            </w:r>
+          </w:p>
+        </w:tc>
+      </w:tr>
+      <w:tr>
+        <w:tc>
+          <w:p>
+            <w:pPr>
+              <w:pStyle w:val="Compact"/>
+              <w:jc w:val="left"/>
+            </w:pPr>
+            <w:r>
+              <w:t xml:space="preserve">512</w:t>
+            </w:r>
+          </w:p>
+        </w:tc>
+        <w:tc>
+          <w:p>
+            <w:pPr>
+              <w:pStyle w:val="Compact"/>
+              <w:jc w:val="left"/>
+            </w:pPr>
+            <w:r>
+              <w:t xml:space="preserve">2</w:t>
+            </w:r>
+          </w:p>
+        </w:tc>
+        <w:tc>
+          <w:p>
+            <w:pPr>
+              <w:pStyle w:val="Compact"/>
+              <w:jc w:val="left"/>
+            </w:pPr>
+            <w:r>
+              <w:t xml:space="preserve">2,088</w:t>
+            </w:r>
+          </w:p>
+        </w:tc>
+        <w:tc>
+          <w:p>
+            <w:pPr>
+              <w:pStyle w:val="Compact"/>
+              <w:jc w:val="left"/>
+            </w:pPr>
+            <w:r>
+              <w:t xml:space="preserve">0.9123</w:t>
+            </w:r>
+          </w:p>
+        </w:tc>
+        <w:tc>
+          <w:p>
+            <w:pPr>
+              <w:pStyle w:val="Compact"/>
+              <w:jc w:val="left"/>
+            </w:pPr>
+            <w:r>
+              <w:t xml:space="preserve">2,783</w:t>
+            </w:r>
+          </w:p>
+        </w:tc>
+      </w:tr>
+    </w:tbl>
+    <w:p>
+      <w:pPr>
+        <w:pStyle w:val="BodyText"/>
+      </w:pPr>
+      <w:r>
         <w:t xml:space="preserve">The first measured =L=512, =W=2 point above 0.9 is 2,088 iterations. This is evidence that high</w:t>
       </w:r>
       <w:r>
@@ -4995,11 +6159,11 @@
       <w:pPr>
         <w:pStyle w:val="Heading2"/>
       </w:pPr>
-      <w:bookmarkStart w:id="36" w:name="matched-seed-ablation"/>
+      <w:bookmarkStart w:id="37" w:name="matched-seed-ablation"/>
       <w:r>
         <w:t xml:space="preserve">Matched-seed ablation</w:t>
       </w:r>
-      <w:bookmarkEnd w:id="36"/>
+      <w:bookmarkEnd w:id="37"/>
     </w:p>
     <w:p>
       <w:pPr>
@@ -5008,7 +6172,7 @@
       <w:r>
         <w:drawing>
           <wp:inline>
-            <wp:extent cx="5334000" cy="1678974"/>
+            <wp:extent cx="5334000" cy="1439383"/>
             <wp:effectExtent b="0" l="0" r="0" t="0"/>
             <wp:docPr descr="" title="" id="1" name="Picture"/>
             <a:graphic>
@@ -5021,7 +6185,7 @@
                     </pic:cNvPicPr>
                   </pic:nvPicPr>
                   <pic:blipFill>
-                    <a:blip r:embed="rId37"/>
+                    <a:blip r:embed="rId38"/>
                     <a:stretch>
                       <a:fillRect/>
                     </a:stretch>
@@ -5029,7 +6193,7 @@
                   <pic:spPr bwMode="auto">
                     <a:xfrm>
                       <a:off x="0" y="0"/>
-                      <a:ext cx="5334000" cy="1678974"/>
+                      <a:ext cx="5334000" cy="1439383"/>
                     </a:xfrm>
                     <a:prstGeom prst="rect">
                       <a:avLst/>
@@ -5078,11 +6242,11 @@
       <w:pPr>
         <w:pStyle w:val="Heading2"/>
       </w:pPr>
-      <w:bookmarkStart w:id="38" w:name="exact-resident-bitmap-control"/>
+      <w:bookmarkStart w:id="39" w:name="exact-resident-bitmap-control"/>
       <w:r>
         <w:t xml:space="preserve">Exact resident-bitmap control</w:t>
       </w:r>
-      <w:bookmarkEnd w:id="38"/>
+      <w:bookmarkEnd w:id="39"/>
     </w:p>
     <w:tbl>
       <w:tblPr>
@@ -5513,11 +6677,11 @@
       <w:pPr>
         <w:pStyle w:val="Heading2"/>
       </w:pPr>
-      <w:bookmarkStart w:id="39" w:name="native-cpu-context"/>
+      <w:bookmarkStart w:id="40" w:name="native-cpu-context"/>
       <w:r>
         <w:t xml:space="preserve">Native CPU context</w:t>
       </w:r>
-      <w:bookmarkEnd w:id="39"/>
+      <w:bookmarkEnd w:id="40"/>
     </w:p>
     <w:p>
       <w:pPr>
@@ -5526,7 +6690,7 @@
       <w:r>
         <w:drawing>
           <wp:inline>
-            <wp:extent cx="5334000" cy="1675637"/>
+            <wp:extent cx="5334000" cy="1436199"/>
             <wp:effectExtent b="0" l="0" r="0" t="0"/>
             <wp:docPr descr="" title="" id="1" name="Picture"/>
             <a:graphic>
@@ -5539,7 +6703,7 @@
                     </pic:cNvPicPr>
                   </pic:nvPicPr>
                   <pic:blipFill>
-                    <a:blip r:embed="rId40"/>
+                    <a:blip r:embed="rId41"/>
                     <a:stretch>
                       <a:fillRect/>
                     </a:stretch>
@@ -5547,7 +6711,7 @@
                   <pic:spPr bwMode="auto">
                     <a:xfrm>
                       <a:off x="0" y="0"/>
-                      <a:ext cx="5334000" cy="1675637"/>
+                      <a:ext cx="5334000" cy="1436199"/>
                     </a:xfrm>
                     <a:prstGeom prst="rect">
                       <a:avLst/>
@@ -5863,21 +7027,21 @@
       <w:pPr>
         <w:pStyle w:val="Heading1"/>
       </w:pPr>
-      <w:bookmarkStart w:id="41" w:name="interpretation"/>
+      <w:bookmarkStart w:id="42" w:name="interpretation"/>
       <w:r>
         <w:t xml:space="preserve">Interpretation</w:t>
       </w:r>
-      <w:bookmarkEnd w:id="41"/>
+      <w:bookmarkEnd w:id="42"/>
     </w:p>
     <w:p>
       <w:pPr>
         <w:pStyle w:val="Heading2"/>
       </w:pPr>
-      <w:bookmarkStart w:id="42" w:name="why-the-accumulator-helps"/>
+      <w:bookmarkStart w:id="43" w:name="why-the-accumulator-helps"/>
       <w:r>
         <w:t xml:space="preserve">Why the accumulator helps</w:t>
       </w:r>
-      <w:bookmarkEnd w:id="42"/>
+      <w:bookmarkEnd w:id="43"/>
     </w:p>
     <w:p>
       <w:pPr>
@@ -5924,11 +7088,11 @@
       <w:pPr>
         <w:pStyle w:val="Heading2"/>
       </w:pPr>
-      <w:bookmarkStart w:id="43" w:name="why-emis-is-hard-and-navix-succeeds"/>
+      <w:bookmarkStart w:id="44" w:name="why-emis-is-hard-and-navix-succeeds"/>
       <w:r>
         <w:t xml:space="preserve">Why EMIS is hard and NaviX succeeds</w:t>
       </w:r>
-      <w:bookmarkEnd w:id="43"/>
+      <w:bookmarkEnd w:id="44"/>
     </w:p>
     <w:p>
       <w:pPr>
@@ -5960,11 +7124,11 @@
       <w:pPr>
         <w:pStyle w:val="Heading2"/>
       </w:pPr>
-      <w:bookmarkStart w:id="44" w:name="why-yfcc-remains-hard"/>
+      <w:bookmarkStart w:id="45" w:name="why-yfcc-remains-hard"/>
       <w:r>
         <w:t xml:space="preserve">Why YFCC remains hard</w:t>
       </w:r>
-      <w:bookmarkEnd w:id="44"/>
+      <w:bookmarkEnd w:id="45"/>
     </w:p>
     <w:p>
       <w:pPr>
@@ -6014,11 +7178,11 @@
       <w:pPr>
         <w:pStyle w:val="Heading1"/>
       </w:pPr>
-      <w:bookmarkStart w:id="45" w:name="limitations"/>
+      <w:bookmarkStart w:id="46" w:name="limitations"/>
       <w:r>
         <w:t xml:space="preserve">Limitations</w:t>
       </w:r>
-      <w:bookmarkEnd w:id="45"/>
+      <w:bookmarkEnd w:id="46"/>
     </w:p>
     <w:p>
       <w:pPr>
@@ -6135,11 +7299,11 @@
       <w:pPr>
         <w:pStyle w:val="Heading1"/>
       </w:pPr>
-      <w:bookmarkStart w:id="46" w:name="reproduction"/>
+      <w:bookmarkStart w:id="47" w:name="reproduction"/>
       <w:r>
         <w:t xml:space="preserve">Reproduction</w:t>
       </w:r>
-      <w:bookmarkEnd w:id="46"/>
+      <w:bookmarkEnd w:id="47"/>
     </w:p>
     <w:p>
       <w:pPr>
@@ -6171,11 +7335,11 @@
       <w:pPr>
         <w:pStyle w:val="Heading2"/>
       </w:pPr>
-      <w:bookmarkStart w:id="47" w:name="static-gates"/>
+      <w:bookmarkStart w:id="48" w:name="static-gates"/>
       <w:r>
         <w:t xml:space="preserve">Static gates</w:t>
       </w:r>
-      <w:bookmarkEnd w:id="47"/>
+      <w:bookmarkEnd w:id="48"/>
     </w:p>
     <w:p>
       <w:pPr>
@@ -6306,11 +7470,11 @@
       <w:pPr>
         <w:pStyle w:val="Heading2"/>
       </w:pPr>
-      <w:bookmarkStart w:id="48" w:name="gpu-graph-run"/>
+      <w:bookmarkStart w:id="49" w:name="gpu-graph-run"/>
       <w:r>
         <w:t xml:space="preserve">GPU graph run</w:t>
       </w:r>
-      <w:bookmarkEnd w:id="48"/>
+      <w:bookmarkEnd w:id="49"/>
     </w:p>
     <w:p>
       <w:pPr>
@@ -6491,11 +7655,145 @@
       <w:pPr>
         <w:pStyle w:val="Heading2"/>
       </w:pPr>
-      <w:bookmarkStart w:id="49" w:name="exact-control"/>
+      <w:bookmarkStart w:id="50" w:name="gpu-resource-work-diagnostic"/>
+      <w:r>
+        <w:t xml:space="preserve">GPU resource-work diagnostic</w:t>
+      </w:r>
+      <w:bookmarkEnd w:id="50"/>
+    </w:p>
+    <w:p>
+      <w:pPr>
+        <w:pStyle w:val="SourceCode"/>
+      </w:pPr>
+      <w:r>
+        <w:rPr>
+          <w:rStyle w:val="BuiltInTok"/>
+        </w:rPr>
+        <w:t xml:space="preserve">export</w:t>
+      </w:r>
+      <w:r>
+        <w:rPr>
+          <w:rStyle w:val="NormalTok"/>
+        </w:rPr>
+        <w:t xml:space="preserve"> </w:t>
+      </w:r>
+      <w:r>
+        <w:rPr>
+          <w:rStyle w:val="VariableTok"/>
+        </w:rPr>
+        <w:t xml:space="preserve">RETRIEVE_DATA_ROOT=</w:t>
+      </w:r>
+      <w:r>
+        <w:rPr>
+          <w:rStyle w:val="NormalTok"/>
+        </w:rPr>
+        <w:t xml:space="preserve">/home/ubuntu/cuvs-filter/datasets</w:t>
+      </w:r>
+      <w:r>
+        <w:br/>
+      </w:r>
+      <w:r>
+        <w:rPr>
+          <w:rStyle w:val="BuiltInTok"/>
+        </w:rPr>
+        <w:t xml:space="preserve">export</w:t>
+      </w:r>
+      <w:r>
+        <w:rPr>
+          <w:rStyle w:val="NormalTok"/>
+        </w:rPr>
+        <w:t xml:space="preserve"> </w:t>
+      </w:r>
+      <w:r>
+        <w:rPr>
+          <w:rStyle w:val="VariableTok"/>
+        </w:rPr>
+        <w:t xml:space="preserve">RETRIEVE_RESOURCE_WORK_ROOT=</w:t>
+      </w:r>
+      <w:r>
+        <w:rPr>
+          <w:rStyle w:val="NormalTok"/>
+        </w:rPr>
+        <w:t xml:space="preserve">/home/ubuntu/retrieve_workshop_runs/resource_work_</w:t>
+      </w:r>
+      <w:r>
+        <w:rPr>
+          <w:rStyle w:val="OperatorTok"/>
+        </w:rPr>
+        <w:t xml:space="preserve">&lt;</w:t>
+      </w:r>
+      <w:r>
+        <w:rPr>
+          <w:rStyle w:val="ExtensionTok"/>
+        </w:rPr>
+        <w:t xml:space="preserve">UTC_TAG</w:t>
+      </w:r>
+      <w:r>
+        <w:rPr>
+          <w:rStyle w:val="OperatorTok"/>
+        </w:rPr>
+        <w:t xml:space="preserve">&gt;</w:t>
+      </w:r>
+      <w:r>
+        <w:br/>
+      </w:r>
+      <w:r>
+        <w:rPr>
+          <w:rStyle w:val="ExtensionTok"/>
+        </w:rPr>
+        <w:t xml:space="preserve">benchmarks/retrieve_workshop/resource_work/run.sh</w:t>
+      </w:r>
+      <w:r>
+        <w:rPr>
+          <w:rStyle w:val="NormalTok"/>
+        </w:rPr>
+        <w:t xml:space="preserve"> all</w:t>
+      </w:r>
+    </w:p>
+    <w:p>
+      <w:pPr>
+        <w:pStyle w:val="FirstParagraph"/>
+      </w:pPr>
+      <w:r>
+        <w:t xml:space="preserve">This run is untimed mechanism evidence. Production JIT attributes are captured separately from</w:t>
+      </w:r>
+      <w:r>
+        <w:t xml:space="preserve"> </w:t>
+      </w:r>
+      <w:r>
+        <w:t xml:space="preserve">schema-9 counters, and the analyzer fails on any dynamic-work invariant or source/input hash</w:t>
+      </w:r>
+      <w:r>
+        <w:t xml:space="preserve"> </w:t>
+      </w:r>
+      <w:r>
+        <w:t xml:space="preserve">mismatch. See</w:t>
+      </w:r>
+      <w:r>
+        <w:t xml:space="preserve"> </w:t>
+      </w:r>
+      <w:r>
+        <w:rPr>
+          <w:rStyle w:val="VerbatimChar"/>
+        </w:rPr>
+        <w:t xml:space="preserve">resource_work/README.org</w:t>
+      </w:r>
+      <w:r>
+        <w:t xml:space="preserve"> </w:t>
+      </w:r>
+      <w:r>
+        <w:t xml:space="preserve">for definitions.</w:t>
+      </w:r>
+    </w:p>
+    <w:p>
+      <w:pPr>
+        <w:pStyle w:val="Heading2"/>
+      </w:pPr>
+      <w:bookmarkStart w:id="51" w:name="exact-control"/>
       <w:r>
         <w:t xml:space="preserve">Exact control</w:t>
       </w:r>
-      <w:bookmarkEnd w:id="49"/>
+      <w:bookmarkEnd w:id="51"/>
     </w:p>
     <w:p>
       <w:pPr>
@@ -6604,11 +7902,11 @@
       <w:pPr>
         <w:pStyle w:val="Heading2"/>
       </w:pPr>
-      <w:bookmarkStart w:id="50" w:name="native-cpu-context-1"/>
+      <w:bookmarkStart w:id="52" w:name="native-cpu-context-1"/>
       <w:r>
         <w:t xml:space="preserve">Native CPU context</w:t>
       </w:r>
-      <w:bookmarkEnd w:id="50"/>
+      <w:bookmarkEnd w:id="52"/>
     </w:p>
     <w:p>
       <w:pPr>
@@ -6885,11 +8183,11 @@
       <w:pPr>
         <w:pStyle w:val="Heading2"/>
       </w:pPr>
-      <w:bookmarkStart w:id="51" w:name="paper-staging-and-build"/>
+      <w:bookmarkStart w:id="53" w:name="paper-staging-and-build"/>
       <w:r>
         <w:t xml:space="preserve">Paper staging and build</w:t>
       </w:r>
-      <w:bookmarkEnd w:id="51"/>
+      <w:bookmarkEnd w:id="53"/>
     </w:p>
     <w:p>
       <w:pPr>
@@ -7020,6 +8318,33 @@
       </w:r>
       <w:r>
         <w:rPr>
+          <w:rStyle w:val="BuiltInTok"/>
+        </w:rPr>
+        <w:t xml:space="preserve">export</w:t>
+      </w:r>
+      <w:r>
+        <w:rPr>
+          <w:rStyle w:val="NormalTok"/>
+        </w:rPr>
+        <w:t xml:space="preserve"> </w:t>
+      </w:r>
+      <w:r>
+        <w:rPr>
+          <w:rStyle w:val="VariableTok"/>
+        </w:rPr>
+        <w:t xml:space="preserve">RETRIEVE_RESOURCE_WORK_SUMMARY=</w:t>
+      </w:r>
+      <w:r>
+        <w:rPr>
+          <w:rStyle w:val="NormalTok"/>
+        </w:rPr>
+        <w:t xml:space="preserve">/home/ubuntu/retrieve_workshop_runs/gpu_resource_work_schema9_20260821T0510Z/analysis/gpu_resource_work.json</w:t>
+      </w:r>
+      <w:r>
+        <w:br/>
+      </w:r>
+      <w:r>
+        <w:rPr>
           <w:rStyle w:val="FunctionTok"/>
         </w:rPr>
         <w:t xml:space="preserve">make</w:t>
@@ -7065,11 +8390,11 @@
       <w:pPr>
         <w:pStyle w:val="Heading1"/>
       </w:pPr>
-      <w:bookmarkStart w:id="52" w:name="final-artifact-index"/>
+      <w:bookmarkStart w:id="54" w:name="final-artifact-index"/>
       <w:r>
         <w:t xml:space="preserve">Final artifact index</w:t>
       </w:r>
-      <w:bookmarkEnd w:id="52"/>
+      <w:bookmarkEnd w:id="54"/>
     </w:p>
     <w:tbl>
       <w:tblPr>
@@ -7446,6 +8771,82 @@
               <w:jc w:val="left"/>
             </w:pPr>
             <w:r>
+              <w:t xml:space="preserve">Resource-work summary</w:t>
+            </w:r>
+          </w:p>
+        </w:tc>
+        <w:tc>
+          <w:p>
+            <w:pPr>
+              <w:pStyle w:val="Compact"/>
+              <w:jc w:val="left"/>
+            </w:pPr>
+            <w:r>
+              <w:rPr>
+                <w:rStyle w:val="VerbatimChar"/>
+              </w:rPr>
+              <w:t xml:space="preserve">benchmarks/retrieve_workshop/evidence/gpu_resource_work_schema9/gpu_resource_work.json</w:t>
+            </w:r>
+          </w:p>
+        </w:tc>
+        <w:tc>
+          <w:p>
+            <w:pPr>
+              <w:pStyle w:val="Compact"/>
+              <w:jc w:val="left"/>
+            </w:pPr>
+            <w:r>
+              <w:t xml:space="preserve">PASS; 22 SHA-256-bound inputs</w:t>
+            </w:r>
+          </w:p>
+        </w:tc>
+      </w:tr>
+      <w:tr>
+        <w:tc>
+          <w:p>
+            <w:pPr>
+              <w:pStyle w:val="Compact"/>
+              <w:jc w:val="left"/>
+            </w:pPr>
+            <w:r>
+              <w:t xml:space="preserve">Resource-work guide</w:t>
+            </w:r>
+          </w:p>
+        </w:tc>
+        <w:tc>
+          <w:p>
+            <w:pPr>
+              <w:pStyle w:val="Compact"/>
+              <w:jc w:val="left"/>
+            </w:pPr>
+            <w:r>
+              <w:rPr>
+                <w:rStyle w:val="VerbatimChar"/>
+              </w:rPr>
+              <w:t xml:space="preserve">benchmarks/retrieve_workshop/resource_work/README.org</w:t>
+            </w:r>
+          </w:p>
+        </w:tc>
+        <w:tc>
+          <w:p>
+            <w:pPr>
+              <w:pStyle w:val="Compact"/>
+              <w:jc w:val="left"/>
+            </w:pPr>
+            <w:r>
+              <w:t xml:space="preserve">Current</w:t>
+            </w:r>
+          </w:p>
+        </w:tc>
+      </w:tr>
+      <w:tr>
+        <w:tc>
+          <w:p>
+            <w:pPr>
+              <w:pStyle w:val="Compact"/>
+              <w:jc w:val="left"/>
+            </w:pPr>
+            <w:r>
               <w:t xml:space="preserve">Paper source and staged data</w:t>
             </w:r>
           </w:p>
@@ -7575,11 +8976,11 @@
       <w:pPr>
         <w:pStyle w:val="Heading1"/>
       </w:pPr>
-      <w:bookmarkStart w:id="53" w:name="final-checklist"/>
+      <w:bookmarkStart w:id="55" w:name="final-checklist"/>
       <w:r>
         <w:t xml:space="preserve">Final checklist</w:t>
       </w:r>
-      <w:bookmarkEnd w:id="53"/>
+      <w:bookmarkEnd w:id="55"/>
     </w:p>
     <w:p>
       <w:pPr>
@@ -7603,6 +9004,18 @@
       </w:pPr>
       <w:r>
         <w:t xml:space="preserve">[X] All analyzer coverage, correctness, timing, and provenance gates pass.</w:t>
+      </w:r>
+    </w:p>
+    <w:p>
+      <w:pPr>
+        <w:numPr>
+          <w:ilvl w:val="0"/>
+          <w:numId w:val="1006"/>
+        </w:numPr>
+        <w:pStyle w:val="Compact"/>
+      </w:pPr>
+      <w:r>
+        <w:t xml:space="preserve">[X] Schema-9 dynamic work and production JIT resources are source/executable/GPU hash-bound.</w:t>
       </w:r>
     </w:p>
     <w:p>

</xml_diff>